<commit_message>
Improve Ghana tenancy agreement template
</commit_message>
<xml_diff>
--- a/Tenancy_Agreement_Template.docx
+++ b/Tenancy_Agreement_Template.docx
@@ -4,171 +4,103 @@
   <w:body>
     <w:p>
       <w:pPr>
-        <w:spacing w:before="0" w:after="40" w:lineRule="auto" w:line="264"/>
+        <w:spacing w:after="0"/>
         <w:jc w:val="center"/>
       </w:pPr>
       <w:r>
         <w:rPr>
-          <w:rFonts w:ascii="Calibri" w:hAnsi="Calibri"/>
+          <w:rFonts w:ascii="Aptos Display" w:hAnsi="Aptos Display"/>
           <w:b/>
-          <w:i w:val="0"/>
-          <w:color w:val="52606D"/>
-          <w:sz w:val="22"/>
-        </w:rPr>
-        <w:t>OneRoot Rentals &amp; Apartments</w:t>
-      </w:r>
-    </w:p>
-    <w:p>
-      <w:pPr>
-        <w:spacing w:before="0" w:after="80" w:lineRule="auto" w:line="264"/>
-        <w:jc w:val="center"/>
-      </w:pPr>
-      <w:r>
-        <w:rPr>
-          <w:rFonts w:ascii="Calibri" w:hAnsi="Calibri"/>
-          <w:b/>
-          <w:i w:val="0"/>
-          <w:color w:val="000000"/>
-          <w:sz w:val="44"/>
+          <w:color w:val="164334"/>
+          <w:sz w:val="40"/>
         </w:rPr>
         <w:t>TENANCY AGREEMENT</w:t>
       </w:r>
     </w:p>
     <w:p>
       <w:pPr>
-        <w:spacing w:before="0" w:after="160" w:lineRule="auto" w:line="264"/>
+        <w:spacing w:after="140"/>
         <w:jc w:val="center"/>
       </w:pPr>
       <w:r>
         <w:rPr>
-          <w:rFonts w:ascii="Calibri" w:hAnsi="Calibri"/>
-          <w:b/>
-          <w:i w:val="0"/>
-          <w:color w:val="1F4D78"/>
-          <w:sz w:val="24"/>
+          <w:rFonts w:ascii="Aptos" w:hAnsi="Aptos"/>
+          <w:i/>
+          <w:color w:val="1F5D8C"/>
+          <w:sz w:val="19"/>
         </w:rPr>
-        <w:t>[[SUITE_NAME]] | Effective Upon Payment Confirmation</w:t>
+        <w:t>Residential tenancy for [[SUITE_NAME]]</w:t>
       </w:r>
     </w:p>
     <w:p>
       <w:pPr>
-        <w:spacing w:before="0" w:after="280" w:lineRule="auto" w:line="264"/>
-        <w:jc w:val="center"/>
+        <w:spacing w:after="80"/>
+        <w:pBdr>
+          <w:bottom w:val="single" w:sz="8" w:space="1" w:color="1F5D8C"/>
+        </w:pBdr>
       </w:pPr>
-      <w:r>
-        <w:rPr>
-          <w:rFonts w:ascii="Calibri" w:hAnsi="Calibri"/>
-          <w:b w:val="0"/>
-          <w:i/>
-          <w:color w:val="52606D"/>
-          <w:sz w:val="20"/>
-        </w:rPr>
-        <w:t>Prepared from the saved apartment record for issue after the agreed advance rent has been paid.</w:t>
-      </w:r>
-    </w:p>
-    <w:p>
-      <w:pPr>
-        <w:spacing w:before="0" w:after="200" w:lineRule="auto" w:line="264"/>
-        <w:jc w:val="left"/>
-      </w:pPr>
-      <w:r>
-        <w:rPr>
-          <w:rFonts w:ascii="Calibri" w:hAnsi="Calibri"/>
-          <w:b w:val="0"/>
-          <w:i w:val="0"/>
-          <w:color w:val="000000"/>
-          <w:sz w:val="22"/>
-        </w:rPr>
-        <w:t>This Tenancy Agreement is intended for execution once the Landlord has confirmed receipt of the agreed advance rent for [[SUITE_NAME]]. The agreement should be completed by confirming the Tenant details, the commencement date, and the payment confirmation details before signing.</w:t>
-      </w:r>
-    </w:p>
-    <w:p>
-      <w:pPr>
-        <w:pStyle w:val="Heading1"/>
-      </w:pPr>
-      <w:r>
-        <w:t>Agreement Snapshot</w:t>
-      </w:r>
     </w:p>
     <w:tbl>
       <w:tblPr>
-        <w:tblStyle w:val="TableGrid"/>
-        <w:tblW w:type="dxa" w:w="9360"/>
-        <w:jc w:val="left"/>
+        <w:tblW w:type="auto" w:w="0"/>
+        <w:jc w:val="center"/>
         <w:tblLayout w:type="fixed"/>
         <w:tblLook w:firstColumn="1" w:firstRow="1" w:lastColumn="0" w:lastRow="0" w:noHBand="0" w:noVBand="1" w:val="04A0"/>
-        <w:tblInd w:type="dxa" w:w="120"/>
       </w:tblPr>
       <w:tblGrid>
-        <w:gridCol w:w="2700"/>
-        <w:gridCol w:w="6660"/>
+        <w:gridCol w:w="5285"/>
+        <w:gridCol w:w="5285"/>
       </w:tblGrid>
       <w:tr>
-        <w:trPr/>
         <w:tc>
           <w:tcPr>
-            <w:tcW w:type="dxa" w:w="2700"/>
-            <w:tcMar>
-              <w:top w:w="80" w:type="dxa"/>
-              <w:bottom w:w="80" w:type="dxa"/>
-              <w:start w:w="120" w:type="dxa"/>
-              <w:end w:w="120" w:type="dxa"/>
-            </w:tcMar>
+            <w:tcW w:type="dxa" w:w="2880"/>
+            <w:shd w:fill="EEF3EF"/>
             <w:vAlign w:val="center"/>
-            <w:shd w:fill="F2F4F7" w:val="clear" w:color="auto"/>
             <w:tcBorders>
-              <w:top w:val="single" w:sz="6" w:space="0" w:color="D6DDD5"/>
-              <w:left w:val="single" w:sz="6" w:space="0" w:color="D6DDD5"/>
-              <w:bottom w:val="single" w:sz="6" w:space="0" w:color="D6DDD5"/>
-              <w:right w:val="single" w:sz="6" w:space="0" w:color="D6DDD5"/>
+              <w:top w:val="single" w:sz="4" w:color="C9D6CC"/>
+              <w:left w:val="single" w:sz="4" w:color="C9D6CC"/>
+              <w:bottom w:val="single" w:sz="4" w:color="C9D6CC"/>
+              <w:right w:val="single" w:sz="4" w:color="C9D6CC"/>
             </w:tcBorders>
           </w:tcPr>
           <w:p>
             <w:pPr>
-              <w:spacing w:before="0" w:after="0" w:lineRule="auto" w:line="264"/>
-              <w:jc w:val="left"/>
+              <w:spacing w:after="0"/>
             </w:pPr>
+            <w:r/>
             <w:r>
               <w:rPr>
-                <w:rFonts w:ascii="Calibri" w:hAnsi="Calibri"/>
+                <w:rFonts w:ascii="Aptos" w:hAnsi="Aptos"/>
                 <w:b/>
-                <w:i w:val="0"/>
-                <w:color w:val="000000"/>
-                <w:sz w:val="22"/>
+                <w:color w:val="164334"/>
+                <w:sz w:val="17"/>
               </w:rPr>
-              <w:t>Property</w:t>
+              <w:t>Property / Suite</w:t>
             </w:r>
           </w:p>
         </w:tc>
         <w:tc>
           <w:tcPr>
-            <w:tcW w:type="dxa" w:w="6660"/>
-            <w:tcMar>
-              <w:top w:w="80" w:type="dxa"/>
-              <w:bottom w:w="80" w:type="dxa"/>
-              <w:start w:w="120" w:type="dxa"/>
-              <w:end w:w="120" w:type="dxa"/>
-            </w:tcMar>
+            <w:tcW w:type="dxa" w:w="7056"/>
             <w:vAlign w:val="center"/>
             <w:tcBorders>
-              <w:top w:val="single" w:sz="6" w:space="0" w:color="D6DDD5"/>
-              <w:left w:val="single" w:sz="6" w:space="0" w:color="D6DDD5"/>
-              <w:bottom w:val="single" w:sz="6" w:space="0" w:color="D6DDD5"/>
-              <w:right w:val="single" w:sz="6" w:space="0" w:color="D6DDD5"/>
+              <w:top w:val="single" w:sz="4" w:color="C9D6CC"/>
+              <w:left w:val="single" w:sz="4" w:color="C9D6CC"/>
+              <w:bottom w:val="single" w:sz="4" w:color="C9D6CC"/>
+              <w:right w:val="single" w:sz="4" w:color="C9D6CC"/>
             </w:tcBorders>
           </w:tcPr>
           <w:p>
             <w:pPr>
-              <w:spacing w:before="0" w:after="0" w:lineRule="auto" w:line="264"/>
-              <w:jc w:val="left"/>
+              <w:spacing w:after="0"/>
             </w:pPr>
+            <w:r/>
             <w:r>
               <w:rPr>
-                <w:rFonts w:ascii="Calibri" w:hAnsi="Calibri"/>
+                <w:rFonts w:ascii="Aptos" w:hAnsi="Aptos"/>
                 <w:b w:val="0"/>
-                <w:i w:val="0"/>
-                <w:color w:val="000000"/>
-                <w:sz w:val="22"/>
+                <w:sz w:val="17"/>
               </w:rPr>
               <w:t>[[SUITE_NAME]]</w:t>
             </w:r>
@@ -176,37 +108,29 @@
         </w:tc>
       </w:tr>
       <w:tr>
-        <w:trPr/>
         <w:tc>
           <w:tcPr>
-            <w:tcW w:type="dxa" w:w="2700"/>
-            <w:tcMar>
-              <w:top w:w="80" w:type="dxa"/>
-              <w:bottom w:w="80" w:type="dxa"/>
-              <w:start w:w="120" w:type="dxa"/>
-              <w:end w:w="120" w:type="dxa"/>
-            </w:tcMar>
+            <w:tcW w:type="dxa" w:w="2880"/>
+            <w:shd w:fill="EEF3EF"/>
             <w:vAlign w:val="center"/>
-            <w:shd w:fill="F2F4F7" w:val="clear" w:color="auto"/>
             <w:tcBorders>
-              <w:top w:val="single" w:sz="6" w:space="0" w:color="D6DDD5"/>
-              <w:left w:val="single" w:sz="6" w:space="0" w:color="D6DDD5"/>
-              <w:bottom w:val="single" w:sz="6" w:space="0" w:color="D6DDD5"/>
-              <w:right w:val="single" w:sz="6" w:space="0" w:color="D6DDD5"/>
+              <w:top w:val="single" w:sz="4" w:color="C9D6CC"/>
+              <w:left w:val="single" w:sz="4" w:color="C9D6CC"/>
+              <w:bottom w:val="single" w:sz="4" w:color="C9D6CC"/>
+              <w:right w:val="single" w:sz="4" w:color="C9D6CC"/>
             </w:tcBorders>
           </w:tcPr>
           <w:p>
             <w:pPr>
-              <w:spacing w:before="0" w:after="0" w:lineRule="auto" w:line="264"/>
-              <w:jc w:val="left"/>
+              <w:spacing w:after="0"/>
             </w:pPr>
+            <w:r/>
             <w:r>
               <w:rPr>
-                <w:rFonts w:ascii="Calibri" w:hAnsi="Calibri"/>
+                <w:rFonts w:ascii="Aptos" w:hAnsi="Aptos"/>
                 <w:b/>
-                <w:i w:val="0"/>
-                <w:color w:val="000000"/>
-                <w:sz w:val="22"/>
+                <w:color w:val="164334"/>
+                <w:sz w:val="17"/>
               </w:rPr>
               <w:t>Location</w:t>
             </w:r>
@@ -214,33 +138,25 @@
         </w:tc>
         <w:tc>
           <w:tcPr>
-            <w:tcW w:type="dxa" w:w="6660"/>
-            <w:tcMar>
-              <w:top w:w="80" w:type="dxa"/>
-              <w:bottom w:w="80" w:type="dxa"/>
-              <w:start w:w="120" w:type="dxa"/>
-              <w:end w:w="120" w:type="dxa"/>
-            </w:tcMar>
+            <w:tcW w:type="dxa" w:w="7056"/>
             <w:vAlign w:val="center"/>
             <w:tcBorders>
-              <w:top w:val="single" w:sz="6" w:space="0" w:color="D6DDD5"/>
-              <w:left w:val="single" w:sz="6" w:space="0" w:color="D6DDD5"/>
-              <w:bottom w:val="single" w:sz="6" w:space="0" w:color="D6DDD5"/>
-              <w:right w:val="single" w:sz="6" w:space="0" w:color="D6DDD5"/>
+              <w:top w:val="single" w:sz="4" w:color="C9D6CC"/>
+              <w:left w:val="single" w:sz="4" w:color="C9D6CC"/>
+              <w:bottom w:val="single" w:sz="4" w:color="C9D6CC"/>
+              <w:right w:val="single" w:sz="4" w:color="C9D6CC"/>
             </w:tcBorders>
           </w:tcPr>
           <w:p>
             <w:pPr>
-              <w:spacing w:before="0" w:after="0" w:lineRule="auto" w:line="264"/>
-              <w:jc w:val="left"/>
+              <w:spacing w:after="0"/>
             </w:pPr>
+            <w:r/>
             <w:r>
               <w:rPr>
-                <w:rFonts w:ascii="Calibri" w:hAnsi="Calibri"/>
+                <w:rFonts w:ascii="Aptos" w:hAnsi="Aptos"/>
                 <w:b w:val="0"/>
-                <w:i w:val="0"/>
-                <w:color w:val="000000"/>
-                <w:sz w:val="22"/>
+                <w:sz w:val="17"/>
               </w:rPr>
               <w:t>[[PROPERTY_LOCATION]]</w:t>
             </w:r>
@@ -248,71 +164,55 @@
         </w:tc>
       </w:tr>
       <w:tr>
-        <w:trPr/>
         <w:tc>
           <w:tcPr>
-            <w:tcW w:type="dxa" w:w="2700"/>
-            <w:tcMar>
-              <w:top w:w="80" w:type="dxa"/>
-              <w:bottom w:w="80" w:type="dxa"/>
-              <w:start w:w="120" w:type="dxa"/>
-              <w:end w:w="120" w:type="dxa"/>
-            </w:tcMar>
+            <w:tcW w:type="dxa" w:w="2880"/>
+            <w:shd w:fill="EEF3EF"/>
             <w:vAlign w:val="center"/>
-            <w:shd w:fill="F2F4F7" w:val="clear" w:color="auto"/>
             <w:tcBorders>
-              <w:top w:val="single" w:sz="6" w:space="0" w:color="D6DDD5"/>
-              <w:left w:val="single" w:sz="6" w:space="0" w:color="D6DDD5"/>
-              <w:bottom w:val="single" w:sz="6" w:space="0" w:color="D6DDD5"/>
-              <w:right w:val="single" w:sz="6" w:space="0" w:color="D6DDD5"/>
+              <w:top w:val="single" w:sz="4" w:color="C9D6CC"/>
+              <w:left w:val="single" w:sz="4" w:color="C9D6CC"/>
+              <w:bottom w:val="single" w:sz="4" w:color="C9D6CC"/>
+              <w:right w:val="single" w:sz="4" w:color="C9D6CC"/>
             </w:tcBorders>
           </w:tcPr>
           <w:p>
             <w:pPr>
-              <w:spacing w:before="0" w:after="0" w:lineRule="auto" w:line="264"/>
-              <w:jc w:val="left"/>
+              <w:spacing w:after="0"/>
             </w:pPr>
+            <w:r/>
             <w:r>
               <w:rPr>
-                <w:rFonts w:ascii="Calibri" w:hAnsi="Calibri"/>
+                <w:rFonts w:ascii="Aptos" w:hAnsi="Aptos"/>
                 <w:b/>
-                <w:i w:val="0"/>
-                <w:color w:val="000000"/>
-                <w:sz w:val="22"/>
+                <w:color w:val="164334"/>
+                <w:sz w:val="17"/>
               </w:rPr>
-              <w:t>Lease Term</w:t>
+              <w:t>Lease term</w:t>
             </w:r>
           </w:p>
         </w:tc>
         <w:tc>
           <w:tcPr>
-            <w:tcW w:type="dxa" w:w="6660"/>
-            <w:tcMar>
-              <w:top w:w="80" w:type="dxa"/>
-              <w:bottom w:w="80" w:type="dxa"/>
-              <w:start w:w="120" w:type="dxa"/>
-              <w:end w:w="120" w:type="dxa"/>
-            </w:tcMar>
+            <w:tcW w:type="dxa" w:w="7056"/>
             <w:vAlign w:val="center"/>
             <w:tcBorders>
-              <w:top w:val="single" w:sz="6" w:space="0" w:color="D6DDD5"/>
-              <w:left w:val="single" w:sz="6" w:space="0" w:color="D6DDD5"/>
-              <w:bottom w:val="single" w:sz="6" w:space="0" w:color="D6DDD5"/>
-              <w:right w:val="single" w:sz="6" w:space="0" w:color="D6DDD5"/>
+              <w:top w:val="single" w:sz="4" w:color="C9D6CC"/>
+              <w:left w:val="single" w:sz="4" w:color="C9D6CC"/>
+              <w:bottom w:val="single" w:sz="4" w:color="C9D6CC"/>
+              <w:right w:val="single" w:sz="4" w:color="C9D6CC"/>
             </w:tcBorders>
           </w:tcPr>
           <w:p>
             <w:pPr>
-              <w:spacing w:before="0" w:after="0" w:lineRule="auto" w:line="264"/>
-              <w:jc w:val="left"/>
+              <w:spacing w:after="0"/>
             </w:pPr>
+            <w:r/>
             <w:r>
               <w:rPr>
-                <w:rFonts w:ascii="Calibri" w:hAnsi="Calibri"/>
+                <w:rFonts w:ascii="Aptos" w:hAnsi="Aptos"/>
                 <w:b w:val="0"/>
-                <w:i w:val="0"/>
-                <w:color w:val="000000"/>
-                <w:sz w:val="22"/>
+                <w:sz w:val="17"/>
               </w:rPr>
               <w:t>[[LEASE_TERM_LABEL]]</w:t>
             </w:r>
@@ -320,359 +220,55 @@
         </w:tc>
       </w:tr>
       <w:tr>
-        <w:trPr/>
         <w:tc>
           <w:tcPr>
-            <w:tcW w:type="dxa" w:w="2700"/>
-            <w:tcMar>
-              <w:top w:w="80" w:type="dxa"/>
-              <w:bottom w:w="80" w:type="dxa"/>
-              <w:start w:w="120" w:type="dxa"/>
-              <w:end w:w="120" w:type="dxa"/>
-            </w:tcMar>
+            <w:tcW w:type="dxa" w:w="2880"/>
+            <w:shd w:fill="EEF3EF"/>
             <w:vAlign w:val="center"/>
-            <w:shd w:fill="F2F4F7" w:val="clear" w:color="auto"/>
             <w:tcBorders>
-              <w:top w:val="single" w:sz="6" w:space="0" w:color="D6DDD5"/>
-              <w:left w:val="single" w:sz="6" w:space="0" w:color="D6DDD5"/>
-              <w:bottom w:val="single" w:sz="6" w:space="0" w:color="D6DDD5"/>
-              <w:right w:val="single" w:sz="6" w:space="0" w:color="D6DDD5"/>
+              <w:top w:val="single" w:sz="4" w:color="C9D6CC"/>
+              <w:left w:val="single" w:sz="4" w:color="C9D6CC"/>
+              <w:bottom w:val="single" w:sz="4" w:color="C9D6CC"/>
+              <w:right w:val="single" w:sz="4" w:color="C9D6CC"/>
             </w:tcBorders>
           </w:tcPr>
           <w:p>
             <w:pPr>
-              <w:spacing w:before="0" w:after="0" w:lineRule="auto" w:line="264"/>
-              <w:jc w:val="left"/>
+              <w:spacing w:after="0"/>
             </w:pPr>
+            <w:r/>
             <w:r>
               <w:rPr>
-                <w:rFonts w:ascii="Calibri" w:hAnsi="Calibri"/>
+                <w:rFonts w:ascii="Aptos" w:hAnsi="Aptos"/>
                 <w:b/>
-                <w:i w:val="0"/>
-                <w:color w:val="000000"/>
-                <w:sz w:val="22"/>
+                <w:color w:val="164334"/>
+                <w:sz w:val="17"/>
               </w:rPr>
-              <w:t>Rent</w:t>
+              <w:t>Agreement status</w:t>
             </w:r>
           </w:p>
         </w:tc>
         <w:tc>
           <w:tcPr>
-            <w:tcW w:type="dxa" w:w="6660"/>
-            <w:tcMar>
-              <w:top w:w="80" w:type="dxa"/>
-              <w:bottom w:w="80" w:type="dxa"/>
-              <w:start w:w="120" w:type="dxa"/>
-              <w:end w:w="120" w:type="dxa"/>
-            </w:tcMar>
+            <w:tcW w:type="dxa" w:w="7056"/>
             <w:vAlign w:val="center"/>
             <w:tcBorders>
-              <w:top w:val="single" w:sz="6" w:space="0" w:color="D6DDD5"/>
-              <w:left w:val="single" w:sz="6" w:space="0" w:color="D6DDD5"/>
-              <w:bottom w:val="single" w:sz="6" w:space="0" w:color="D6DDD5"/>
-              <w:right w:val="single" w:sz="6" w:space="0" w:color="D6DDD5"/>
+              <w:top w:val="single" w:sz="4" w:color="C9D6CC"/>
+              <w:left w:val="single" w:sz="4" w:color="C9D6CC"/>
+              <w:bottom w:val="single" w:sz="4" w:color="C9D6CC"/>
+              <w:right w:val="single" w:sz="4" w:color="C9D6CC"/>
             </w:tcBorders>
           </w:tcPr>
           <w:p>
             <w:pPr>
-              <w:spacing w:before="0" w:after="0" w:lineRule="auto" w:line="264"/>
-              <w:jc w:val="left"/>
+              <w:spacing w:after="0"/>
             </w:pPr>
+            <w:r/>
             <w:r>
               <w:rPr>
-                <w:rFonts w:ascii="Calibri" w:hAnsi="Calibri"/>
+                <w:rFonts w:ascii="Aptos" w:hAnsi="Aptos"/>
                 <w:b w:val="0"/>
-                <w:i w:val="0"/>
-                <w:color w:val="000000"/>
-                <w:sz w:val="22"/>
-              </w:rPr>
-              <w:t>[[RENT_PLAN_SUMMARY]]</w:t>
-            </w:r>
-          </w:p>
-        </w:tc>
-      </w:tr>
-      <w:tr>
-        <w:trPr/>
-        <w:tc>
-          <w:tcPr>
-            <w:tcW w:type="dxa" w:w="2700"/>
-            <w:tcMar>
-              <w:top w:w="80" w:type="dxa"/>
-              <w:bottom w:w="80" w:type="dxa"/>
-              <w:start w:w="120" w:type="dxa"/>
-              <w:end w:w="120" w:type="dxa"/>
-            </w:tcMar>
-            <w:vAlign w:val="center"/>
-            <w:shd w:fill="F2F4F7" w:val="clear" w:color="auto"/>
-            <w:tcBorders>
-              <w:top w:val="single" w:sz="6" w:space="0" w:color="D6DDD5"/>
-              <w:left w:val="single" w:sz="6" w:space="0" w:color="D6DDD5"/>
-              <w:bottom w:val="single" w:sz="6" w:space="0" w:color="D6DDD5"/>
-              <w:right w:val="single" w:sz="6" w:space="0" w:color="D6DDD5"/>
-            </w:tcBorders>
-          </w:tcPr>
-          <w:p>
-            <w:pPr>
-              <w:spacing w:before="0" w:after="0" w:lineRule="auto" w:line="264"/>
-              <w:jc w:val="left"/>
-            </w:pPr>
-            <w:r>
-              <w:rPr>
-                <w:rFonts w:ascii="Calibri" w:hAnsi="Calibri"/>
-                <w:b/>
-                <w:i w:val="0"/>
-                <w:color w:val="000000"/>
-                <w:sz w:val="22"/>
-              </w:rPr>
-              <w:t>Advance Rent Due Before Activation</w:t>
-            </w:r>
-          </w:p>
-        </w:tc>
-        <w:tc>
-          <w:tcPr>
-            <w:tcW w:type="dxa" w:w="6660"/>
-            <w:tcMar>
-              <w:top w:w="80" w:type="dxa"/>
-              <w:bottom w:w="80" w:type="dxa"/>
-              <w:start w:w="120" w:type="dxa"/>
-              <w:end w:w="120" w:type="dxa"/>
-            </w:tcMar>
-            <w:vAlign w:val="center"/>
-            <w:tcBorders>
-              <w:top w:val="single" w:sz="6" w:space="0" w:color="D6DDD5"/>
-              <w:left w:val="single" w:sz="6" w:space="0" w:color="D6DDD5"/>
-              <w:bottom w:val="single" w:sz="6" w:space="0" w:color="D6DDD5"/>
-              <w:right w:val="single" w:sz="6" w:space="0" w:color="D6DDD5"/>
-            </w:tcBorders>
-          </w:tcPr>
-          <w:p>
-            <w:pPr>
-              <w:spacing w:before="0" w:after="0" w:lineRule="auto" w:line="264"/>
-              <w:jc w:val="left"/>
-            </w:pPr>
-            <w:r>
-              <w:rPr>
-                <w:rFonts w:ascii="Calibri" w:hAnsi="Calibri"/>
-                <w:b w:val="0"/>
-                <w:i w:val="0"/>
-                <w:color w:val="000000"/>
-                <w:sz w:val="22"/>
-              </w:rPr>
-              <w:t>[[ADVANCE_RENT_DUE]]</w:t>
-            </w:r>
-          </w:p>
-        </w:tc>
-      </w:tr>
-      <w:tr>
-        <w:trPr/>
-        <w:tc>
-          <w:tcPr>
-            <w:tcW w:type="dxa" w:w="2700"/>
-            <w:tcMar>
-              <w:top w:w="80" w:type="dxa"/>
-              <w:bottom w:w="80" w:type="dxa"/>
-              <w:start w:w="120" w:type="dxa"/>
-              <w:end w:w="120" w:type="dxa"/>
-            </w:tcMar>
-            <w:vAlign w:val="center"/>
-            <w:shd w:fill="F2F4F7" w:val="clear" w:color="auto"/>
-            <w:tcBorders>
-              <w:top w:val="single" w:sz="6" w:space="0" w:color="D6DDD5"/>
-              <w:left w:val="single" w:sz="6" w:space="0" w:color="D6DDD5"/>
-              <w:bottom w:val="single" w:sz="6" w:space="0" w:color="D6DDD5"/>
-              <w:right w:val="single" w:sz="6" w:space="0" w:color="D6DDD5"/>
-            </w:tcBorders>
-          </w:tcPr>
-          <w:p>
-            <w:pPr>
-              <w:spacing w:before="0" w:after="0" w:lineRule="auto" w:line="264"/>
-              <w:jc w:val="left"/>
-            </w:pPr>
-            <w:r>
-              <w:rPr>
-                <w:rFonts w:ascii="Calibri" w:hAnsi="Calibri"/>
-                <w:b/>
-                <w:i w:val="0"/>
-                <w:color w:val="000000"/>
-                <w:sz w:val="22"/>
-              </w:rPr>
-              <w:t>Monthly Service Charges</w:t>
-            </w:r>
-          </w:p>
-        </w:tc>
-        <w:tc>
-          <w:tcPr>
-            <w:tcW w:type="dxa" w:w="6660"/>
-            <w:tcMar>
-              <w:top w:w="80" w:type="dxa"/>
-              <w:bottom w:w="80" w:type="dxa"/>
-              <w:start w:w="120" w:type="dxa"/>
-              <w:end w:w="120" w:type="dxa"/>
-            </w:tcMar>
-            <w:vAlign w:val="center"/>
-            <w:tcBorders>
-              <w:top w:val="single" w:sz="6" w:space="0" w:color="D6DDD5"/>
-              <w:left w:val="single" w:sz="6" w:space="0" w:color="D6DDD5"/>
-              <w:bottom w:val="single" w:sz="6" w:space="0" w:color="D6DDD5"/>
-              <w:right w:val="single" w:sz="6" w:space="0" w:color="D6DDD5"/>
-            </w:tcBorders>
-          </w:tcPr>
-          <w:p>
-            <w:pPr>
-              <w:spacing w:before="0" w:after="0" w:lineRule="auto" w:line="264"/>
-              <w:jc w:val="left"/>
-            </w:pPr>
-            <w:r>
-              <w:rPr>
-                <w:rFonts w:ascii="Calibri" w:hAnsi="Calibri"/>
-                <w:b w:val="0"/>
-                <w:i w:val="0"/>
-                <w:color w:val="000000"/>
-                <w:sz w:val="22"/>
-              </w:rPr>
-              <w:t>[[MONTHLY_SERVICE_TOTAL]]</w:t>
-            </w:r>
-          </w:p>
-        </w:tc>
-      </w:tr>
-      <w:tr>
-        <w:trPr/>
-        <w:tc>
-          <w:tcPr>
-            <w:tcW w:type="dxa" w:w="2700"/>
-            <w:tcMar>
-              <w:top w:w="80" w:type="dxa"/>
-              <w:bottom w:w="80" w:type="dxa"/>
-              <w:start w:w="120" w:type="dxa"/>
-              <w:end w:w="120" w:type="dxa"/>
-            </w:tcMar>
-            <w:vAlign w:val="center"/>
-            <w:shd w:fill="F2F4F7" w:val="clear" w:color="auto"/>
-            <w:tcBorders>
-              <w:top w:val="single" w:sz="6" w:space="0" w:color="D6DDD5"/>
-              <w:left w:val="single" w:sz="6" w:space="0" w:color="D6DDD5"/>
-              <w:bottom w:val="single" w:sz="6" w:space="0" w:color="D6DDD5"/>
-              <w:right w:val="single" w:sz="6" w:space="0" w:color="D6DDD5"/>
-            </w:tcBorders>
-          </w:tcPr>
-          <w:p>
-            <w:pPr>
-              <w:spacing w:before="0" w:after="0" w:lineRule="auto" w:line="264"/>
-              <w:jc w:val="left"/>
-            </w:pPr>
-            <w:r>
-              <w:rPr>
-                <w:rFonts w:ascii="Calibri" w:hAnsi="Calibri"/>
-                <w:b/>
-                <w:i w:val="0"/>
-                <w:color w:val="000000"/>
-                <w:sz w:val="22"/>
-              </w:rPr>
-              <w:t>Monthly Charges Payment Channel</w:t>
-            </w:r>
-          </w:p>
-        </w:tc>
-        <w:tc>
-          <w:tcPr>
-            <w:tcW w:type="dxa" w:w="6660"/>
-            <w:tcMar>
-              <w:top w:w="80" w:type="dxa"/>
-              <w:bottom w:w="80" w:type="dxa"/>
-              <w:start w:w="120" w:type="dxa"/>
-              <w:end w:w="120" w:type="dxa"/>
-            </w:tcMar>
-            <w:vAlign w:val="center"/>
-            <w:tcBorders>
-              <w:top w:val="single" w:sz="6" w:space="0" w:color="D6DDD5"/>
-              <w:left w:val="single" w:sz="6" w:space="0" w:color="D6DDD5"/>
-              <w:bottom w:val="single" w:sz="6" w:space="0" w:color="D6DDD5"/>
-              <w:right w:val="single" w:sz="6" w:space="0" w:color="D6DDD5"/>
-            </w:tcBorders>
-          </w:tcPr>
-          <w:p>
-            <w:pPr>
-              <w:spacing w:before="0" w:after="0" w:lineRule="auto" w:line="264"/>
-              <w:jc w:val="left"/>
-            </w:pPr>
-            <w:r>
-              <w:rPr>
-                <w:rFonts w:ascii="Calibri" w:hAnsi="Calibri"/>
-                <w:b w:val="0"/>
-                <w:i w:val="0"/>
-                <w:color w:val="000000"/>
-                <w:sz w:val="22"/>
-              </w:rPr>
-              <w:t>[[PAYMENT_CHANNEL]]</w:t>
-            </w:r>
-          </w:p>
-        </w:tc>
-      </w:tr>
-      <w:tr>
-        <w:trPr/>
-        <w:tc>
-          <w:tcPr>
-            <w:tcW w:type="dxa" w:w="2700"/>
-            <w:tcMar>
-              <w:top w:w="80" w:type="dxa"/>
-              <w:bottom w:w="80" w:type="dxa"/>
-              <w:start w:w="120" w:type="dxa"/>
-              <w:end w:w="120" w:type="dxa"/>
-            </w:tcMar>
-            <w:vAlign w:val="center"/>
-            <w:shd w:fill="F2F4F7" w:val="clear" w:color="auto"/>
-            <w:tcBorders>
-              <w:top w:val="single" w:sz="6" w:space="0" w:color="D6DDD5"/>
-              <w:left w:val="single" w:sz="6" w:space="0" w:color="D6DDD5"/>
-              <w:bottom w:val="single" w:sz="6" w:space="0" w:color="D6DDD5"/>
-              <w:right w:val="single" w:sz="6" w:space="0" w:color="D6DDD5"/>
-            </w:tcBorders>
-          </w:tcPr>
-          <w:p>
-            <w:pPr>
-              <w:spacing w:before="0" w:after="0" w:lineRule="auto" w:line="264"/>
-              <w:jc w:val="left"/>
-            </w:pPr>
-            <w:r>
-              <w:rPr>
-                <w:rFonts w:ascii="Calibri" w:hAnsi="Calibri"/>
-                <w:b/>
-                <w:i w:val="0"/>
-                <w:color w:val="000000"/>
-                <w:sz w:val="22"/>
-              </w:rPr>
-              <w:t>Agreement Status</w:t>
-            </w:r>
-          </w:p>
-        </w:tc>
-        <w:tc>
-          <w:tcPr>
-            <w:tcW w:type="dxa" w:w="6660"/>
-            <w:tcMar>
-              <w:top w:w="80" w:type="dxa"/>
-              <w:bottom w:w="80" w:type="dxa"/>
-              <w:start w:w="120" w:type="dxa"/>
-              <w:end w:w="120" w:type="dxa"/>
-            </w:tcMar>
-            <w:vAlign w:val="center"/>
-            <w:tcBorders>
-              <w:top w:val="single" w:sz="6" w:space="0" w:color="D6DDD5"/>
-              <w:left w:val="single" w:sz="6" w:space="0" w:color="D6DDD5"/>
-              <w:bottom w:val="single" w:sz="6" w:space="0" w:color="D6DDD5"/>
-              <w:right w:val="single" w:sz="6" w:space="0" w:color="D6DDD5"/>
-            </w:tcBorders>
-          </w:tcPr>
-          <w:p>
-            <w:pPr>
-              <w:spacing w:before="0" w:after="0" w:lineRule="auto" w:line="264"/>
-              <w:jc w:val="left"/>
-            </w:pPr>
-            <w:r>
-              <w:rPr>
-                <w:rFonts w:ascii="Calibri" w:hAnsi="Calibri"/>
-                <w:b w:val="0"/>
-                <w:i w:val="0"/>
-                <w:color w:val="000000"/>
-                <w:sz w:val="22"/>
+                <w:sz w:val="17"/>
               </w:rPr>
               <w:t>[[AGREEMENT_STATUS]]</w:t>
             </w:r>
@@ -682,459 +278,402 @@
     </w:tbl>
     <w:p>
       <w:pPr>
-        <w:pStyle w:val="Heading1"/>
+        <w:keepNext/>
+        <w:keepLines/>
+        <w:spacing w:before="160" w:after="60"/>
       </w:pPr>
       <w:r>
+        <w:rPr>
+          <w:rFonts w:ascii="Aptos Display" w:hAnsi="Aptos Display"/>
+          <w:b/>
+          <w:color w:val="164334"/>
+          <w:sz w:val="22"/>
+        </w:rPr>
         <w:t>1. Parties</w:t>
       </w:r>
     </w:p>
     <w:p>
       <w:pPr>
-        <w:spacing w:before="0" w:after="80" w:lineRule="auto" w:line="264"/>
-        <w:jc w:val="left"/>
+        <w:spacing w:after="80" w:line="254" w:lineRule="auto"/>
       </w:pPr>
       <w:r>
         <w:rPr>
-          <w:rFonts w:ascii="Calibri" w:hAnsi="Calibri"/>
+          <w:rFonts w:ascii="Aptos" w:hAnsi="Aptos"/>
+          <w:color w:val="1C2722"/>
+          <w:sz w:val="17"/>
+        </w:rPr>
+        <w:t>This Tenancy Agreement is made between Philip Boakye of P.O. Box CT 10792, Cantonments, Accra, Digital Address GW-0332-7210, Mobile 0244620860, operating under OneRoot Essentials (the “Landlord / Manager”), and the person identified below (the “Tenant”).</w:t>
+      </w:r>
+    </w:p>
+    <w:tbl>
+      <w:tblPr>
+        <w:tblW w:type="auto" w:w="0"/>
+        <w:jc w:val="center"/>
+        <w:tblLook w:firstColumn="1" w:firstRow="1" w:lastColumn="0" w:lastRow="0" w:noHBand="0" w:noVBand="1" w:val="04A0"/>
+      </w:tblPr>
+      <w:tblGrid>
+        <w:gridCol w:w="5285"/>
+        <w:gridCol w:w="5285"/>
+      </w:tblGrid>
+      <w:tr>
+        <w:tc>
+          <w:tcPr>
+            <w:tcW w:type="dxa" w:w="5285"/>
+            <w:shd w:fill="EEF3EF"/>
+            <w:vAlign w:val="center"/>
+            <w:tcBorders>
+              <w:top w:val="single" w:sz="4" w:color="C9D6CC"/>
+              <w:left w:val="single" w:sz="4" w:color="C9D6CC"/>
+              <w:bottom w:val="single" w:sz="4" w:color="C9D6CC"/>
+              <w:right w:val="single" w:sz="4" w:color="C9D6CC"/>
+            </w:tcBorders>
+          </w:tcPr>
+          <w:p>
+            <w:pPr>
+              <w:spacing w:after="0"/>
+            </w:pPr>
+            <w:r/>
+            <w:r>
+              <w:rPr>
+                <w:rFonts w:ascii="Aptos" w:hAnsi="Aptos"/>
+                <w:b/>
+                <w:color w:val="164334"/>
+                <w:sz w:val="17"/>
+              </w:rPr>
+              <w:t>Tenant full legal name</w:t>
+            </w:r>
+          </w:p>
+        </w:tc>
+        <w:tc>
+          <w:tcPr>
+            <w:tcW w:type="dxa" w:w="5285"/>
+            <w:vAlign w:val="center"/>
+            <w:tcBorders>
+              <w:top w:val="single" w:sz="4" w:color="C9D6CC"/>
+              <w:left w:val="single" w:sz="4" w:color="C9D6CC"/>
+              <w:bottom w:val="single" w:sz="4" w:color="C9D6CC"/>
+              <w:right w:val="single" w:sz="4" w:color="C9D6CC"/>
+            </w:tcBorders>
+          </w:tcPr>
+          <w:p>
+            <w:pPr>
+              <w:spacing w:after="0"/>
+            </w:pPr>
+            <w:r/>
+            <w:r>
+              <w:rPr>
+                <w:rFonts w:ascii="Aptos" w:hAnsi="Aptos"/>
+                <w:b w:val="0"/>
+                <w:sz w:val="17"/>
+              </w:rPr>
+              <w:t>[[TENANT_NAME]]</w:t>
+            </w:r>
+          </w:p>
+        </w:tc>
+      </w:tr>
+      <w:tr>
+        <w:tc>
+          <w:tcPr>
+            <w:tcW w:type="dxa" w:w="5285"/>
+            <w:shd w:fill="EEF3EF"/>
+            <w:vAlign w:val="center"/>
+            <w:tcBorders>
+              <w:top w:val="single" w:sz="4" w:color="C9D6CC"/>
+              <w:left w:val="single" w:sz="4" w:color="C9D6CC"/>
+              <w:bottom w:val="single" w:sz="4" w:color="C9D6CC"/>
+              <w:right w:val="single" w:sz="4" w:color="C9D6CC"/>
+            </w:tcBorders>
+          </w:tcPr>
+          <w:p>
+            <w:pPr>
+              <w:spacing w:after="0"/>
+            </w:pPr>
+            <w:r/>
+            <w:r>
+              <w:rPr>
+                <w:rFonts w:ascii="Aptos" w:hAnsi="Aptos"/>
+                <w:b/>
+                <w:color w:val="164334"/>
+                <w:sz w:val="17"/>
+              </w:rPr>
+              <w:t>Tenant address</w:t>
+            </w:r>
+          </w:p>
+        </w:tc>
+        <w:tc>
+          <w:tcPr>
+            <w:tcW w:type="dxa" w:w="5285"/>
+            <w:vAlign w:val="center"/>
+            <w:tcBorders>
+              <w:top w:val="single" w:sz="4" w:color="C9D6CC"/>
+              <w:left w:val="single" w:sz="4" w:color="C9D6CC"/>
+              <w:bottom w:val="single" w:sz="4" w:color="C9D6CC"/>
+              <w:right w:val="single" w:sz="4" w:color="C9D6CC"/>
+            </w:tcBorders>
+          </w:tcPr>
+          <w:p>
+            <w:pPr>
+              <w:spacing w:after="0"/>
+            </w:pPr>
+            <w:r/>
+            <w:r>
+              <w:rPr>
+                <w:rFonts w:ascii="Aptos" w:hAnsi="Aptos"/>
+                <w:b w:val="0"/>
+                <w:sz w:val="17"/>
+              </w:rPr>
+              <w:t>[[TENANT_ADDRESS]]</w:t>
+            </w:r>
+          </w:p>
+        </w:tc>
+      </w:tr>
+      <w:tr>
+        <w:tc>
+          <w:tcPr>
+            <w:tcW w:type="dxa" w:w="5285"/>
+            <w:shd w:fill="EEF3EF"/>
+            <w:vAlign w:val="center"/>
+            <w:tcBorders>
+              <w:top w:val="single" w:sz="4" w:color="C9D6CC"/>
+              <w:left w:val="single" w:sz="4" w:color="C9D6CC"/>
+              <w:bottom w:val="single" w:sz="4" w:color="C9D6CC"/>
+              <w:right w:val="single" w:sz="4" w:color="C9D6CC"/>
+            </w:tcBorders>
+          </w:tcPr>
+          <w:p>
+            <w:pPr>
+              <w:spacing w:after="0"/>
+            </w:pPr>
+            <w:r/>
+            <w:r>
+              <w:rPr>
+                <w:rFonts w:ascii="Aptos" w:hAnsi="Aptos"/>
+                <w:b/>
+                <w:color w:val="164334"/>
+                <w:sz w:val="17"/>
+              </w:rPr>
+              <w:t>Tenant mobile</w:t>
+            </w:r>
+          </w:p>
+        </w:tc>
+        <w:tc>
+          <w:tcPr>
+            <w:tcW w:type="dxa" w:w="5285"/>
+            <w:vAlign w:val="center"/>
+            <w:tcBorders>
+              <w:top w:val="single" w:sz="4" w:color="C9D6CC"/>
+              <w:left w:val="single" w:sz="4" w:color="C9D6CC"/>
+              <w:bottom w:val="single" w:sz="4" w:color="C9D6CC"/>
+              <w:right w:val="single" w:sz="4" w:color="C9D6CC"/>
+            </w:tcBorders>
+          </w:tcPr>
+          <w:p>
+            <w:pPr>
+              <w:spacing w:after="0"/>
+            </w:pPr>
+            <w:r/>
+            <w:r>
+              <w:rPr>
+                <w:rFonts w:ascii="Aptos" w:hAnsi="Aptos"/>
+                <w:b w:val="0"/>
+                <w:sz w:val="17"/>
+              </w:rPr>
+              <w:t>[[TENANT_PHONE]]</w:t>
+            </w:r>
+          </w:p>
+        </w:tc>
+      </w:tr>
+      <w:tr>
+        <w:tc>
+          <w:tcPr>
+            <w:tcW w:type="dxa" w:w="5285"/>
+            <w:shd w:fill="EEF3EF"/>
+            <w:vAlign w:val="center"/>
+            <w:tcBorders>
+              <w:top w:val="single" w:sz="4" w:color="C9D6CC"/>
+              <w:left w:val="single" w:sz="4" w:color="C9D6CC"/>
+              <w:bottom w:val="single" w:sz="4" w:color="C9D6CC"/>
+              <w:right w:val="single" w:sz="4" w:color="C9D6CC"/>
+            </w:tcBorders>
+          </w:tcPr>
+          <w:p>
+            <w:pPr>
+              <w:spacing w:after="0"/>
+            </w:pPr>
+            <w:r/>
+            <w:r>
+              <w:rPr>
+                <w:rFonts w:ascii="Aptos" w:hAnsi="Aptos"/>
+                <w:b/>
+                <w:color w:val="164334"/>
+                <w:sz w:val="17"/>
+              </w:rPr>
+              <w:t>Ghana Card / ID / Passport</w:t>
+            </w:r>
+          </w:p>
+        </w:tc>
+        <w:tc>
+          <w:tcPr>
+            <w:tcW w:type="dxa" w:w="5285"/>
+            <w:vAlign w:val="center"/>
+            <w:tcBorders>
+              <w:top w:val="single" w:sz="4" w:color="C9D6CC"/>
+              <w:left w:val="single" w:sz="4" w:color="C9D6CC"/>
+              <w:bottom w:val="single" w:sz="4" w:color="C9D6CC"/>
+              <w:right w:val="single" w:sz="4" w:color="C9D6CC"/>
+            </w:tcBorders>
+          </w:tcPr>
+          <w:p>
+            <w:pPr>
+              <w:spacing w:after="0"/>
+            </w:pPr>
+            <w:r/>
+            <w:r>
+              <w:rPr>
+                <w:rFonts w:ascii="Aptos" w:hAnsi="Aptos"/>
+                <w:b w:val="0"/>
+                <w:sz w:val="17"/>
+              </w:rPr>
+              <w:t>[[TENANT_ID_REF]]</w:t>
+            </w:r>
+          </w:p>
+        </w:tc>
+      </w:tr>
+    </w:tbl>
+    <w:p>
+      <w:pPr>
+        <w:keepNext/>
+        <w:keepLines/>
+        <w:spacing w:before="160" w:after="60"/>
+      </w:pPr>
+      <w:r>
+        <w:rPr>
+          <w:rFonts w:ascii="Aptos Display" w:hAnsi="Aptos Display"/>
           <w:b/>
-          <w:i w:val="0"/>
-          <w:color w:val="000000"/>
+          <w:color w:val="164334"/>
           <w:sz w:val="22"/>
         </w:rPr>
-        <w:t xml:space="preserve">Landlord: </w:t>
-      </w:r>
-      <w:r>
-        <w:rPr>
-          <w:rFonts w:ascii="Calibri" w:hAnsi="Calibri"/>
-          <w:b w:val="0"/>
-          <w:i w:val="0"/>
-          <w:color w:val="000000"/>
-          <w:sz w:val="22"/>
-        </w:rPr>
-        <w:t>Philip Boakye</w:t>
+        <w:t>2. Premises, Term, And Permitted Use</w:t>
       </w:r>
     </w:p>
     <w:p>
       <w:pPr>
-        <w:spacing w:before="0" w:after="60" w:lineRule="auto" w:line="264"/>
-        <w:jc w:val="left"/>
+        <w:spacing w:after="80" w:line="254" w:lineRule="auto"/>
       </w:pPr>
       <w:r>
         <w:rPr>
-          <w:rFonts w:ascii="Calibri" w:hAnsi="Calibri"/>
-          <w:b w:val="0"/>
-          <w:i w:val="0"/>
-          <w:color w:val="000000"/>
-          <w:sz w:val="22"/>
+          <w:rFonts w:ascii="Aptos" w:hAnsi="Aptos"/>
+          <w:color w:val="1C2722"/>
+          <w:sz w:val="17"/>
         </w:rPr>
-        <w:t>P.O. Box CT 10792, Cantonments, Accra</w:t>
+        <w:t>The Landlord lets to the Tenant the residential apartment known as [[SUITE_NAME]] at [[PROPERTY_LOCATION]] (the “Premises”). The tenancy starts on [[COMMENCEMENT_DATE]] and ends on [[EXPIRY_DATE]], being [[LEASE_TERM_TEXT]], unless lawfully ended earlier. The Premises may be used only as a private residence. The Tenant may not sublet, assign, operate a business from, or materially alter the Premises without prior written consent.</w:t>
       </w:r>
     </w:p>
     <w:p>
       <w:pPr>
-        <w:spacing w:before="0" w:after="60" w:lineRule="auto" w:line="264"/>
-        <w:jc w:val="left"/>
+        <w:keepNext/>
+        <w:keepLines/>
+        <w:spacing w:before="160" w:after="60"/>
       </w:pPr>
       <w:r>
         <w:rPr>
-          <w:rFonts w:ascii="Calibri" w:hAnsi="Calibri"/>
-          <w:b w:val="0"/>
-          <w:i w:val="0"/>
-          <w:color w:val="000000"/>
+          <w:rFonts w:ascii="Aptos Display" w:hAnsi="Aptos Display"/>
+          <w:b/>
+          <w:color w:val="164334"/>
           <w:sz w:val="22"/>
         </w:rPr>
-        <w:t>Medie New City</w:t>
+        <w:t>3. Rent, Lawful Advance, And Receipts</w:t>
       </w:r>
     </w:p>
     <w:p>
       <w:pPr>
-        <w:spacing w:before="0" w:after="60" w:lineRule="auto" w:line="264"/>
-        <w:jc w:val="left"/>
+        <w:spacing w:after="80" w:line="254" w:lineRule="auto"/>
       </w:pPr>
       <w:r>
         <w:rPr>
-          <w:rFonts w:ascii="Calibri" w:hAnsi="Calibri"/>
-          <w:b w:val="0"/>
-          <w:i w:val="0"/>
-          <w:color w:val="000000"/>
-          <w:sz w:val="22"/>
+          <w:rFonts w:ascii="Aptos" w:hAnsi="Aptos"/>
+          <w:color w:val="1C2722"/>
+          <w:sz w:val="17"/>
         </w:rPr>
-        <w:t>Digital Address: GW-0332-7210</w:t>
+        <w:t>The recorded rent plan is [[RENT_PLAN_SUMMARY]] The full saved cycle amount is [[CYCLE_RENT_TOTAL]]. The amount due as lawful advance before activation is [[ADVANCE_RENT_DUE]], subject always to the Rent Act, 1963 (Act 220), as amended. For a tenancy exceeding six months, the Landlord will not demand or collect more than six months’ rent in advance. Any excess paid must be applied to later rent periods or handled as required by law.</w:t>
       </w:r>
     </w:p>
     <w:p>
       <w:pPr>
-        <w:spacing w:before="0" w:after="60" w:lineRule="auto" w:line="264"/>
-        <w:jc w:val="left"/>
+        <w:spacing w:after="80" w:line="254" w:lineRule="auto"/>
       </w:pPr>
       <w:r>
         <w:rPr>
-          <w:rFonts w:ascii="Calibri" w:hAnsi="Calibri"/>
-          <w:b w:val="0"/>
-          <w:i w:val="0"/>
-          <w:color w:val="000000"/>
-          <w:sz w:val="22"/>
+          <w:rFonts w:ascii="Aptos" w:hAnsi="Aptos"/>
+          <w:color w:val="1C2722"/>
+          <w:sz w:val="17"/>
         </w:rPr>
-        <w:t>Mobile: 0244620860</w:t>
+        <w:t>The Landlord / Manager must provide a written receipt for each rent payment showing the Premises, amount paid, payment period, and Tenant’s name. Payment details confirmed for this agreement are recorded in section 12 below.</w:t>
       </w:r>
     </w:p>
     <w:p>
       <w:pPr>
-        <w:spacing w:before="0" w:after="160" w:lineRule="auto" w:line="264"/>
-        <w:jc w:val="left"/>
+        <w:keepNext/>
+        <w:keepLines/>
+        <w:spacing w:before="160" w:after="60"/>
       </w:pPr>
       <w:r>
         <w:rPr>
-          <w:rFonts w:ascii="Calibri" w:hAnsi="Calibri"/>
-          <w:b w:val="0"/>
-          <w:i/>
-          <w:color w:val="000000"/>
+          <w:rFonts w:ascii="Aptos Display" w:hAnsi="Aptos Display"/>
+          <w:b/>
+          <w:color w:val="164334"/>
           <w:sz w:val="22"/>
         </w:rPr>
-        <w:t>(Hereinafter referred to as "the Landlord")</w:t>
+        <w:t>4. Monthly Bills And Service Charges</w:t>
       </w:r>
     </w:p>
     <w:p>
       <w:pPr>
-        <w:spacing w:before="0" w:after="80" w:lineRule="auto" w:line="264"/>
-        <w:jc w:val="left"/>
+        <w:spacing w:after="80" w:line="254" w:lineRule="auto"/>
       </w:pPr>
       <w:r>
         <w:rPr>
-          <w:rFonts w:ascii="Calibri" w:hAnsi="Calibri"/>
-          <w:b/>
-          <w:i w:val="0"/>
-          <w:color w:val="000000"/>
-          <w:sz w:val="22"/>
+          <w:rFonts w:ascii="Aptos" w:hAnsi="Aptos"/>
+          <w:color w:val="1C2722"/>
+          <w:sz w:val="17"/>
         </w:rPr>
-        <w:t xml:space="preserve">Tenant Full Legal Name: </w:t>
-      </w:r>
-      <w:r>
-        <w:rPr>
-          <w:rFonts w:ascii="Calibri" w:hAnsi="Calibri"/>
-          <w:b w:val="0"/>
-          <w:i w:val="0"/>
-          <w:color w:val="000000"/>
-          <w:sz w:val="22"/>
-        </w:rPr>
-        <w:t>[[TENANT_NAME]]</w:t>
-      </w:r>
-    </w:p>
-    <w:p>
-      <w:pPr>
-        <w:spacing w:before="0" w:after="80" w:lineRule="auto" w:line="264"/>
-        <w:jc w:val="left"/>
-      </w:pPr>
-      <w:r>
-        <w:rPr>
-          <w:rFonts w:ascii="Calibri" w:hAnsi="Calibri"/>
-          <w:b/>
-          <w:i w:val="0"/>
-          <w:color w:val="000000"/>
-          <w:sz w:val="22"/>
-        </w:rPr>
-        <w:t xml:space="preserve">Tenant Address: </w:t>
-      </w:r>
-      <w:r>
-        <w:rPr>
-          <w:rFonts w:ascii="Calibri" w:hAnsi="Calibri"/>
-          <w:b w:val="0"/>
-          <w:i w:val="0"/>
-          <w:color w:val="000000"/>
-          <w:sz w:val="22"/>
-        </w:rPr>
-        <w:t>[[TENANT_ADDRESS]]</w:t>
-      </w:r>
-    </w:p>
-    <w:p>
-      <w:pPr>
-        <w:spacing w:before="0" w:after="80" w:lineRule="auto" w:line="264"/>
-        <w:jc w:val="left"/>
-      </w:pPr>
-      <w:r>
-        <w:rPr>
-          <w:rFonts w:ascii="Calibri" w:hAnsi="Calibri"/>
-          <w:b/>
-          <w:i w:val="0"/>
-          <w:color w:val="000000"/>
-          <w:sz w:val="22"/>
-        </w:rPr>
-        <w:t xml:space="preserve">Tenant Mobile: </w:t>
-      </w:r>
-      <w:r>
-        <w:rPr>
-          <w:rFonts w:ascii="Calibri" w:hAnsi="Calibri"/>
-          <w:b w:val="0"/>
-          <w:i w:val="0"/>
-          <w:color w:val="000000"/>
-          <w:sz w:val="22"/>
-        </w:rPr>
-        <w:t>[[TENANT_PHONE]]</w:t>
-      </w:r>
-    </w:p>
-    <w:p>
-      <w:pPr>
-        <w:spacing w:before="0" w:after="80" w:lineRule="auto" w:line="264"/>
-        <w:jc w:val="left"/>
-      </w:pPr>
-      <w:r>
-        <w:rPr>
-          <w:rFonts w:ascii="Calibri" w:hAnsi="Calibri"/>
-          <w:b/>
-          <w:i w:val="0"/>
-          <w:color w:val="000000"/>
-          <w:sz w:val="22"/>
-        </w:rPr>
-        <w:t xml:space="preserve">Tenant ID / Passport No.: </w:t>
-      </w:r>
-      <w:r>
-        <w:rPr>
-          <w:rFonts w:ascii="Calibri" w:hAnsi="Calibri"/>
-          <w:b w:val="0"/>
-          <w:i w:val="0"/>
-          <w:color w:val="000000"/>
-          <w:sz w:val="22"/>
-        </w:rPr>
-        <w:t>[[TENANT_ID_REF]]</w:t>
-      </w:r>
-    </w:p>
-    <w:p>
-      <w:pPr>
-        <w:spacing w:before="0" w:after="160" w:lineRule="auto" w:line="264"/>
-        <w:jc w:val="left"/>
-      </w:pPr>
-      <w:r>
-        <w:rPr>
-          <w:rFonts w:ascii="Calibri" w:hAnsi="Calibri"/>
-          <w:b w:val="0"/>
-          <w:i/>
-          <w:color w:val="000000"/>
-          <w:sz w:val="22"/>
-        </w:rPr>
-        <w:t>(Hereinafter referred to as "the Tenant")</w:t>
-      </w:r>
-    </w:p>
-    <w:p>
-      <w:pPr>
-        <w:pStyle w:val="Heading1"/>
-      </w:pPr>
-      <w:r>
-        <w:t>2. Property and Permitted Use</w:t>
-      </w:r>
-    </w:p>
-    <w:p>
-      <w:pPr>
-        <w:spacing w:before="0" w:after="120" w:lineRule="auto" w:line="264"/>
-        <w:jc w:val="left"/>
-      </w:pPr>
-      <w:r>
-        <w:rPr>
-          <w:rFonts w:ascii="Calibri" w:hAnsi="Calibri"/>
-          <w:b w:val="0"/>
-          <w:i w:val="0"/>
-          <w:color w:val="000000"/>
-          <w:sz w:val="22"/>
-        </w:rPr>
-        <w:t>The Landlord agrees to lease to the Tenant the residential apartment known as [[SUITE_NAME]], situated at [[PROPERTY_LOCATION]]. The premises shall be used strictly for residential purposes only, and no commercial activity shall be carried on from the apartment without the Landlord's prior written consent.</w:t>
-      </w:r>
-    </w:p>
-    <w:p>
-      <w:pPr>
-        <w:pStyle w:val="Heading1"/>
-      </w:pPr>
-      <w:r>
-        <w:t>3. Lease Term and Activation</w:t>
-      </w:r>
-    </w:p>
-    <w:p>
-      <w:pPr>
-        <w:spacing w:before="0" w:after="120" w:lineRule="auto" w:line="264"/>
-        <w:jc w:val="left"/>
-      </w:pPr>
-      <w:r>
-        <w:rPr>
-          <w:rFonts w:ascii="Calibri" w:hAnsi="Calibri"/>
-          <w:b w:val="0"/>
-          <w:i w:val="0"/>
-          <w:color w:val="000000"/>
-          <w:sz w:val="22"/>
-        </w:rPr>
-        <w:t>The tenancy shall commence on [[COMMENCEMENT_DATE]] and shall continue for [[LEASE_TERM_TEXT]], ending on [[EXPIRY_DATE]], unless terminated earlier in accordance with this Agreement.</w:t>
-      </w:r>
-    </w:p>
-    <w:p>
-      <w:pPr>
-        <w:spacing w:before="0" w:after="120" w:lineRule="auto" w:line="264"/>
-        <w:jc w:val="left"/>
-      </w:pPr>
-      <w:r>
-        <w:rPr>
-          <w:rFonts w:ascii="Calibri" w:hAnsi="Calibri"/>
-          <w:b w:val="0"/>
-          <w:i w:val="0"/>
-          <w:color w:val="000000"/>
-          <w:sz w:val="22"/>
-        </w:rPr>
-        <w:t>This Agreement shall become effective only after the Landlord confirms receipt of the agreed advance rent of [[ADVANCE_RENT_DUE]]. Until payment is confirmed and recorded in the Payment Confirmation section, this document remains a prepared draft for signature.</w:t>
-      </w:r>
-    </w:p>
-    <w:p>
-      <w:pPr>
-        <w:pStyle w:val="Heading1"/>
-      </w:pPr>
-      <w:r>
-        <w:t>4. Rent and Monthly Service Charges</w:t>
-      </w:r>
-    </w:p>
-    <w:p>
-      <w:pPr>
-        <w:spacing w:before="0" w:after="120" w:lineRule="auto" w:line="264"/>
-        <w:jc w:val="left"/>
-      </w:pPr>
-      <w:r>
-        <w:rPr>
-          <w:rFonts w:ascii="Calibri" w:hAnsi="Calibri"/>
-          <w:b w:val="0"/>
-          <w:i w:val="0"/>
-          <w:color w:val="000000"/>
-          <w:sz w:val="22"/>
-        </w:rPr>
-        <w:t>The agreed rent plan is [[RENT_PLAN_SUMMARY]] The total advance rent due before activation is [[ADVANCE_RENT_DUE]].</w:t>
-      </w:r>
-    </w:p>
-    <w:p>
-      <w:pPr>
-        <w:spacing w:before="0" w:after="160" w:lineRule="auto" w:line="264"/>
-        <w:jc w:val="left"/>
-      </w:pPr>
-      <w:r>
-        <w:rPr>
-          <w:rFonts w:ascii="Calibri" w:hAnsi="Calibri"/>
-          <w:b w:val="0"/>
-          <w:i w:val="0"/>
-          <w:color w:val="000000"/>
-          <w:sz w:val="22"/>
-        </w:rPr>
-        <w:t>Throughout the tenancy period, the Tenant shall also pay the following monthly utility and service charges through [[PAYMENT_CHANNEL]].[[CUSTOM_BILL_ITEMS_NOTE]]</w:t>
+        <w:t>Monthly utilities and services are separate from rent and are payable only when issued as an itemised bill or charge notice. The current monthly amount is [[MONTHLY_SERVICE_TOTAL]], payable through [[PAYMENT_CHANNEL]]. Charges presently recorded are:</w:t>
       </w:r>
     </w:p>
     <w:tbl>
       <w:tblPr>
         <w:tblStyle w:val="TableGrid"/>
-        <w:tblW w:type="dxa" w:w="9360"/>
-        <w:jc w:val="left"/>
-        <w:tblLayout w:type="fixed"/>
+        <w:tblW w:type="auto" w:w="0"/>
         <w:tblLook w:firstColumn="1" w:firstRow="1" w:lastColumn="0" w:lastRow="0" w:noHBand="0" w:noVBand="1" w:val="04A0"/>
-        <w:tblInd w:type="dxa" w:w="120"/>
       </w:tblPr>
       <w:tblGrid>
-        <w:gridCol w:w="6660"/>
-        <w:gridCol w:w="2700"/>
+        <w:gridCol w:w="5285"/>
+        <w:gridCol w:w="5285"/>
       </w:tblGrid>
       <w:tr>
-        <w:trPr/>
         <w:tc>
           <w:tcPr>
-            <w:tcW w:type="dxa" w:w="6660"/>
-            <w:tcMar>
-              <w:top w:w="80" w:type="dxa"/>
-              <w:bottom w:w="80" w:type="dxa"/>
-              <w:start w:w="120" w:type="dxa"/>
-              <w:end w:w="120" w:type="dxa"/>
-            </w:tcMar>
-            <w:shd w:fill="F2F4F7" w:val="clear" w:color="auto"/>
+            <w:tcW w:type="dxa" w:w="5285"/>
+            <w:shd w:fill="EEF3EF"/>
+            <w:vAlign w:val="center"/>
             <w:tcBorders>
-              <w:top w:val="single" w:sz="6" w:space="0" w:color="D6DDD5"/>
-              <w:left w:val="single" w:sz="6" w:space="0" w:color="D6DDD5"/>
-              <w:bottom w:val="single" w:sz="6" w:space="0" w:color="D6DDD5"/>
-              <w:right w:val="single" w:sz="6" w:space="0" w:color="D6DDD5"/>
+              <w:top w:val="single" w:sz="4" w:color="C9D6CC"/>
+              <w:left w:val="single" w:sz="4" w:color="C9D6CC"/>
+              <w:bottom w:val="single" w:sz="4" w:color="C9D6CC"/>
+              <w:right w:val="single" w:sz="4" w:color="C9D6CC"/>
             </w:tcBorders>
-            <w:vAlign w:val="center"/>
           </w:tcPr>
           <w:p>
             <w:pPr>
-              <w:spacing w:before="0" w:after="0" w:lineRule="auto" w:line="264"/>
-              <w:jc w:val="left"/>
+              <w:spacing w:after="0"/>
             </w:pPr>
+            <w:r/>
             <w:r>
               <w:rPr>
-                <w:rFonts w:ascii="Calibri" w:hAnsi="Calibri"/>
-                <w:b/>
-                <w:i w:val="0"/>
-                <w:color w:val="000000"/>
-                <w:sz w:val="22"/>
-              </w:rPr>
-              <w:t>Charge</w:t>
-            </w:r>
-          </w:p>
-        </w:tc>
-        <w:tc>
-          <w:tcPr>
-            <w:tcW w:type="dxa" w:w="2700"/>
-            <w:tcMar>
-              <w:top w:w="80" w:type="dxa"/>
-              <w:bottom w:w="80" w:type="dxa"/>
-              <w:start w:w="120" w:type="dxa"/>
-              <w:end w:w="120" w:type="dxa"/>
-            </w:tcMar>
-            <w:shd w:fill="F2F4F7" w:val="clear" w:color="auto"/>
-            <w:tcBorders>
-              <w:top w:val="single" w:sz="6" w:space="0" w:color="D6DDD5"/>
-              <w:left w:val="single" w:sz="6" w:space="0" w:color="D6DDD5"/>
-              <w:bottom w:val="single" w:sz="6" w:space="0" w:color="D6DDD5"/>
-              <w:right w:val="single" w:sz="6" w:space="0" w:color="D6DDD5"/>
-            </w:tcBorders>
-            <w:vAlign w:val="center"/>
-          </w:tcPr>
-          <w:p>
-            <w:pPr>
-              <w:spacing w:before="0" w:after="0" w:lineRule="auto" w:line="264"/>
-              <w:jc w:val="left"/>
-            </w:pPr>
-            <w:r>
-              <w:rPr>
-                <w:rFonts w:ascii="Calibri" w:hAnsi="Calibri"/>
-                <w:b/>
-                <w:i w:val="0"/>
-                <w:color w:val="000000"/>
-                <w:sz w:val="22"/>
-              </w:rPr>
-              <w:t>Amount</w:t>
-            </w:r>
-          </w:p>
-        </w:tc>
-      </w:tr>
-      <w:tr>
-        <w:trPr/>
-        <w:tc>
-          <w:tcPr>
-            <w:tcW w:type="dxa" w:w="6660"/>
-            <w:tcMar>
-              <w:top w:w="80" w:type="dxa"/>
-              <w:bottom w:w="80" w:type="dxa"/>
-              <w:start w:w="120" w:type="dxa"/>
-              <w:end w:w="120" w:type="dxa"/>
-            </w:tcMar>
-            <w:tcBorders>
-              <w:top w:val="single" w:sz="6" w:space="0" w:color="D6DDD5"/>
-              <w:left w:val="single" w:sz="6" w:space="0" w:color="D6DDD5"/>
-              <w:bottom w:val="single" w:sz="6" w:space="0" w:color="D6DDD5"/>
-              <w:right w:val="single" w:sz="6" w:space="0" w:color="D6DDD5"/>
-            </w:tcBorders>
-            <w:vAlign w:val="center"/>
-          </w:tcPr>
-          <w:p>
-            <w:pPr>
-              <w:spacing w:before="0" w:after="0" w:lineRule="auto" w:line="264"/>
-              <w:jc w:val="left"/>
-            </w:pPr>
-            <w:r>
-              <w:rPr>
-                <w:rFonts w:ascii="Calibri" w:hAnsi="Calibri"/>
+                <w:rFonts w:ascii="Aptos" w:hAnsi="Aptos"/>
                 <w:b w:val="0"/>
-                <w:i w:val="0"/>
-                <w:color w:val="000000"/>
-                <w:sz w:val="22"/>
+                <w:color w:val="164334"/>
+                <w:sz w:val="17"/>
               </w:rPr>
               <w:t>Water and toilet fees</w:t>
             </w:r>
@@ -1142,33 +681,25 @@
         </w:tc>
         <w:tc>
           <w:tcPr>
-            <w:tcW w:type="dxa" w:w="2700"/>
-            <w:tcMar>
-              <w:top w:w="80" w:type="dxa"/>
-              <w:bottom w:w="80" w:type="dxa"/>
-              <w:start w:w="120" w:type="dxa"/>
-              <w:end w:w="120" w:type="dxa"/>
-            </w:tcMar>
+            <w:tcW w:type="dxa" w:w="5285"/>
+            <w:vAlign w:val="center"/>
             <w:tcBorders>
-              <w:top w:val="single" w:sz="6" w:space="0" w:color="D6DDD5"/>
-              <w:left w:val="single" w:sz="6" w:space="0" w:color="D6DDD5"/>
-              <w:bottom w:val="single" w:sz="6" w:space="0" w:color="D6DDD5"/>
-              <w:right w:val="single" w:sz="6" w:space="0" w:color="D6DDD5"/>
+              <w:top w:val="single" w:sz="4" w:color="C9D6CC"/>
+              <w:left w:val="single" w:sz="4" w:color="C9D6CC"/>
+              <w:bottom w:val="single" w:sz="4" w:color="C9D6CC"/>
+              <w:right w:val="single" w:sz="4" w:color="C9D6CC"/>
             </w:tcBorders>
-            <w:vAlign w:val="center"/>
           </w:tcPr>
           <w:p>
             <w:pPr>
-              <w:spacing w:before="0" w:after="0" w:lineRule="auto" w:line="264"/>
-              <w:jc w:val="left"/>
+              <w:spacing w:after="0"/>
             </w:pPr>
+            <w:r/>
             <w:r>
               <w:rPr>
-                <w:rFonts w:ascii="Calibri" w:hAnsi="Calibri"/>
+                <w:rFonts w:ascii="Aptos" w:hAnsi="Aptos"/>
                 <w:b w:val="0"/>
-                <w:i w:val="0"/>
-                <w:color w:val="000000"/>
-                <w:sz w:val="22"/>
+                <w:sz w:val="17"/>
               </w:rPr>
               <w:t>[[WATER_TOILET_BILL]]</w:t>
             </w:r>
@@ -1176,70 +707,55 @@
         </w:tc>
       </w:tr>
       <w:tr>
-        <w:trPr/>
         <w:tc>
           <w:tcPr>
-            <w:tcW w:type="dxa" w:w="6660"/>
-            <w:tcMar>
-              <w:top w:w="80" w:type="dxa"/>
-              <w:bottom w:w="80" w:type="dxa"/>
-              <w:start w:w="120" w:type="dxa"/>
-              <w:end w:w="120" w:type="dxa"/>
-            </w:tcMar>
+            <w:tcW w:type="dxa" w:w="5285"/>
+            <w:shd w:fill="EEF3EF"/>
+            <w:vAlign w:val="center"/>
             <w:tcBorders>
-              <w:top w:val="single" w:sz="6" w:space="0" w:color="D6DDD5"/>
-              <w:left w:val="single" w:sz="6" w:space="0" w:color="D6DDD5"/>
-              <w:bottom w:val="single" w:sz="6" w:space="0" w:color="D6DDD5"/>
-              <w:right w:val="single" w:sz="6" w:space="0" w:color="D6DDD5"/>
+              <w:top w:val="single" w:sz="4" w:color="C9D6CC"/>
+              <w:left w:val="single" w:sz="4" w:color="C9D6CC"/>
+              <w:bottom w:val="single" w:sz="4" w:color="C9D6CC"/>
+              <w:right w:val="single" w:sz="4" w:color="C9D6CC"/>
             </w:tcBorders>
-            <w:vAlign w:val="center"/>
           </w:tcPr>
           <w:p>
             <w:pPr>
-              <w:spacing w:before="0" w:after="0" w:lineRule="auto" w:line="264"/>
-              <w:jc w:val="left"/>
+              <w:spacing w:after="0"/>
             </w:pPr>
+            <w:r/>
             <w:r>
               <w:rPr>
-                <w:rFonts w:ascii="Calibri" w:hAnsi="Calibri"/>
+                <w:rFonts w:ascii="Aptos" w:hAnsi="Aptos"/>
                 <w:b w:val="0"/>
-                <w:i w:val="0"/>
-                <w:color w:val="000000"/>
-                <w:sz w:val="22"/>
+                <w:color w:val="164334"/>
+                <w:sz w:val="17"/>
               </w:rPr>
-              <w:t>Sweeping of compound and gutter cleaning</w:t>
+              <w:t>Sweeping and gutter cleaning</w:t>
             </w:r>
           </w:p>
         </w:tc>
         <w:tc>
           <w:tcPr>
-            <w:tcW w:type="dxa" w:w="2700"/>
-            <w:tcMar>
-              <w:top w:w="80" w:type="dxa"/>
-              <w:bottom w:w="80" w:type="dxa"/>
-              <w:start w:w="120" w:type="dxa"/>
-              <w:end w:w="120" w:type="dxa"/>
-            </w:tcMar>
+            <w:tcW w:type="dxa" w:w="5285"/>
+            <w:vAlign w:val="center"/>
             <w:tcBorders>
-              <w:top w:val="single" w:sz="6" w:space="0" w:color="D6DDD5"/>
-              <w:left w:val="single" w:sz="6" w:space="0" w:color="D6DDD5"/>
-              <w:bottom w:val="single" w:sz="6" w:space="0" w:color="D6DDD5"/>
-              <w:right w:val="single" w:sz="6" w:space="0" w:color="D6DDD5"/>
+              <w:top w:val="single" w:sz="4" w:color="C9D6CC"/>
+              <w:left w:val="single" w:sz="4" w:color="C9D6CC"/>
+              <w:bottom w:val="single" w:sz="4" w:color="C9D6CC"/>
+              <w:right w:val="single" w:sz="4" w:color="C9D6CC"/>
             </w:tcBorders>
-            <w:vAlign w:val="center"/>
           </w:tcPr>
           <w:p>
             <w:pPr>
-              <w:spacing w:before="0" w:after="0" w:lineRule="auto" w:line="264"/>
-              <w:jc w:val="left"/>
+              <w:spacing w:after="0"/>
             </w:pPr>
+            <w:r/>
             <w:r>
               <w:rPr>
-                <w:rFonts w:ascii="Calibri" w:hAnsi="Calibri"/>
+                <w:rFonts w:ascii="Aptos" w:hAnsi="Aptos"/>
                 <w:b w:val="0"/>
-                <w:i w:val="0"/>
-                <w:color w:val="000000"/>
-                <w:sz w:val="22"/>
+                <w:sz w:val="17"/>
               </w:rPr>
               <w:t>[[SWEEPING_BILL]]</w:t>
             </w:r>
@@ -1247,70 +763,55 @@
         </w:tc>
       </w:tr>
       <w:tr>
-        <w:trPr/>
         <w:tc>
           <w:tcPr>
-            <w:tcW w:type="dxa" w:w="6660"/>
-            <w:tcMar>
-              <w:top w:w="80" w:type="dxa"/>
-              <w:bottom w:w="80" w:type="dxa"/>
-              <w:start w:w="120" w:type="dxa"/>
-              <w:end w:w="120" w:type="dxa"/>
-            </w:tcMar>
+            <w:tcW w:type="dxa" w:w="5285"/>
+            <w:shd w:fill="EEF3EF"/>
+            <w:vAlign w:val="center"/>
             <w:tcBorders>
-              <w:top w:val="single" w:sz="6" w:space="0" w:color="D6DDD5"/>
-              <w:left w:val="single" w:sz="6" w:space="0" w:color="D6DDD5"/>
-              <w:bottom w:val="single" w:sz="6" w:space="0" w:color="D6DDD5"/>
-              <w:right w:val="single" w:sz="6" w:space="0" w:color="D6DDD5"/>
+              <w:top w:val="single" w:sz="4" w:color="C9D6CC"/>
+              <w:left w:val="single" w:sz="4" w:color="C9D6CC"/>
+              <w:bottom w:val="single" w:sz="4" w:color="C9D6CC"/>
+              <w:right w:val="single" w:sz="4" w:color="C9D6CC"/>
             </w:tcBorders>
-            <w:vAlign w:val="center"/>
           </w:tcPr>
           <w:p>
             <w:pPr>
-              <w:spacing w:before="0" w:after="0" w:lineRule="auto" w:line="264"/>
-              <w:jc w:val="left"/>
+              <w:spacing w:after="0"/>
             </w:pPr>
+            <w:r/>
             <w:r>
               <w:rPr>
-                <w:rFonts w:ascii="Calibri" w:hAnsi="Calibri"/>
+                <w:rFonts w:ascii="Aptos" w:hAnsi="Aptos"/>
                 <w:b w:val="0"/>
-                <w:i w:val="0"/>
-                <w:color w:val="000000"/>
-                <w:sz w:val="22"/>
+                <w:color w:val="164334"/>
+                <w:sz w:val="17"/>
               </w:rPr>
-              <w:t>Waste disposal</w:t>
+              <w:t>Waste management</w:t>
             </w:r>
           </w:p>
         </w:tc>
         <w:tc>
           <w:tcPr>
-            <w:tcW w:type="dxa" w:w="2700"/>
-            <w:tcMar>
-              <w:top w:w="80" w:type="dxa"/>
-              <w:bottom w:w="80" w:type="dxa"/>
-              <w:start w:w="120" w:type="dxa"/>
-              <w:end w:w="120" w:type="dxa"/>
-            </w:tcMar>
+            <w:tcW w:type="dxa" w:w="5285"/>
+            <w:vAlign w:val="center"/>
             <w:tcBorders>
-              <w:top w:val="single" w:sz="6" w:space="0" w:color="D6DDD5"/>
-              <w:left w:val="single" w:sz="6" w:space="0" w:color="D6DDD5"/>
-              <w:bottom w:val="single" w:sz="6" w:space="0" w:color="D6DDD5"/>
-              <w:right w:val="single" w:sz="6" w:space="0" w:color="D6DDD5"/>
+              <w:top w:val="single" w:sz="4" w:color="C9D6CC"/>
+              <w:left w:val="single" w:sz="4" w:color="C9D6CC"/>
+              <w:bottom w:val="single" w:sz="4" w:color="C9D6CC"/>
+              <w:right w:val="single" w:sz="4" w:color="C9D6CC"/>
             </w:tcBorders>
-            <w:vAlign w:val="center"/>
           </w:tcPr>
           <w:p>
             <w:pPr>
-              <w:spacing w:before="0" w:after="0" w:lineRule="auto" w:line="264"/>
-              <w:jc w:val="left"/>
+              <w:spacing w:after="0"/>
             </w:pPr>
+            <w:r/>
             <w:r>
               <w:rPr>
-                <w:rFonts w:ascii="Calibri" w:hAnsi="Calibri"/>
+                <w:rFonts w:ascii="Aptos" w:hAnsi="Aptos"/>
                 <w:b w:val="0"/>
-                <w:i w:val="0"/>
-                <w:color w:val="000000"/>
-                <w:sz w:val="22"/>
+                <w:sz w:val="17"/>
               </w:rPr>
               <w:t>[[WASTE_BILL]]</w:t>
             </w:r>
@@ -1318,36 +819,85 @@
         </w:tc>
       </w:tr>
       <w:tr>
-        <w:trPr/>
         <w:tc>
           <w:tcPr>
-            <w:tcW w:type="dxa" w:w="6660"/>
-            <w:tcMar>
-              <w:top w:w="80" w:type="dxa"/>
-              <w:bottom w:w="80" w:type="dxa"/>
-              <w:start w:w="120" w:type="dxa"/>
-              <w:end w:w="120" w:type="dxa"/>
-            </w:tcMar>
+            <w:tcW w:type="dxa" w:w="5285"/>
+            <w:shd w:fill="EEF3EF"/>
+            <w:vAlign w:val="center"/>
             <w:tcBorders>
-              <w:top w:val="single" w:sz="6" w:space="0" w:color="D6DDD5"/>
-              <w:left w:val="single" w:sz="6" w:space="0" w:color="D6DDD5"/>
-              <w:bottom w:val="single" w:sz="6" w:space="0" w:color="D6DDD5"/>
-              <w:right w:val="single" w:sz="6" w:space="0" w:color="D6DDD5"/>
+              <w:top w:val="single" w:sz="4" w:color="C9D6CC"/>
+              <w:left w:val="single" w:sz="4" w:color="C9D6CC"/>
+              <w:bottom w:val="single" w:sz="4" w:color="C9D6CC"/>
+              <w:right w:val="single" w:sz="4" w:color="C9D6CC"/>
             </w:tcBorders>
-            <w:vAlign w:val="center"/>
           </w:tcPr>
           <w:p>
             <w:pPr>
-              <w:spacing w:before="0" w:after="0" w:lineRule="auto" w:line="264"/>
-              <w:jc w:val="left"/>
+              <w:spacing w:after="0"/>
             </w:pPr>
+            <w:r/>
             <w:r>
               <w:rPr>
-                <w:rFonts w:ascii="Calibri" w:hAnsi="Calibri"/>
+                <w:rFonts w:ascii="Aptos" w:hAnsi="Aptos"/>
+                <w:b w:val="0"/>
+                <w:color w:val="164334"/>
+                <w:sz w:val="17"/>
+              </w:rPr>
+              <w:t>Other saved charges</w:t>
+            </w:r>
+          </w:p>
+        </w:tc>
+        <w:tc>
+          <w:tcPr>
+            <w:tcW w:type="dxa" w:w="5285"/>
+            <w:vAlign w:val="center"/>
+            <w:tcBorders>
+              <w:top w:val="single" w:sz="4" w:color="C9D6CC"/>
+              <w:left w:val="single" w:sz="4" w:color="C9D6CC"/>
+              <w:bottom w:val="single" w:sz="4" w:color="C9D6CC"/>
+              <w:right w:val="single" w:sz="4" w:color="C9D6CC"/>
+            </w:tcBorders>
+          </w:tcPr>
+          <w:p>
+            <w:pPr>
+              <w:spacing w:after="0"/>
+            </w:pPr>
+            <w:r/>
+            <w:r>
+              <w:rPr>
+                <w:rFonts w:ascii="Aptos" w:hAnsi="Aptos"/>
+                <w:b w:val="0"/>
+                <w:sz w:val="17"/>
+              </w:rPr>
+              <w:t>[[CUSTOM_BILL_ITEMS_NOTE]]</w:t>
+            </w:r>
+          </w:p>
+        </w:tc>
+      </w:tr>
+      <w:tr>
+        <w:tc>
+          <w:tcPr>
+            <w:tcW w:type="dxa" w:w="5285"/>
+            <w:shd w:fill="DDEBE0"/>
+            <w:vAlign w:val="center"/>
+            <w:tcBorders>
+              <w:top w:val="single" w:sz="4" w:color="C9D6CC"/>
+              <w:left w:val="single" w:sz="4" w:color="C9D6CC"/>
+              <w:bottom w:val="single" w:sz="4" w:color="C9D6CC"/>
+              <w:right w:val="single" w:sz="4" w:color="C9D6CC"/>
+            </w:tcBorders>
+          </w:tcPr>
+          <w:p>
+            <w:pPr>
+              <w:spacing w:after="0"/>
+            </w:pPr>
+            <w:r/>
+            <w:r>
+              <w:rPr>
+                <w:rFonts w:ascii="Aptos" w:hAnsi="Aptos"/>
                 <w:b/>
-                <w:i w:val="0"/>
-                <w:color w:val="000000"/>
-                <w:sz w:val="22"/>
+                <w:color w:val="164334"/>
+                <w:sz w:val="17"/>
               </w:rPr>
               <w:t>Total monthly service charges</w:t>
             </w:r>
@@ -1355,33 +905,25 @@
         </w:tc>
         <w:tc>
           <w:tcPr>
-            <w:tcW w:type="dxa" w:w="2700"/>
-            <w:tcMar>
-              <w:top w:w="80" w:type="dxa"/>
-              <w:bottom w:w="80" w:type="dxa"/>
-              <w:start w:w="120" w:type="dxa"/>
-              <w:end w:w="120" w:type="dxa"/>
-            </w:tcMar>
+            <w:tcW w:type="dxa" w:w="5285"/>
+            <w:vAlign w:val="center"/>
             <w:tcBorders>
-              <w:top w:val="single" w:sz="6" w:space="0" w:color="D6DDD5"/>
-              <w:left w:val="single" w:sz="6" w:space="0" w:color="D6DDD5"/>
-              <w:bottom w:val="single" w:sz="6" w:space="0" w:color="D6DDD5"/>
-              <w:right w:val="single" w:sz="6" w:space="0" w:color="D6DDD5"/>
+              <w:top w:val="single" w:sz="4" w:color="C9D6CC"/>
+              <w:left w:val="single" w:sz="4" w:color="C9D6CC"/>
+              <w:bottom w:val="single" w:sz="4" w:color="C9D6CC"/>
+              <w:right w:val="single" w:sz="4" w:color="C9D6CC"/>
             </w:tcBorders>
-            <w:vAlign w:val="center"/>
           </w:tcPr>
           <w:p>
             <w:pPr>
-              <w:spacing w:before="0" w:after="0" w:lineRule="auto" w:line="264"/>
-              <w:jc w:val="left"/>
+              <w:spacing w:after="0"/>
             </w:pPr>
+            <w:r/>
             <w:r>
               <w:rPr>
-                <w:rFonts w:ascii="Calibri" w:hAnsi="Calibri"/>
+                <w:rFonts w:ascii="Aptos" w:hAnsi="Aptos"/>
                 <w:b/>
-                <w:i w:val="0"/>
-                <w:color w:val="000000"/>
-                <w:sz w:val="22"/>
+                <w:sz w:val="17"/>
               </w:rPr>
               <w:t>[[MONTHLY_SERVICE_TOTAL]]</w:t>
             </w:r>
@@ -1391,377 +933,339 @@
     </w:tbl>
     <w:p>
       <w:pPr>
-        <w:spacing w:before="160" w:after="120" w:lineRule="auto" w:line="264"/>
-        <w:jc w:val="left"/>
+        <w:spacing w:after="80" w:line="254" w:lineRule="auto"/>
       </w:pPr>
       <w:r>
         <w:rPr>
-          <w:rFonts w:ascii="Calibri" w:hAnsi="Calibri"/>
-          <w:b w:val="0"/>
-          <w:i w:val="0"/>
-          <w:color w:val="000000"/>
-          <w:sz w:val="22"/>
+          <w:rFonts w:ascii="Aptos" w:hAnsi="Aptos"/>
+          <w:color w:val="1C2722"/>
+          <w:sz w:val="17"/>
         </w:rPr>
-        <w:t>The Tenant shall send proof of each monthly service-charge payment to the Landlord immediately after payment is made.</w:t>
+        <w:t>Any change to a recurring bill or service charge must be notified in writing with a clear basis and effective date. The Tenant should retain the payment receipt or transfer reference for each payment.</w:t>
       </w:r>
     </w:p>
     <w:p>
       <w:pPr>
-        <w:pStyle w:val="Heading1"/>
+        <w:keepNext/>
+        <w:keepLines/>
+        <w:spacing w:before="160" w:after="60"/>
       </w:pPr>
       <w:r>
-        <w:t>5. Safety, Alterations, and Property Care</w:t>
+        <w:rPr>
+          <w:rFonts w:ascii="Aptos Display" w:hAnsi="Aptos Display"/>
+          <w:b/>
+          <w:color w:val="164334"/>
+          <w:sz w:val="22"/>
+        </w:rPr>
+        <w:t>5. Deposit, Condition, And Inventory</w:t>
       </w:r>
     </w:p>
     <w:p>
       <w:pPr>
-        <w:spacing w:before="0" w:after="120" w:lineRule="auto" w:line="264"/>
-        <w:jc w:val="left"/>
+        <w:spacing w:after="80" w:line="254" w:lineRule="auto"/>
       </w:pPr>
       <w:r>
         <w:rPr>
-          <w:rFonts w:ascii="Calibri" w:hAnsi="Calibri"/>
-          <w:b w:val="0"/>
-          <w:i w:val="0"/>
-          <w:color w:val="000000"/>
-          <w:sz w:val="22"/>
+          <w:rFonts w:ascii="Aptos" w:hAnsi="Aptos"/>
+          <w:color w:val="1C2722"/>
+          <w:sz w:val="17"/>
         </w:rPr>
-        <w:t>Gas cylinders shall not be stored in the bedroom or kitchen. All gas cylinders must be kept in the designated external compartment and connected to the stove from that location only.</w:t>
+        <w:t>Any security deposit is held separately from rent and may be applied only to documented unpaid lawful charges, missing inventory items, or damage beyond fair wear and tear. At move-in, the parties should sign the condition and inventory schedule, including keys, meter readings, fixtures, and any bed or mattress supplied. At move-out, deductions must be itemised and explained to the Tenant.</w:t>
       </w:r>
     </w:p>
     <w:p>
       <w:pPr>
-        <w:spacing w:before="0" w:after="120" w:lineRule="auto" w:line="264"/>
-        <w:jc w:val="left"/>
+        <w:keepNext/>
+        <w:keepLines/>
+        <w:spacing w:before="160" w:after="60"/>
       </w:pPr>
       <w:r>
         <w:rPr>
-          <w:rFonts w:ascii="Calibri" w:hAnsi="Calibri"/>
-          <w:b w:val="0"/>
-          <w:i w:val="0"/>
-          <w:color w:val="000000"/>
+          <w:rFonts w:ascii="Aptos Display" w:hAnsi="Aptos Display"/>
+          <w:b/>
+          <w:color w:val="164334"/>
           <w:sz w:val="22"/>
         </w:rPr>
-        <w:t>The apartment includes the basic fittings presently installed, including the bath, toilet, and kitchen fixtures. The Tenant shall be responsible for any damage occurring during the tenancy beyond fair wear and tear.</w:t>
+        <w:t>6. Care, Conduct, And Safety</w:t>
       </w:r>
     </w:p>
     <w:p>
       <w:pPr>
-        <w:spacing w:before="0" w:after="120" w:lineRule="auto" w:line="264"/>
-        <w:jc w:val="left"/>
+        <w:pStyle w:val="ListBullet"/>
+        <w:spacing w:after="20"/>
+        <w:ind w:left="317"/>
       </w:pPr>
       <w:r>
         <w:rPr>
-          <w:rFonts w:ascii="Calibri" w:hAnsi="Calibri"/>
-          <w:b w:val="0"/>
-          <w:i w:val="0"/>
-          <w:color w:val="000000"/>
-          <w:sz w:val="22"/>
+          <w:rFonts w:ascii="Aptos" w:hAnsi="Aptos"/>
+          <w:sz w:val="17"/>
         </w:rPr>
-        <w:t>Before moving out, the Tenant shall permit an inspection by designated service providers, including a plumber, electrician, and painter, to confirm that no outstanding repairs remain.</w:t>
+        <w:t>The Tenant must keep the Premises and immediate surroundings reasonably clean and cooperate with property sanitation and waste-management arrangements.</w:t>
       </w:r>
     </w:p>
     <w:p>
       <w:pPr>
-        <w:spacing w:before="0" w:after="120" w:lineRule="auto" w:line="264"/>
-        <w:jc w:val="left"/>
+        <w:pStyle w:val="ListBullet"/>
+        <w:spacing w:after="20"/>
+        <w:ind w:left="317"/>
       </w:pPr>
       <w:r>
         <w:rPr>
-          <w:rFonts w:ascii="Calibri" w:hAnsi="Calibri"/>
-          <w:b w:val="0"/>
-          <w:i w:val="0"/>
-          <w:color w:val="000000"/>
-          <w:sz w:val="22"/>
+          <w:rFonts w:ascii="Aptos" w:hAnsi="Aptos"/>
+          <w:sz w:val="17"/>
         </w:rPr>
-        <w:t>The Tenant shall not drill, paint, or make structural or cosmetic alterations to the premises without the Landlord's prior permission.</w:t>
+        <w:t>Gas cylinders must remain in the designated external compartment and must not be stored in the bedroom or kitchen.</w:t>
       </w:r>
     </w:p>
     <w:p>
       <w:pPr>
-        <w:pStyle w:val="Heading1"/>
+        <w:pStyle w:val="ListBullet"/>
+        <w:spacing w:after="20"/>
+        <w:ind w:left="317"/>
       </w:pPr>
       <w:r>
-        <w:t>6. Conduct, Guests, and House Rules</w:t>
+        <w:rPr>
+          <w:rFonts w:ascii="Aptos" w:hAnsi="Aptos"/>
+          <w:sz w:val="17"/>
+        </w:rPr>
+        <w:t>No pets, indoor smoking, excessive noise, nuisance, dangerous or disorderly conduct, or activity that disturbs neighbours is allowed.</w:t>
       </w:r>
     </w:p>
     <w:p>
       <w:pPr>
-        <w:spacing w:before="0" w:after="120" w:lineRule="auto" w:line="264"/>
-        <w:jc w:val="left"/>
+        <w:pStyle w:val="ListBullet"/>
+        <w:spacing w:after="20"/>
+        <w:ind w:left="317"/>
       </w:pPr>
       <w:r>
         <w:rPr>
-          <w:rFonts w:ascii="Calibri" w:hAnsi="Calibri"/>
-          <w:b w:val="0"/>
-          <w:i w:val="0"/>
-          <w:color w:val="000000"/>
-          <w:sz w:val="22"/>
+          <w:rFonts w:ascii="Aptos" w:hAnsi="Aptos"/>
+          <w:sz w:val="17"/>
         </w:rPr>
-        <w:t>No pets are allowed on the premises. The Tenant shall maintain reasonable noise levels and shall not play loud music in a manner that disturbs neighbours or other occupants.</w:t>
+        <w:t>The Tenant must keep the main gate locked and notify the Landlord / Manager of any extended occupancy, lost keys, or security concern.</w:t>
       </w:r>
     </w:p>
     <w:p>
       <w:pPr>
-        <w:spacing w:before="0" w:after="120" w:lineRule="auto" w:line="264"/>
-        <w:jc w:val="left"/>
+        <w:pStyle w:val="ListBullet"/>
+        <w:spacing w:after="20"/>
+        <w:ind w:left="317"/>
       </w:pPr>
       <w:r>
         <w:rPr>
-          <w:rFonts w:ascii="Calibri" w:hAnsi="Calibri"/>
-          <w:b w:val="0"/>
-          <w:i w:val="0"/>
-          <w:color w:val="000000"/>
-          <w:sz w:val="22"/>
+          <w:rFonts w:ascii="Aptos" w:hAnsi="Aptos"/>
+          <w:sz w:val="17"/>
         </w:rPr>
-        <w:t>Overnight guests may stay only for a limited number of days and only with the Landlord's prior approval. Smoking is not permitted inside the apartment.</w:t>
+        <w:t>The Tenant must not drill, paint, alter fixtures, or make structural or cosmetic changes without prior written consent.</w:t>
       </w:r>
     </w:p>
     <w:p>
       <w:pPr>
-        <w:spacing w:before="0" w:after="120" w:lineRule="auto" w:line="264"/>
-        <w:jc w:val="left"/>
+        <w:keepNext/>
+        <w:keepLines/>
+        <w:spacing w:before="160" w:after="60"/>
       </w:pPr>
       <w:r>
         <w:rPr>
-          <w:rFonts w:ascii="Calibri" w:hAnsi="Calibri"/>
-          <w:b w:val="0"/>
-          <w:i w:val="0"/>
-          <w:color w:val="000000"/>
+          <w:rFonts w:ascii="Aptos Display" w:hAnsi="Aptos Display"/>
+          <w:b/>
+          <w:color w:val="164334"/>
           <w:sz w:val="22"/>
         </w:rPr>
-        <w:t>Excessive alcohol use or any disorderly behaviour that causes nuisance, danger, or disturbance is strictly prohibited.</w:t>
+        <w:t>7. Repairs, Maintenance, And Access</w:t>
       </w:r>
     </w:p>
     <w:p>
       <w:pPr>
-        <w:spacing w:before="0" w:after="120" w:lineRule="auto" w:line="264"/>
-        <w:jc w:val="left"/>
+        <w:spacing w:after="80" w:line="254" w:lineRule="auto"/>
       </w:pPr>
       <w:r>
         <w:rPr>
-          <w:rFonts w:ascii="Calibri" w:hAnsi="Calibri"/>
-          <w:b w:val="0"/>
-          <w:i w:val="0"/>
-          <w:color w:val="000000"/>
-          <w:sz w:val="22"/>
+          <w:rFonts w:ascii="Aptos" w:hAnsi="Aptos"/>
+          <w:color w:val="1C2722"/>
+          <w:sz w:val="17"/>
         </w:rPr>
-        <w:t>The Tenant shall keep both the apartment and the immediate surroundings in a clean and orderly condition and shall cooperate with other occupants to maintain a sanitary environment.</w:t>
+        <w:t>The Landlord is responsible for structural safety and maintenance not caused by the Tenant’s misuse or neglect. The Tenant is responsible for promptly reporting defects and for damage caused by the Tenant, occupants, or guests beyond fair wear and tear. Non-urgent matters may be reported by WhatsApp or text. Urgent water leaks, electrical faults, fire, or safety risks must be reported immediately.</w:t>
       </w:r>
     </w:p>
     <w:p>
       <w:pPr>
-        <w:spacing w:before="0" w:after="120" w:lineRule="auto" w:line="264"/>
-        <w:jc w:val="left"/>
+        <w:spacing w:after="80" w:line="254" w:lineRule="auto"/>
       </w:pPr>
       <w:r>
         <w:rPr>
-          <w:rFonts w:ascii="Calibri" w:hAnsi="Calibri"/>
-          <w:b w:val="0"/>
-          <w:i w:val="0"/>
-          <w:color w:val="000000"/>
-          <w:sz w:val="22"/>
+          <w:rFonts w:ascii="Aptos" w:hAnsi="Aptos"/>
+          <w:color w:val="1C2722"/>
+          <w:sz w:val="17"/>
         </w:rPr>
-        <w:t>The main gate must remain locked at all times to support the security of all residents and to prevent the dogs on the premises from leaving the compound.</w:t>
+        <w:t>Except in an emergency, for agreed repairs, or where entry is authorised by law, the Landlord will give reasonable advance notice before entering the Premises. The Tenant will allow access at a reasonable time for inspection and necessary repair. Approved providers may be used for electrical, plumbing, or other specialist work; no unauthorised work is to be commissioned where it could affect the property.</w:t>
       </w:r>
     </w:p>
     <w:p>
       <w:pPr>
-        <w:pStyle w:val="Heading1"/>
+        <w:keepNext/>
+        <w:keepLines/>
+        <w:spacing w:before="160" w:after="60"/>
       </w:pPr>
       <w:r>
-        <w:t>7. Maintenance, Access, and Issue Resolution</w:t>
+        <w:rPr>
+          <w:rFonts w:ascii="Aptos Display" w:hAnsi="Aptos Display"/>
+          <w:b/>
+          <w:color w:val="164334"/>
+          <w:sz w:val="22"/>
+        </w:rPr>
+        <w:t>8. Rent Review, Renewal, And Notices</w:t>
       </w:r>
     </w:p>
     <w:p>
       <w:pPr>
-        <w:spacing w:before="0" w:after="120" w:lineRule="auto" w:line="264"/>
-        <w:jc w:val="left"/>
+        <w:spacing w:after="80" w:line="254" w:lineRule="auto"/>
       </w:pPr>
       <w:r>
         <w:rPr>
-          <w:rFonts w:ascii="Calibri" w:hAnsi="Calibri"/>
-          <w:b w:val="0"/>
-          <w:i w:val="0"/>
-          <w:color w:val="000000"/>
-          <w:sz w:val="22"/>
+          <w:rFonts w:ascii="Aptos" w:hAnsi="Aptos"/>
+          <w:color w:val="1C2722"/>
+          <w:sz w:val="17"/>
         </w:rPr>
-        <w:t>Non-urgent maintenance issues shall be reported to the Landlord via WhatsApp or text message. Urgent issues, including water leaks or electrical faults, must be reported immediately.</w:t>
+        <w:t>A rent review or increase must be communicated in writing and must follow applicable Ghanaian law and any Rent Control process. This fixed term ends on the stated expiry date unless renewed in writing or otherwise continued under Ghanaian law. Either party may give written notice of proposed non-renewal or early termination, but no notice under this agreement shortens a longer notice period required by law.</w:t>
       </w:r>
     </w:p>
     <w:p>
       <w:pPr>
-        <w:spacing w:before="0" w:after="120" w:lineRule="auto" w:line="264"/>
-        <w:jc w:val="left"/>
+        <w:keepNext/>
+        <w:keepLines/>
+        <w:spacing w:before="160" w:after="60"/>
       </w:pPr>
       <w:r>
         <w:rPr>
-          <w:rFonts w:ascii="Calibri" w:hAnsi="Calibri"/>
-          <w:b w:val="0"/>
-          <w:i w:val="0"/>
-          <w:color w:val="000000"/>
+          <w:rFonts w:ascii="Aptos Display" w:hAnsi="Aptos Display"/>
+          <w:b/>
+          <w:color w:val="164334"/>
           <w:sz w:val="22"/>
         </w:rPr>
-        <w:t>Approved service providers are as follows: Electrician - Emmanuel (contact available on the tenants' WhatsApp platform), and Plumber - Sammy (contact available on the platform). No substitute electrician shall be engaged without the Landlord's approval.</w:t>
+        <w:t>9. Possession And Disputes</w:t>
       </w:r>
     </w:p>
     <w:p>
       <w:pPr>
-        <w:spacing w:before="0" w:after="120" w:lineRule="auto" w:line="264"/>
-        <w:jc w:val="left"/>
+        <w:spacing w:after="80" w:line="254" w:lineRule="auto"/>
       </w:pPr>
       <w:r>
         <w:rPr>
-          <w:rFonts w:ascii="Calibri" w:hAnsi="Calibri"/>
-          <w:b w:val="0"/>
-          <w:i w:val="0"/>
-          <w:color w:val="000000"/>
-          <w:sz w:val="22"/>
+          <w:rFonts w:ascii="Aptos" w:hAnsi="Aptos"/>
+          <w:color w:val="1C2722"/>
+          <w:sz w:val="17"/>
         </w:rPr>
-        <w:t>The Landlord may enter the premises only in an emergency, to carry out necessary or agreed repairs, inspections, or improvements, pursuant to a lawful court order, or where the Tenant is reasonably believed to have abandoned the premises.</w:t>
+        <w:t>The Landlord may not lock out the Tenant, remove the Tenant’s belongings, disconnect essential services, or recover possession except through the lawful process. The parties will first attempt to resolve concerns respectfully in writing. If unresolved, either party may refer the matter to the Rent Control Department, use a lawful alternative dispute-resolution process, or seek the appropriate court remedy. This agreement is governed by the laws of the Republic of Ghana. A term inconsistent with mandatory law is adjusted only to the extent necessary and does not affect the rest of the agreement.</w:t>
       </w:r>
     </w:p>
     <w:p>
       <w:pPr>
-        <w:spacing w:before="0" w:after="120" w:lineRule="auto" w:line="264"/>
-        <w:jc w:val="left"/>
+        <w:keepNext/>
+        <w:keepLines/>
+        <w:spacing w:before="160" w:after="60"/>
       </w:pPr>
       <w:r>
         <w:rPr>
-          <w:rFonts w:ascii="Calibri" w:hAnsi="Calibri"/>
-          <w:b w:val="0"/>
-          <w:i w:val="0"/>
-          <w:color w:val="000000"/>
+          <w:rFonts w:ascii="Aptos Display" w:hAnsi="Aptos Display"/>
+          <w:b/>
+          <w:color w:val="164334"/>
           <w:sz w:val="22"/>
         </w:rPr>
-        <w:t>The parties shall communicate respectfully and attempt to resolve issues amicably. Where a dispute remains unresolved, the parties may seek an appropriate lawful remedy, but pending resolution the Landlord's house rules shall continue to apply.</w:t>
+        <w:t>10. Communication</w:t>
       </w:r>
     </w:p>
     <w:p>
       <w:pPr>
-        <w:pStyle w:val="Heading1"/>
+        <w:spacing w:after="80" w:line="254" w:lineRule="auto"/>
       </w:pPr>
       <w:r>
-        <w:t>8. Termination, Expiry, and Governing Law</w:t>
+        <w:rPr>
+          <w:rFonts w:ascii="Aptos" w:hAnsi="Aptos"/>
+          <w:color w:val="1C2722"/>
+          <w:sz w:val="17"/>
+        </w:rPr>
+        <w:t>Routine non-urgent communication may be sent by WhatsApp or text to the phone numbers supplied by the parties. The Tenant must provide prompt written notice of a changed mobile number or address. Formal statutory notices must be served in the manner required by Ghanaian law.</w:t>
       </w:r>
     </w:p>
     <w:p>
       <w:pPr>
-        <w:spacing w:before="0" w:after="120" w:lineRule="auto" w:line="264"/>
-        <w:jc w:val="left"/>
+        <w:keepNext/>
+        <w:keepLines/>
+        <w:spacing w:before="160" w:after="60"/>
       </w:pPr>
       <w:r>
         <w:rPr>
-          <w:rFonts w:ascii="Calibri" w:hAnsi="Calibri"/>
-          <w:b w:val="0"/>
-          <w:i w:val="0"/>
-          <w:color w:val="000000"/>
+          <w:rFonts w:ascii="Aptos Display" w:hAnsi="Aptos Display"/>
+          <w:b/>
+          <w:color w:val="164334"/>
           <w:sz w:val="22"/>
         </w:rPr>
-        <w:t>Either party may terminate this Agreement by giving not less than one (1) month's written notice, subject to any outstanding financial obligations already due under this Agreement.</w:t>
+        <w:t>11. Entire Agreement</w:t>
       </w:r>
     </w:p>
     <w:p>
       <w:pPr>
-        <w:spacing w:before="0" w:after="120" w:lineRule="auto" w:line="264"/>
-        <w:jc w:val="left"/>
+        <w:spacing w:after="80" w:line="254" w:lineRule="auto"/>
       </w:pPr>
       <w:r>
         <w:rPr>
-          <w:rFonts w:ascii="Calibri" w:hAnsi="Calibri"/>
-          <w:b w:val="0"/>
-          <w:i w:val="0"/>
-          <w:color w:val="000000"/>
-          <w:sz w:val="22"/>
+          <w:rFonts w:ascii="Aptos" w:hAnsi="Aptos"/>
+          <w:color w:val="1C2722"/>
+          <w:sz w:val="17"/>
         </w:rPr>
-        <w:t>The Tenant shall be notified when the tenancy period is approaching expiry. Any renewal or extension shall be by fresh agreement between the parties.</w:t>
+        <w:t>This agreement, the signed payment schedule, and the signed move-in condition / inventory schedule record the parties’ agreement about the tenancy. A change is valid only if recorded in writing and signed or otherwise legally accepted by both parties. Nothing in this agreement removes a right or protection that Ghanaian law gives either party.</w:t>
       </w:r>
     </w:p>
     <w:p>
       <w:pPr>
-        <w:spacing w:before="0" w:after="120" w:lineRule="auto" w:line="264"/>
-        <w:jc w:val="left"/>
+        <w:keepNext/>
+        <w:keepLines/>
+        <w:spacing w:before="160" w:after="60"/>
       </w:pPr>
       <w:r>
         <w:rPr>
-          <w:rFonts w:ascii="Calibri" w:hAnsi="Calibri"/>
-          <w:b w:val="0"/>
-          <w:i w:val="0"/>
-          <w:color w:val="000000"/>
+          <w:rFonts w:ascii="Aptos Display" w:hAnsi="Aptos Display"/>
+          <w:b/>
+          <w:color w:val="164334"/>
           <w:sz w:val="22"/>
         </w:rPr>
-        <w:t>This Agreement shall be governed by and construed in accordance with the laws of the Republic of Ghana.</w:t>
-      </w:r>
-    </w:p>
-    <w:p>
-      <w:pPr>
-        <w:pStyle w:val="Heading1"/>
-      </w:pPr>
-      <w:r>
-        <w:t>9. Payment Confirmation</w:t>
-      </w:r>
-    </w:p>
-    <w:p>
-      <w:pPr>
-        <w:spacing w:before="0" w:after="160" w:lineRule="auto" w:line="264"/>
-        <w:jc w:val="left"/>
-      </w:pPr>
-      <w:r>
-        <w:rPr>
-          <w:rFonts w:ascii="Calibri" w:hAnsi="Calibri"/>
-          <w:b w:val="0"/>
-          <w:i w:val="0"/>
-          <w:color w:val="000000"/>
-          <w:sz w:val="22"/>
-        </w:rPr>
-        <w:t>Complete this section once the recorded rent payment has been received. The agreement should be signed only after this information has been entered and confirmed by the Landlord.</w:t>
+        <w:t>12. Payment Confirmation</w:t>
       </w:r>
     </w:p>
     <w:tbl>
       <w:tblPr>
-        <w:tblStyle w:val="TableGrid"/>
-        <w:tblW w:type="dxa" w:w="9360"/>
-        <w:jc w:val="left"/>
-        <w:tblLayout w:type="fixed"/>
+        <w:tblW w:type="auto" w:w="0"/>
         <w:tblLook w:firstColumn="1" w:firstRow="1" w:lastColumn="0" w:lastRow="0" w:noHBand="0" w:noVBand="1" w:val="04A0"/>
-        <w:tblInd w:type="dxa" w:w="120"/>
       </w:tblPr>
       <w:tblGrid>
-        <w:gridCol w:w="2700"/>
-        <w:gridCol w:w="6660"/>
+        <w:gridCol w:w="5285"/>
+        <w:gridCol w:w="5285"/>
       </w:tblGrid>
       <w:tr>
-        <w:trPr/>
         <w:tc>
           <w:tcPr>
-            <w:tcW w:type="dxa" w:w="2700"/>
-            <w:tcMar>
-              <w:top w:w="80" w:type="dxa"/>
-              <w:bottom w:w="80" w:type="dxa"/>
-              <w:start w:w="120" w:type="dxa"/>
-              <w:end w:w="120" w:type="dxa"/>
-            </w:tcMar>
+            <w:tcW w:type="dxa" w:w="5285"/>
+            <w:shd w:fill="EEF3EF"/>
+            <w:vAlign w:val="center"/>
             <w:tcBorders>
-              <w:top w:val="single" w:sz="6" w:space="0" w:color="D6DDD5"/>
-              <w:left w:val="single" w:sz="6" w:space="0" w:color="D6DDD5"/>
-              <w:bottom w:val="single" w:sz="6" w:space="0" w:color="D6DDD5"/>
-              <w:right w:val="single" w:sz="6" w:space="0" w:color="D6DDD5"/>
+              <w:top w:val="single" w:sz="4" w:color="C9D6CC"/>
+              <w:left w:val="single" w:sz="4" w:color="C9D6CC"/>
+              <w:bottom w:val="single" w:sz="4" w:color="C9D6CC"/>
+              <w:right w:val="single" w:sz="4" w:color="C9D6CC"/>
             </w:tcBorders>
-            <w:vAlign w:val="center"/>
-            <w:shd w:fill="F2F4F7" w:val="clear" w:color="auto"/>
           </w:tcPr>
           <w:p>
             <w:pPr>
-              <w:spacing w:before="0" w:after="0" w:lineRule="auto" w:line="264"/>
-              <w:jc w:val="left"/>
+              <w:spacing w:after="0"/>
             </w:pPr>
+            <w:r/>
             <w:r>
               <w:rPr>
-                <w:rFonts w:ascii="Calibri" w:hAnsi="Calibri"/>
+                <w:rFonts w:ascii="Aptos" w:hAnsi="Aptos"/>
                 <w:b/>
-                <w:i w:val="0"/>
-                <w:color w:val="000000"/>
-                <w:sz w:val="22"/>
+                <w:color w:val="164334"/>
+                <w:sz w:val="17"/>
               </w:rPr>
               <w:t>Amount received</w:t>
             </w:r>
@@ -1769,33 +1273,25 @@
         </w:tc>
         <w:tc>
           <w:tcPr>
-            <w:tcW w:type="dxa" w:w="6660"/>
-            <w:tcMar>
-              <w:top w:w="80" w:type="dxa"/>
-              <w:bottom w:w="80" w:type="dxa"/>
-              <w:start w:w="120" w:type="dxa"/>
-              <w:end w:w="120" w:type="dxa"/>
-            </w:tcMar>
+            <w:tcW w:type="dxa" w:w="5285"/>
+            <w:vAlign w:val="center"/>
             <w:tcBorders>
-              <w:top w:val="single" w:sz="6" w:space="0" w:color="D6DDD5"/>
-              <w:left w:val="single" w:sz="6" w:space="0" w:color="D6DDD5"/>
-              <w:bottom w:val="single" w:sz="6" w:space="0" w:color="D6DDD5"/>
-              <w:right w:val="single" w:sz="6" w:space="0" w:color="D6DDD5"/>
+              <w:top w:val="single" w:sz="4" w:color="C9D6CC"/>
+              <w:left w:val="single" w:sz="4" w:color="C9D6CC"/>
+              <w:bottom w:val="single" w:sz="4" w:color="C9D6CC"/>
+              <w:right w:val="single" w:sz="4" w:color="C9D6CC"/>
             </w:tcBorders>
-            <w:vAlign w:val="center"/>
           </w:tcPr>
           <w:p>
             <w:pPr>
-              <w:spacing w:before="0" w:after="0" w:lineRule="auto" w:line="264"/>
-              <w:jc w:val="left"/>
+              <w:spacing w:after="0"/>
             </w:pPr>
+            <w:r/>
             <w:r>
               <w:rPr>
-                <w:rFonts w:ascii="Calibri" w:hAnsi="Calibri"/>
+                <w:rFonts w:ascii="Aptos" w:hAnsi="Aptos"/>
                 <w:b w:val="0"/>
-                <w:i w:val="0"/>
-                <w:color w:val="000000"/>
-                <w:sz w:val="22"/>
+                <w:sz w:val="17"/>
               </w:rPr>
               <w:t>[[AMOUNT_RECEIVED]]</w:t>
             </w:r>
@@ -1803,37 +1299,29 @@
         </w:tc>
       </w:tr>
       <w:tr>
-        <w:trPr/>
         <w:tc>
           <w:tcPr>
-            <w:tcW w:type="dxa" w:w="2700"/>
-            <w:tcMar>
-              <w:top w:w="80" w:type="dxa"/>
-              <w:bottom w:w="80" w:type="dxa"/>
-              <w:start w:w="120" w:type="dxa"/>
-              <w:end w:w="120" w:type="dxa"/>
-            </w:tcMar>
+            <w:tcW w:type="dxa" w:w="5285"/>
+            <w:shd w:fill="EEF3EF"/>
+            <w:vAlign w:val="center"/>
             <w:tcBorders>
-              <w:top w:val="single" w:sz="6" w:space="0" w:color="D6DDD5"/>
-              <w:left w:val="single" w:sz="6" w:space="0" w:color="D6DDD5"/>
-              <w:bottom w:val="single" w:sz="6" w:space="0" w:color="D6DDD5"/>
-              <w:right w:val="single" w:sz="6" w:space="0" w:color="D6DDD5"/>
+              <w:top w:val="single" w:sz="4" w:color="C9D6CC"/>
+              <w:left w:val="single" w:sz="4" w:color="C9D6CC"/>
+              <w:bottom w:val="single" w:sz="4" w:color="C9D6CC"/>
+              <w:right w:val="single" w:sz="4" w:color="C9D6CC"/>
             </w:tcBorders>
-            <w:vAlign w:val="center"/>
-            <w:shd w:fill="F2F4F7" w:val="clear" w:color="auto"/>
           </w:tcPr>
           <w:p>
             <w:pPr>
-              <w:spacing w:before="0" w:after="0" w:lineRule="auto" w:line="264"/>
-              <w:jc w:val="left"/>
+              <w:spacing w:after="0"/>
             </w:pPr>
+            <w:r/>
             <w:r>
               <w:rPr>
-                <w:rFonts w:ascii="Calibri" w:hAnsi="Calibri"/>
+                <w:rFonts w:ascii="Aptos" w:hAnsi="Aptos"/>
                 <w:b/>
-                <w:i w:val="0"/>
-                <w:color w:val="000000"/>
-                <w:sz w:val="22"/>
+                <w:color w:val="164334"/>
+                <w:sz w:val="17"/>
               </w:rPr>
               <w:t>Payment date</w:t>
             </w:r>
@@ -1841,33 +1329,25 @@
         </w:tc>
         <w:tc>
           <w:tcPr>
-            <w:tcW w:type="dxa" w:w="6660"/>
-            <w:tcMar>
-              <w:top w:w="80" w:type="dxa"/>
-              <w:bottom w:w="80" w:type="dxa"/>
-              <w:start w:w="120" w:type="dxa"/>
-              <w:end w:w="120" w:type="dxa"/>
-            </w:tcMar>
+            <w:tcW w:type="dxa" w:w="5285"/>
+            <w:vAlign w:val="center"/>
             <w:tcBorders>
-              <w:top w:val="single" w:sz="6" w:space="0" w:color="D6DDD5"/>
-              <w:left w:val="single" w:sz="6" w:space="0" w:color="D6DDD5"/>
-              <w:bottom w:val="single" w:sz="6" w:space="0" w:color="D6DDD5"/>
-              <w:right w:val="single" w:sz="6" w:space="0" w:color="D6DDD5"/>
+              <w:top w:val="single" w:sz="4" w:color="C9D6CC"/>
+              <w:left w:val="single" w:sz="4" w:color="C9D6CC"/>
+              <w:bottom w:val="single" w:sz="4" w:color="C9D6CC"/>
+              <w:right w:val="single" w:sz="4" w:color="C9D6CC"/>
             </w:tcBorders>
-            <w:vAlign w:val="center"/>
           </w:tcPr>
           <w:p>
             <w:pPr>
-              <w:spacing w:before="0" w:after="0" w:lineRule="auto" w:line="264"/>
-              <w:jc w:val="left"/>
+              <w:spacing w:after="0"/>
             </w:pPr>
+            <w:r/>
             <w:r>
               <w:rPr>
-                <w:rFonts w:ascii="Calibri" w:hAnsi="Calibri"/>
+                <w:rFonts w:ascii="Aptos" w:hAnsi="Aptos"/>
                 <w:b w:val="0"/>
-                <w:i w:val="0"/>
-                <w:color w:val="000000"/>
-                <w:sz w:val="22"/>
+                <w:sz w:val="17"/>
               </w:rPr>
               <w:t>[[PAYMENT_DATE]]</w:t>
             </w:r>
@@ -1875,37 +1355,29 @@
         </w:tc>
       </w:tr>
       <w:tr>
-        <w:trPr/>
         <w:tc>
           <w:tcPr>
-            <w:tcW w:type="dxa" w:w="2700"/>
-            <w:tcMar>
-              <w:top w:w="80" w:type="dxa"/>
-              <w:bottom w:w="80" w:type="dxa"/>
-              <w:start w:w="120" w:type="dxa"/>
-              <w:end w:w="120" w:type="dxa"/>
-            </w:tcMar>
+            <w:tcW w:type="dxa" w:w="5285"/>
+            <w:shd w:fill="EEF3EF"/>
+            <w:vAlign w:val="center"/>
             <w:tcBorders>
-              <w:top w:val="single" w:sz="6" w:space="0" w:color="D6DDD5"/>
-              <w:left w:val="single" w:sz="6" w:space="0" w:color="D6DDD5"/>
-              <w:bottom w:val="single" w:sz="6" w:space="0" w:color="D6DDD5"/>
-              <w:right w:val="single" w:sz="6" w:space="0" w:color="D6DDD5"/>
+              <w:top w:val="single" w:sz="4" w:color="C9D6CC"/>
+              <w:left w:val="single" w:sz="4" w:color="C9D6CC"/>
+              <w:bottom w:val="single" w:sz="4" w:color="C9D6CC"/>
+              <w:right w:val="single" w:sz="4" w:color="C9D6CC"/>
             </w:tcBorders>
-            <w:vAlign w:val="center"/>
-            <w:shd w:fill="F2F4F7" w:val="clear" w:color="auto"/>
           </w:tcPr>
           <w:p>
             <w:pPr>
-              <w:spacing w:before="0" w:after="0" w:lineRule="auto" w:line="264"/>
-              <w:jc w:val="left"/>
+              <w:spacing w:after="0"/>
             </w:pPr>
+            <w:r/>
             <w:r>
               <w:rPr>
-                <w:rFonts w:ascii="Calibri" w:hAnsi="Calibri"/>
+                <w:rFonts w:ascii="Aptos" w:hAnsi="Aptos"/>
                 <w:b/>
-                <w:i w:val="0"/>
-                <w:color w:val="000000"/>
-                <w:sz w:val="22"/>
+                <w:color w:val="164334"/>
+                <w:sz w:val="17"/>
               </w:rPr>
               <w:t>Payment method</w:t>
             </w:r>
@@ -1913,33 +1385,25 @@
         </w:tc>
         <w:tc>
           <w:tcPr>
-            <w:tcW w:type="dxa" w:w="6660"/>
-            <w:tcMar>
-              <w:top w:w="80" w:type="dxa"/>
-              <w:bottom w:w="80" w:type="dxa"/>
-              <w:start w:w="120" w:type="dxa"/>
-              <w:end w:w="120" w:type="dxa"/>
-            </w:tcMar>
+            <w:tcW w:type="dxa" w:w="5285"/>
+            <w:vAlign w:val="center"/>
             <w:tcBorders>
-              <w:top w:val="single" w:sz="6" w:space="0" w:color="D6DDD5"/>
-              <w:left w:val="single" w:sz="6" w:space="0" w:color="D6DDD5"/>
-              <w:bottom w:val="single" w:sz="6" w:space="0" w:color="D6DDD5"/>
-              <w:right w:val="single" w:sz="6" w:space="0" w:color="D6DDD5"/>
+              <w:top w:val="single" w:sz="4" w:color="C9D6CC"/>
+              <w:left w:val="single" w:sz="4" w:color="C9D6CC"/>
+              <w:bottom w:val="single" w:sz="4" w:color="C9D6CC"/>
+              <w:right w:val="single" w:sz="4" w:color="C9D6CC"/>
             </w:tcBorders>
-            <w:vAlign w:val="center"/>
           </w:tcPr>
           <w:p>
             <w:pPr>
-              <w:spacing w:before="0" w:after="0" w:lineRule="auto" w:line="264"/>
-              <w:jc w:val="left"/>
+              <w:spacing w:after="0"/>
             </w:pPr>
+            <w:r/>
             <w:r>
               <w:rPr>
-                <w:rFonts w:ascii="Calibri" w:hAnsi="Calibri"/>
+                <w:rFonts w:ascii="Aptos" w:hAnsi="Aptos"/>
                 <w:b w:val="0"/>
-                <w:i w:val="0"/>
-                <w:color w:val="000000"/>
-                <w:sz w:val="22"/>
+                <w:sz w:val="17"/>
               </w:rPr>
               <w:t>[[PAYMENT_METHOD]]</w:t>
             </w:r>
@@ -1947,37 +1411,29 @@
         </w:tc>
       </w:tr>
       <w:tr>
-        <w:trPr/>
         <w:tc>
           <w:tcPr>
-            <w:tcW w:type="dxa" w:w="2700"/>
-            <w:tcMar>
-              <w:top w:w="80" w:type="dxa"/>
-              <w:bottom w:w="80" w:type="dxa"/>
-              <w:start w:w="120" w:type="dxa"/>
-              <w:end w:w="120" w:type="dxa"/>
-            </w:tcMar>
+            <w:tcW w:type="dxa" w:w="5285"/>
+            <w:shd w:fill="EEF3EF"/>
+            <w:vAlign w:val="center"/>
             <w:tcBorders>
-              <w:top w:val="single" w:sz="6" w:space="0" w:color="D6DDD5"/>
-              <w:left w:val="single" w:sz="6" w:space="0" w:color="D6DDD5"/>
-              <w:bottom w:val="single" w:sz="6" w:space="0" w:color="D6DDD5"/>
-              <w:right w:val="single" w:sz="6" w:space="0" w:color="D6DDD5"/>
+              <w:top w:val="single" w:sz="4" w:color="C9D6CC"/>
+              <w:left w:val="single" w:sz="4" w:color="C9D6CC"/>
+              <w:bottom w:val="single" w:sz="4" w:color="C9D6CC"/>
+              <w:right w:val="single" w:sz="4" w:color="C9D6CC"/>
             </w:tcBorders>
-            <w:vAlign w:val="center"/>
-            <w:shd w:fill="F2F4F7" w:val="clear" w:color="auto"/>
           </w:tcPr>
           <w:p>
             <w:pPr>
-              <w:spacing w:before="0" w:after="0" w:lineRule="auto" w:line="264"/>
-              <w:jc w:val="left"/>
+              <w:spacing w:after="0"/>
             </w:pPr>
+            <w:r/>
             <w:r>
               <w:rPr>
-                <w:rFonts w:ascii="Calibri" w:hAnsi="Calibri"/>
+                <w:rFonts w:ascii="Aptos" w:hAnsi="Aptos"/>
                 <w:b/>
-                <w:i w:val="0"/>
-                <w:color w:val="000000"/>
-                <w:sz w:val="22"/>
+                <w:color w:val="164334"/>
+                <w:sz w:val="17"/>
               </w:rPr>
               <w:t>Reference / transaction ID</w:t>
             </w:r>
@@ -1985,33 +1441,25 @@
         </w:tc>
         <w:tc>
           <w:tcPr>
-            <w:tcW w:type="dxa" w:w="6660"/>
-            <w:tcMar>
-              <w:top w:w="80" w:type="dxa"/>
-              <w:bottom w:w="80" w:type="dxa"/>
-              <w:start w:w="120" w:type="dxa"/>
-              <w:end w:w="120" w:type="dxa"/>
-            </w:tcMar>
+            <w:tcW w:type="dxa" w:w="5285"/>
+            <w:vAlign w:val="center"/>
             <w:tcBorders>
-              <w:top w:val="single" w:sz="6" w:space="0" w:color="D6DDD5"/>
-              <w:left w:val="single" w:sz="6" w:space="0" w:color="D6DDD5"/>
-              <w:bottom w:val="single" w:sz="6" w:space="0" w:color="D6DDD5"/>
-              <w:right w:val="single" w:sz="6" w:space="0" w:color="D6DDD5"/>
+              <w:top w:val="single" w:sz="4" w:color="C9D6CC"/>
+              <w:left w:val="single" w:sz="4" w:color="C9D6CC"/>
+              <w:bottom w:val="single" w:sz="4" w:color="C9D6CC"/>
+              <w:right w:val="single" w:sz="4" w:color="C9D6CC"/>
             </w:tcBorders>
-            <w:vAlign w:val="center"/>
           </w:tcPr>
           <w:p>
             <w:pPr>
-              <w:spacing w:before="0" w:after="0" w:lineRule="auto" w:line="264"/>
-              <w:jc w:val="left"/>
+              <w:spacing w:after="0"/>
             </w:pPr>
+            <w:r/>
             <w:r>
               <w:rPr>
-                <w:rFonts w:ascii="Calibri" w:hAnsi="Calibri"/>
+                <w:rFonts w:ascii="Aptos" w:hAnsi="Aptos"/>
                 <w:b w:val="0"/>
-                <w:i w:val="0"/>
-                <w:color w:val="000000"/>
-                <w:sz w:val="22"/>
+                <w:sz w:val="17"/>
               </w:rPr>
               <w:t>[[PAYMENT_REFERENCE]]</w:t>
             </w:r>
@@ -2019,37 +1467,29 @@
         </w:tc>
       </w:tr>
       <w:tr>
-        <w:trPr/>
         <w:tc>
           <w:tcPr>
-            <w:tcW w:type="dxa" w:w="2700"/>
-            <w:tcMar>
-              <w:top w:w="80" w:type="dxa"/>
-              <w:bottom w:w="80" w:type="dxa"/>
-              <w:start w:w="120" w:type="dxa"/>
-              <w:end w:w="120" w:type="dxa"/>
-            </w:tcMar>
+            <w:tcW w:type="dxa" w:w="5285"/>
+            <w:shd w:fill="EEF3EF"/>
+            <w:vAlign w:val="center"/>
             <w:tcBorders>
-              <w:top w:val="single" w:sz="6" w:space="0" w:color="D6DDD5"/>
-              <w:left w:val="single" w:sz="6" w:space="0" w:color="D6DDD5"/>
-              <w:bottom w:val="single" w:sz="6" w:space="0" w:color="D6DDD5"/>
-              <w:right w:val="single" w:sz="6" w:space="0" w:color="D6DDD5"/>
+              <w:top w:val="single" w:sz="4" w:color="C9D6CC"/>
+              <w:left w:val="single" w:sz="4" w:color="C9D6CC"/>
+              <w:bottom w:val="single" w:sz="4" w:color="C9D6CC"/>
+              <w:right w:val="single" w:sz="4" w:color="C9D6CC"/>
             </w:tcBorders>
-            <w:vAlign w:val="center"/>
-            <w:shd w:fill="F2F4F7" w:val="clear" w:color="auto"/>
           </w:tcPr>
           <w:p>
             <w:pPr>
-              <w:spacing w:before="0" w:after="0" w:lineRule="auto" w:line="264"/>
-              <w:jc w:val="left"/>
+              <w:spacing w:after="0"/>
             </w:pPr>
+            <w:r/>
             <w:r>
               <w:rPr>
-                <w:rFonts w:ascii="Calibri" w:hAnsi="Calibri"/>
+                <w:rFonts w:ascii="Aptos" w:hAnsi="Aptos"/>
                 <w:b/>
-                <w:i w:val="0"/>
-                <w:color w:val="000000"/>
-                <w:sz w:val="22"/>
+                <w:color w:val="164334"/>
+                <w:sz w:val="17"/>
               </w:rPr>
               <w:t>Received by</w:t>
             </w:r>
@@ -2057,33 +1497,25 @@
         </w:tc>
         <w:tc>
           <w:tcPr>
-            <w:tcW w:type="dxa" w:w="6660"/>
-            <w:tcMar>
-              <w:top w:w="80" w:type="dxa"/>
-              <w:bottom w:w="80" w:type="dxa"/>
-              <w:start w:w="120" w:type="dxa"/>
-              <w:end w:w="120" w:type="dxa"/>
-            </w:tcMar>
+            <w:tcW w:type="dxa" w:w="5285"/>
+            <w:vAlign w:val="center"/>
             <w:tcBorders>
-              <w:top w:val="single" w:sz="6" w:space="0" w:color="D6DDD5"/>
-              <w:left w:val="single" w:sz="6" w:space="0" w:color="D6DDD5"/>
-              <w:bottom w:val="single" w:sz="6" w:space="0" w:color="D6DDD5"/>
-              <w:right w:val="single" w:sz="6" w:space="0" w:color="D6DDD5"/>
+              <w:top w:val="single" w:sz="4" w:color="C9D6CC"/>
+              <w:left w:val="single" w:sz="4" w:color="C9D6CC"/>
+              <w:bottom w:val="single" w:sz="4" w:color="C9D6CC"/>
+              <w:right w:val="single" w:sz="4" w:color="C9D6CC"/>
             </w:tcBorders>
-            <w:vAlign w:val="center"/>
           </w:tcPr>
           <w:p>
             <w:pPr>
-              <w:spacing w:before="0" w:after="0" w:lineRule="auto" w:line="264"/>
-              <w:jc w:val="left"/>
+              <w:spacing w:after="0"/>
             </w:pPr>
+            <w:r/>
             <w:r>
               <w:rPr>
-                <w:rFonts w:ascii="Calibri" w:hAnsi="Calibri"/>
+                <w:rFonts w:ascii="Aptos" w:hAnsi="Aptos"/>
                 <w:b w:val="0"/>
-                <w:i w:val="0"/>
-                <w:color w:val="000000"/>
-                <w:sz w:val="22"/>
+                <w:sz w:val="17"/>
               </w:rPr>
               <w:t>[[RECEIVED_BY]]</w:t>
             </w:r>
@@ -2091,37 +1523,29 @@
         </w:tc>
       </w:tr>
       <w:tr>
-        <w:trPr/>
         <w:tc>
           <w:tcPr>
-            <w:tcW w:type="dxa" w:w="2700"/>
-            <w:tcMar>
-              <w:top w:w="80" w:type="dxa"/>
-              <w:bottom w:w="80" w:type="dxa"/>
-              <w:start w:w="120" w:type="dxa"/>
-              <w:end w:w="120" w:type="dxa"/>
-            </w:tcMar>
+            <w:tcW w:type="dxa" w:w="5285"/>
+            <w:shd w:fill="EEF3EF"/>
+            <w:vAlign w:val="center"/>
             <w:tcBorders>
-              <w:top w:val="single" w:sz="6" w:space="0" w:color="D6DDD5"/>
-              <w:left w:val="single" w:sz="6" w:space="0" w:color="D6DDD5"/>
-              <w:bottom w:val="single" w:sz="6" w:space="0" w:color="D6DDD5"/>
-              <w:right w:val="single" w:sz="6" w:space="0" w:color="D6DDD5"/>
+              <w:top w:val="single" w:sz="4" w:color="C9D6CC"/>
+              <w:left w:val="single" w:sz="4" w:color="C9D6CC"/>
+              <w:bottom w:val="single" w:sz="4" w:color="C9D6CC"/>
+              <w:right w:val="single" w:sz="4" w:color="C9D6CC"/>
             </w:tcBorders>
-            <w:vAlign w:val="center"/>
-            <w:shd w:fill="F2F4F7" w:val="clear" w:color="auto"/>
           </w:tcPr>
           <w:p>
             <w:pPr>
-              <w:spacing w:before="0" w:after="0" w:lineRule="auto" w:line="264"/>
-              <w:jc w:val="left"/>
+              <w:spacing w:after="0"/>
             </w:pPr>
+            <w:r/>
             <w:r>
               <w:rPr>
-                <w:rFonts w:ascii="Calibri" w:hAnsi="Calibri"/>
+                <w:rFonts w:ascii="Aptos" w:hAnsi="Aptos"/>
                 <w:b/>
-                <w:i w:val="0"/>
-                <w:color w:val="000000"/>
-                <w:sz w:val="22"/>
+                <w:color w:val="164334"/>
+                <w:sz w:val="17"/>
               </w:rPr>
               <w:t>Agreement effective from</w:t>
             </w:r>
@@ -2129,33 +1553,25 @@
         </w:tc>
         <w:tc>
           <w:tcPr>
-            <w:tcW w:type="dxa" w:w="6660"/>
-            <w:tcMar>
-              <w:top w:w="80" w:type="dxa"/>
-              <w:bottom w:w="80" w:type="dxa"/>
-              <w:start w:w="120" w:type="dxa"/>
-              <w:end w:w="120" w:type="dxa"/>
-            </w:tcMar>
+            <w:tcW w:type="dxa" w:w="5285"/>
+            <w:vAlign w:val="center"/>
             <w:tcBorders>
-              <w:top w:val="single" w:sz="6" w:space="0" w:color="D6DDD5"/>
-              <w:left w:val="single" w:sz="6" w:space="0" w:color="D6DDD5"/>
-              <w:bottom w:val="single" w:sz="6" w:space="0" w:color="D6DDD5"/>
-              <w:right w:val="single" w:sz="6" w:space="0" w:color="D6DDD5"/>
+              <w:top w:val="single" w:sz="4" w:color="C9D6CC"/>
+              <w:left w:val="single" w:sz="4" w:color="C9D6CC"/>
+              <w:bottom w:val="single" w:sz="4" w:color="C9D6CC"/>
+              <w:right w:val="single" w:sz="4" w:color="C9D6CC"/>
             </w:tcBorders>
-            <w:vAlign w:val="center"/>
           </w:tcPr>
           <w:p>
             <w:pPr>
-              <w:spacing w:before="0" w:after="0" w:lineRule="auto" w:line="264"/>
-              <w:jc w:val="left"/>
+              <w:spacing w:after="0"/>
             </w:pPr>
+            <w:r/>
             <w:r>
               <w:rPr>
-                <w:rFonts w:ascii="Calibri" w:hAnsi="Calibri"/>
+                <w:rFonts w:ascii="Aptos" w:hAnsi="Aptos"/>
                 <w:b w:val="0"/>
-                <w:i w:val="0"/>
-                <w:color w:val="000000"/>
-                <w:sz w:val="22"/>
+                <w:sz w:val="17"/>
               </w:rPr>
               <w:t>[[AGREEMENT_EFFECTIVE_FROM]]</w:t>
             </w:r>
@@ -2165,333 +1581,472 @@
     </w:tbl>
     <w:p>
       <w:pPr>
-        <w:pStyle w:val="Heading1"/>
+        <w:keepNext/>
+        <w:keepLines/>
+        <w:spacing w:before="160" w:after="60"/>
       </w:pPr>
       <w:r>
-        <w:t>10. Signatures</w:t>
+        <w:rPr>
+          <w:rFonts w:ascii="Aptos Display" w:hAnsi="Aptos Display"/>
+          <w:b/>
+          <w:color w:val="164334"/>
+          <w:sz w:val="22"/>
+        </w:rPr>
+        <w:t>13. Signatures</w:t>
       </w:r>
     </w:p>
     <w:p>
       <w:pPr>
-        <w:spacing w:before="0" w:after="160" w:lineRule="auto" w:line="264"/>
-        <w:jc w:val="left"/>
+        <w:spacing w:after="80" w:line="254" w:lineRule="auto"/>
       </w:pPr>
       <w:r>
         <w:rPr>
-          <w:rFonts w:ascii="Calibri" w:hAnsi="Calibri"/>
-          <w:b w:val="0"/>
-          <w:i w:val="0"/>
-          <w:color w:val="000000"/>
-          <w:sz w:val="22"/>
+          <w:rFonts w:ascii="Aptos" w:hAnsi="Aptos"/>
+          <w:color w:val="1C2722"/>
+          <w:sz w:val="17"/>
         </w:rPr>
-        <w:t>IN WITNESS WHEREOF, the parties hereto have executed this Tenancy Agreement on the date written against their signatures below.</w:t>
+        <w:t>Signed by the parties on the dates below. Each party should retain a complete signed copy of this agreement and its schedules.</w:t>
       </w:r>
     </w:p>
     <w:tbl>
       <w:tblPr>
-        <w:tblW w:type="dxa" w:w="9360"/>
-        <w:jc w:val="left"/>
-        <w:tblLayout w:type="fixed"/>
+        <w:tblW w:type="auto" w:w="0"/>
         <w:tblLook w:firstColumn="1" w:firstRow="1" w:lastColumn="0" w:lastRow="0" w:noHBand="0" w:noVBand="1" w:val="04A0"/>
-        <w:tblInd w:type="dxa" w:w="120"/>
       </w:tblPr>
       <w:tblGrid>
-        <w:gridCol w:w="4680"/>
-        <w:gridCol w:w="4680"/>
+        <w:gridCol w:w="5285"/>
+        <w:gridCol w:w="5285"/>
       </w:tblGrid>
       <w:tr>
-        <w:trPr/>
         <w:tc>
           <w:tcPr>
-            <w:tcW w:type="dxa" w:w="4680"/>
-            <w:tcMar>
-              <w:top w:w="80" w:type="dxa"/>
-              <w:bottom w:w="80" w:type="dxa"/>
-              <w:start w:w="120" w:type="dxa"/>
-              <w:end w:w="120" w:type="dxa"/>
-            </w:tcMar>
+            <w:tcW w:type="dxa" w:w="5285"/>
             <w:vAlign w:val="center"/>
             <w:tcBorders>
-              <w:top w:val="nil"/>
-              <w:left w:val="nil"/>
-              <w:bottom w:val="nil"/>
-              <w:right w:val="nil"/>
+              <w:top w:val="single" w:sz="4" w:color="C9D6CC"/>
+              <w:left w:val="single" w:sz="4" w:color="C9D6CC"/>
+              <w:bottom w:val="single" w:sz="4" w:color="C9D6CC"/>
+              <w:right w:val="single" w:sz="4" w:color="C9D6CC"/>
             </w:tcBorders>
           </w:tcPr>
           <w:p>
             <w:pPr>
-              <w:spacing w:before="0" w:after="0" w:lineRule="auto" w:line="264"/>
-              <w:jc w:val="left"/>
+              <w:spacing w:after="0"/>
             </w:pPr>
+            <w:r/>
             <w:r>
               <w:rPr>
-                <w:rFonts w:ascii="Calibri" w:hAnsi="Calibri"/>
-                <w:b w:val="0"/>
-                <w:i w:val="0"/>
-                <w:color w:val="000000"/>
-                <w:sz w:val="22"/>
+                <w:rFonts w:ascii="Aptos" w:hAnsi="Aptos"/>
+                <w:b/>
+                <w:color w:val="164334"/>
+                <w:sz w:val="17"/>
               </w:rPr>
-              <w:t>Landlord Signature</w:t>
+              <w:t>Landlord / Manager</w:t>
             </w:r>
           </w:p>
         </w:tc>
         <w:tc>
           <w:tcPr>
-            <w:tcW w:type="dxa" w:w="4680"/>
-            <w:tcMar>
-              <w:top w:w="80" w:type="dxa"/>
-              <w:bottom w:w="80" w:type="dxa"/>
-              <w:start w:w="120" w:type="dxa"/>
-              <w:end w:w="120" w:type="dxa"/>
-            </w:tcMar>
+            <w:tcW w:type="dxa" w:w="5285"/>
             <w:vAlign w:val="center"/>
             <w:tcBorders>
-              <w:top w:val="nil"/>
-              <w:left w:val="nil"/>
-              <w:bottom w:val="nil"/>
-              <w:right w:val="nil"/>
+              <w:top w:val="single" w:sz="4" w:color="C9D6CC"/>
+              <w:left w:val="single" w:sz="4" w:color="C9D6CC"/>
+              <w:bottom w:val="single" w:sz="4" w:color="C9D6CC"/>
+              <w:right w:val="single" w:sz="4" w:color="C9D6CC"/>
             </w:tcBorders>
           </w:tcPr>
           <w:p>
             <w:pPr>
-              <w:spacing w:before="0" w:after="0" w:lineRule="auto" w:line="264"/>
-              <w:jc w:val="left"/>
+              <w:spacing w:after="0"/>
             </w:pPr>
+            <w:r/>
             <w:r>
               <w:rPr>
-                <w:rFonts w:ascii="Calibri" w:hAnsi="Calibri"/>
-                <w:b w:val="0"/>
-                <w:i w:val="0"/>
-                <w:color w:val="000000"/>
-                <w:sz w:val="22"/>
+                <w:rFonts w:ascii="Aptos" w:hAnsi="Aptos"/>
+                <w:b/>
+                <w:color w:val="164334"/>
+                <w:sz w:val="17"/>
               </w:rPr>
-              <w:t>Tenant Signature</w:t>
+              <w:t>Tenant</w:t>
             </w:r>
           </w:p>
         </w:tc>
       </w:tr>
       <w:tr>
-        <w:trPr/>
         <w:tc>
           <w:tcPr>
-            <w:tcW w:type="dxa" w:w="4680"/>
-            <w:tcMar>
-              <w:top w:w="80" w:type="dxa"/>
-              <w:bottom w:w="80" w:type="dxa"/>
-              <w:start w:w="120" w:type="dxa"/>
-              <w:end w:w="120" w:type="dxa"/>
-            </w:tcMar>
+            <w:tcW w:type="dxa" w:w="5285"/>
             <w:vAlign w:val="center"/>
             <w:tcBorders>
-              <w:top w:val="nil"/>
-              <w:left w:val="nil"/>
-              <w:bottom w:val="nil"/>
-              <w:right w:val="nil"/>
+              <w:top w:val="single" w:sz="4" w:color="C9D6CC"/>
+              <w:left w:val="single" w:sz="4" w:color="C9D6CC"/>
+              <w:bottom w:val="single" w:sz="4" w:color="C9D6CC"/>
+              <w:right w:val="single" w:sz="4" w:color="C9D6CC"/>
             </w:tcBorders>
           </w:tcPr>
           <w:p>
             <w:pPr>
-              <w:spacing w:before="0" w:after="0" w:lineRule="auto" w:line="264"/>
-              <w:jc w:val="left"/>
+              <w:spacing w:after="0"/>
             </w:pPr>
+            <w:r/>
             <w:r>
               <w:rPr>
-                <w:rFonts w:ascii="Calibri" w:hAnsi="Calibri"/>
+                <w:rFonts w:ascii="Aptos" w:hAnsi="Aptos"/>
                 <w:b w:val="0"/>
-                <w:i w:val="0"/>
-                <w:color w:val="000000"/>
-                <w:sz w:val="22"/>
+                <w:sz w:val="17"/>
               </w:rPr>
-              <w:t>_______________________________</w:t>
+              <w:t>Signature: ____________________________________</w:t>
             </w:r>
           </w:p>
         </w:tc>
         <w:tc>
           <w:tcPr>
-            <w:tcW w:type="dxa" w:w="4680"/>
-            <w:tcMar>
-              <w:top w:w="80" w:type="dxa"/>
-              <w:bottom w:w="80" w:type="dxa"/>
-              <w:start w:w="120" w:type="dxa"/>
-              <w:end w:w="120" w:type="dxa"/>
-            </w:tcMar>
+            <w:tcW w:type="dxa" w:w="5285"/>
             <w:vAlign w:val="center"/>
             <w:tcBorders>
-              <w:top w:val="nil"/>
-              <w:left w:val="nil"/>
-              <w:bottom w:val="nil"/>
-              <w:right w:val="nil"/>
+              <w:top w:val="single" w:sz="4" w:color="C9D6CC"/>
+              <w:left w:val="single" w:sz="4" w:color="C9D6CC"/>
+              <w:bottom w:val="single" w:sz="4" w:color="C9D6CC"/>
+              <w:right w:val="single" w:sz="4" w:color="C9D6CC"/>
             </w:tcBorders>
           </w:tcPr>
           <w:p>
             <w:pPr>
-              <w:spacing w:before="0" w:after="0" w:lineRule="auto" w:line="264"/>
-              <w:jc w:val="left"/>
+              <w:spacing w:after="0"/>
             </w:pPr>
+            <w:r/>
             <w:r>
               <w:rPr>
-                <w:rFonts w:ascii="Calibri" w:hAnsi="Calibri"/>
+                <w:rFonts w:ascii="Aptos" w:hAnsi="Aptos"/>
                 <w:b w:val="0"/>
-                <w:i w:val="0"/>
-                <w:color w:val="000000"/>
-                <w:sz w:val="22"/>
+                <w:sz w:val="17"/>
               </w:rPr>
-              <w:t>_______________________________</w:t>
+              <w:t>Signature: ____________________________________</w:t>
             </w:r>
           </w:p>
         </w:tc>
       </w:tr>
       <w:tr>
-        <w:trPr/>
         <w:tc>
           <w:tcPr>
-            <w:tcW w:type="dxa" w:w="4680"/>
-            <w:tcMar>
-              <w:top w:w="80" w:type="dxa"/>
-              <w:bottom w:w="80" w:type="dxa"/>
-              <w:start w:w="120" w:type="dxa"/>
-              <w:end w:w="120" w:type="dxa"/>
-            </w:tcMar>
+            <w:tcW w:type="dxa" w:w="5285"/>
             <w:vAlign w:val="center"/>
             <w:tcBorders>
-              <w:top w:val="nil"/>
-              <w:left w:val="nil"/>
-              <w:bottom w:val="nil"/>
-              <w:right w:val="nil"/>
+              <w:top w:val="single" w:sz="4" w:color="C9D6CC"/>
+              <w:left w:val="single" w:sz="4" w:color="C9D6CC"/>
+              <w:bottom w:val="single" w:sz="4" w:color="C9D6CC"/>
+              <w:right w:val="single" w:sz="4" w:color="C9D6CC"/>
             </w:tcBorders>
           </w:tcPr>
           <w:p>
             <w:pPr>
-              <w:spacing w:before="0" w:after="0" w:lineRule="auto" w:line="264"/>
-              <w:jc w:val="left"/>
+              <w:spacing w:after="0"/>
             </w:pPr>
+            <w:r/>
             <w:r>
               <w:rPr>
-                <w:rFonts w:ascii="Calibri" w:hAnsi="Calibri"/>
+                <w:rFonts w:ascii="Aptos" w:hAnsi="Aptos"/>
                 <w:b w:val="0"/>
-                <w:i w:val="0"/>
-                <w:color w:val="000000"/>
-                <w:sz w:val="22"/>
+                <w:sz w:val="17"/>
               </w:rPr>
-              <w:t>Philip Boakye</w:t>
+              <w:t>Name: Philip Boakye</w:t>
+              <w:br/>
+              <w:t>Date: ________________________________________</w:t>
             </w:r>
           </w:p>
         </w:tc>
         <w:tc>
           <w:tcPr>
-            <w:tcW w:type="dxa" w:w="4680"/>
-            <w:tcMar>
-              <w:top w:w="80" w:type="dxa"/>
-              <w:bottom w:w="80" w:type="dxa"/>
-              <w:start w:w="120" w:type="dxa"/>
-              <w:end w:w="120" w:type="dxa"/>
-            </w:tcMar>
+            <w:tcW w:type="dxa" w:w="5285"/>
             <w:vAlign w:val="center"/>
             <w:tcBorders>
-              <w:top w:val="nil"/>
-              <w:left w:val="nil"/>
-              <w:bottom w:val="nil"/>
-              <w:right w:val="nil"/>
+              <w:top w:val="single" w:sz="4" w:color="C9D6CC"/>
+              <w:left w:val="single" w:sz="4" w:color="C9D6CC"/>
+              <w:bottom w:val="single" w:sz="4" w:color="C9D6CC"/>
+              <w:right w:val="single" w:sz="4" w:color="C9D6CC"/>
             </w:tcBorders>
           </w:tcPr>
           <w:p>
             <w:pPr>
-              <w:spacing w:before="0" w:after="0" w:lineRule="auto" w:line="264"/>
-              <w:jc w:val="left"/>
+              <w:spacing w:after="0"/>
             </w:pPr>
+            <w:r/>
             <w:r>
               <w:rPr>
-                <w:rFonts w:ascii="Calibri" w:hAnsi="Calibri"/>
+                <w:rFonts w:ascii="Aptos" w:hAnsi="Aptos"/>
                 <w:b w:val="0"/>
-                <w:i w:val="0"/>
-                <w:color w:val="000000"/>
-                <w:sz w:val="22"/>
+                <w:sz w:val="17"/>
               </w:rPr>
-              <w:t>[[TENANT_NAME]]</w:t>
+              <w:t>Name: [[TENANT_NAME]]</w:t>
+              <w:br/>
+              <w:t>Date: ________________________________________</w:t>
+            </w:r>
+          </w:p>
+        </w:tc>
+      </w:tr>
+    </w:tbl>
+    <w:p>
+      <w:pPr>
+        <w:keepNext/>
+        <w:keepLines/>
+        <w:spacing w:before="160" w:after="60"/>
+      </w:pPr>
+      <w:r>
+        <w:rPr>
+          <w:rFonts w:ascii="Aptos Display" w:hAnsi="Aptos Display"/>
+          <w:b/>
+          <w:color w:val="164334"/>
+          <w:sz w:val="22"/>
+        </w:rPr>
+        <w:t>14. Witnesses</w:t>
+      </w:r>
+    </w:p>
+    <w:tbl>
+      <w:tblPr>
+        <w:tblW w:type="auto" w:w="0"/>
+        <w:tblLook w:firstColumn="1" w:firstRow="1" w:lastColumn="0" w:lastRow="0" w:noHBand="0" w:noVBand="1" w:val="04A0"/>
+      </w:tblPr>
+      <w:tblGrid>
+        <w:gridCol w:w="5285"/>
+        <w:gridCol w:w="5285"/>
+      </w:tblGrid>
+      <w:tr>
+        <w:tc>
+          <w:tcPr>
+            <w:tcW w:type="dxa" w:w="5285"/>
+            <w:vAlign w:val="center"/>
+            <w:tcBorders>
+              <w:top w:val="single" w:sz="4" w:color="C9D6CC"/>
+              <w:left w:val="single" w:sz="4" w:color="C9D6CC"/>
+              <w:bottom w:val="single" w:sz="4" w:color="C9D6CC"/>
+              <w:right w:val="single" w:sz="4" w:color="C9D6CC"/>
+            </w:tcBorders>
+          </w:tcPr>
+          <w:p>
+            <w:pPr>
+              <w:spacing w:after="0"/>
+            </w:pPr>
+            <w:r/>
+            <w:r>
+              <w:rPr>
+                <w:rFonts w:ascii="Aptos" w:hAnsi="Aptos"/>
+                <w:b/>
+                <w:color w:val="164334"/>
+                <w:sz w:val="17"/>
+              </w:rPr>
+              <w:t>Witness for Landlord / Manager</w:t>
+            </w:r>
+          </w:p>
+        </w:tc>
+        <w:tc>
+          <w:tcPr>
+            <w:tcW w:type="dxa" w:w="5285"/>
+            <w:vAlign w:val="center"/>
+            <w:tcBorders>
+              <w:top w:val="single" w:sz="4" w:color="C9D6CC"/>
+              <w:left w:val="single" w:sz="4" w:color="C9D6CC"/>
+              <w:bottom w:val="single" w:sz="4" w:color="C9D6CC"/>
+              <w:right w:val="single" w:sz="4" w:color="C9D6CC"/>
+            </w:tcBorders>
+          </w:tcPr>
+          <w:p>
+            <w:pPr>
+              <w:spacing w:after="0"/>
+            </w:pPr>
+            <w:r/>
+            <w:r>
+              <w:rPr>
+                <w:rFonts w:ascii="Aptos" w:hAnsi="Aptos"/>
+                <w:b/>
+                <w:color w:val="164334"/>
+                <w:sz w:val="17"/>
+              </w:rPr>
+              <w:t>Witness for Tenant</w:t>
             </w:r>
           </w:p>
         </w:tc>
       </w:tr>
       <w:tr>
-        <w:trPr/>
         <w:tc>
           <w:tcPr>
-            <w:tcW w:type="dxa" w:w="4680"/>
-            <w:tcMar>
-              <w:top w:w="80" w:type="dxa"/>
-              <w:bottom w:w="80" w:type="dxa"/>
-              <w:start w:w="120" w:type="dxa"/>
-              <w:end w:w="120" w:type="dxa"/>
-            </w:tcMar>
+            <w:tcW w:type="dxa" w:w="5285"/>
             <w:vAlign w:val="center"/>
             <w:tcBorders>
-              <w:top w:val="nil"/>
-              <w:left w:val="nil"/>
-              <w:bottom w:val="nil"/>
-              <w:right w:val="nil"/>
+              <w:top w:val="single" w:sz="4" w:color="C9D6CC"/>
+              <w:left w:val="single" w:sz="4" w:color="C9D6CC"/>
+              <w:bottom w:val="single" w:sz="4" w:color="C9D6CC"/>
+              <w:right w:val="single" w:sz="4" w:color="C9D6CC"/>
             </w:tcBorders>
           </w:tcPr>
           <w:p>
             <w:pPr>
-              <w:spacing w:before="0" w:after="0" w:lineRule="auto" w:line="264"/>
-              <w:jc w:val="left"/>
+              <w:spacing w:after="0"/>
             </w:pPr>
+            <w:r/>
             <w:r>
               <w:rPr>
-                <w:rFonts w:ascii="Calibri" w:hAnsi="Calibri"/>
+                <w:rFonts w:ascii="Aptos" w:hAnsi="Aptos"/>
                 <w:b w:val="0"/>
-                <w:i w:val="0"/>
-                <w:color w:val="000000"/>
-                <w:sz w:val="22"/>
+                <w:sz w:val="17"/>
               </w:rPr>
-              <w:t>Date: _________________________</w:t>
+              <w:t>Name: ________________________________________</w:t>
+              <w:br/>
+              <w:t>Address / Phone: ______________________________</w:t>
             </w:r>
           </w:p>
         </w:tc>
         <w:tc>
           <w:tcPr>
-            <w:tcW w:type="dxa" w:w="4680"/>
-            <w:tcMar>
-              <w:top w:w="80" w:type="dxa"/>
-              <w:bottom w:w="80" w:type="dxa"/>
-              <w:start w:w="120" w:type="dxa"/>
-              <w:end w:w="120" w:type="dxa"/>
-            </w:tcMar>
+            <w:tcW w:type="dxa" w:w="5285"/>
             <w:vAlign w:val="center"/>
             <w:tcBorders>
-              <w:top w:val="nil"/>
-              <w:left w:val="nil"/>
-              <w:bottom w:val="nil"/>
-              <w:right w:val="nil"/>
+              <w:top w:val="single" w:sz="4" w:color="C9D6CC"/>
+              <w:left w:val="single" w:sz="4" w:color="C9D6CC"/>
+              <w:bottom w:val="single" w:sz="4" w:color="C9D6CC"/>
+              <w:right w:val="single" w:sz="4" w:color="C9D6CC"/>
             </w:tcBorders>
           </w:tcPr>
           <w:p>
             <w:pPr>
-              <w:spacing w:before="0" w:after="0" w:lineRule="auto" w:line="264"/>
-              <w:jc w:val="left"/>
+              <w:spacing w:after="0"/>
             </w:pPr>
+            <w:r/>
             <w:r>
               <w:rPr>
-                <w:rFonts w:ascii="Calibri" w:hAnsi="Calibri"/>
+                <w:rFonts w:ascii="Aptos" w:hAnsi="Aptos"/>
                 <w:b w:val="0"/>
-                <w:i w:val="0"/>
-                <w:color w:val="000000"/>
-                <w:sz w:val="22"/>
+                <w:sz w:val="17"/>
               </w:rPr>
-              <w:t>Date: _________________________</w:t>
+              <w:t>Name: ________________________________________</w:t>
+              <w:br/>
+              <w:t>Address / Phone: ______________________________</w:t>
+            </w:r>
+          </w:p>
+        </w:tc>
+      </w:tr>
+      <w:tr>
+        <w:tc>
+          <w:tcPr>
+            <w:tcW w:type="dxa" w:w="5285"/>
+            <w:vAlign w:val="center"/>
+            <w:tcBorders>
+              <w:top w:val="single" w:sz="4" w:color="C9D6CC"/>
+              <w:left w:val="single" w:sz="4" w:color="C9D6CC"/>
+              <w:bottom w:val="single" w:sz="4" w:color="C9D6CC"/>
+              <w:right w:val="single" w:sz="4" w:color="C9D6CC"/>
+            </w:tcBorders>
+          </w:tcPr>
+          <w:p>
+            <w:pPr>
+              <w:spacing w:after="0"/>
+            </w:pPr>
+            <w:r/>
+            <w:r>
+              <w:rPr>
+                <w:rFonts w:ascii="Aptos" w:hAnsi="Aptos"/>
+                <w:b w:val="0"/>
+                <w:sz w:val="17"/>
+              </w:rPr>
+              <w:t>Signature: ____________________________________</w:t>
+              <w:br/>
+              <w:t>Date: _________________________________________</w:t>
+            </w:r>
+          </w:p>
+        </w:tc>
+        <w:tc>
+          <w:tcPr>
+            <w:tcW w:type="dxa" w:w="5285"/>
+            <w:vAlign w:val="center"/>
+            <w:tcBorders>
+              <w:top w:val="single" w:sz="4" w:color="C9D6CC"/>
+              <w:left w:val="single" w:sz="4" w:color="C9D6CC"/>
+              <w:bottom w:val="single" w:sz="4" w:color="C9D6CC"/>
+              <w:right w:val="single" w:sz="4" w:color="C9D6CC"/>
+            </w:tcBorders>
+          </w:tcPr>
+          <w:p>
+            <w:pPr>
+              <w:spacing w:after="0"/>
+            </w:pPr>
+            <w:r/>
+            <w:r>
+              <w:rPr>
+                <w:rFonts w:ascii="Aptos" w:hAnsi="Aptos"/>
+                <w:b w:val="0"/>
+                <w:sz w:val="17"/>
+              </w:rPr>
+              <w:t>Signature: ____________________________________</w:t>
+              <w:br/>
+              <w:t>Date: _________________________________________</w:t>
             </w:r>
           </w:p>
         </w:tc>
       </w:tr>
     </w:tbl>
+    <w:p>
+      <w:pPr>
+        <w:spacing w:before="120" w:after="0"/>
+      </w:pPr>
+      <w:r>
+        <w:rPr>
+          <w:rFonts w:ascii="Aptos" w:hAnsi="Aptos"/>
+          <w:i/>
+          <w:color w:val="53605A"/>
+          <w:sz w:val="15"/>
+        </w:rPr>
+        <w:t>Practical legal review note: This OneRoot template is a starting point for a particular property and transaction. Obtain Rent Control Department or qualified Ghanaian legal review before signing.</w:t>
+      </w:r>
+    </w:p>
     <w:sectPr>
+      <w:headerReference w:type="default" r:id="rId9"/>
+      <w:footerReference w:type="default" r:id="rId10"/>
       <w:pgSz w:w="12240" w:h="15840"/>
-      <w:pgMar w:top="1440" w:right="1440" w:bottom="1440" w:left="1440" w:header="708" w:footer="708" w:gutter="0"/>
+      <w:pgMar w:top="648" w:right="835" w:bottom="749" w:left="835" w:header="720" w:footer="720" w:gutter="0"/>
       <w:cols w:space="720"/>
       <w:docGrid w:linePitch="360"/>
     </w:sectPr>
   </w:body>
 </w:document>
+</file>
+
+<file path=word/footer1.xml><?xml version="1.0" encoding="utf-8"?>
+<w:ftr xmlns:m="http://schemas.openxmlformats.org/officeDocument/2006/math" xmlns:mc="http://schemas.openxmlformats.org/markup-compatibility/2006" xmlns:mo="http://schemas.microsoft.com/office/mac/office/2008/main" xmlns:mv="urn:schemas-microsoft-com:mac:vml" xmlns:o="urn:schemas-microsoft-com:office:office" xmlns:r="http://schemas.openxmlformats.org/officeDocument/2006/relationships" xmlns:v="urn:schemas-microsoft-com:vml" xmlns:w10="urn:schemas-microsoft-com:office:word" xmlns:w14="http://schemas.microsoft.com/office/word/2010/wordml" xmlns:w="http://schemas.openxmlformats.org/wordprocessingml/2006/main" xmlns:wne="http://schemas.microsoft.com/office/word/2006/wordml" xmlns:wp14="http://schemas.microsoft.com/office/word/2010/wordprocessingDrawing" xmlns:wp="http://schemas.openxmlformats.org/drawingml/2006/wordprocessingDrawing" xmlns:wpc="http://schemas.microsoft.com/office/word/2010/wordprocessingCanvas" xmlns:wpg="http://schemas.microsoft.com/office/word/2010/wordprocessingGroup" xmlns:wpi="http://schemas.microsoft.com/office/word/2010/wordprocessingInk" xmlns:wps="http://schemas.microsoft.com/office/word/2010/wordprocessingShape" mc:Ignorable="w14 wp14">
+  <w:p>
+    <w:pPr>
+      <w:pStyle w:val="Footer"/>
+      <w:jc w:val="center"/>
+    </w:pPr>
+    <w:r>
+      <w:rPr>
+        <w:rFonts w:ascii="Aptos" w:hAnsi="Aptos"/>
+        <w:color w:val="53605A"/>
+        <w:sz w:val="15"/>
+      </w:rPr>
+      <w:t>OneRoot Tenancy Agreement | Keep a signed copy with the payment schedule and condition inventory.</w:t>
+    </w:r>
+  </w:p>
+</w:ftr>
+</file>
+
+<file path=word/header1.xml><?xml version="1.0" encoding="utf-8"?>
+<w:hdr xmlns:m="http://schemas.openxmlformats.org/officeDocument/2006/math" xmlns:mc="http://schemas.openxmlformats.org/markup-compatibility/2006" xmlns:mo="http://schemas.microsoft.com/office/mac/office/2008/main" xmlns:mv="urn:schemas-microsoft-com:mac:vml" xmlns:o="urn:schemas-microsoft-com:office:office" xmlns:r="http://schemas.openxmlformats.org/officeDocument/2006/relationships" xmlns:v="urn:schemas-microsoft-com:vml" xmlns:w10="urn:schemas-microsoft-com:office:word" xmlns:w14="http://schemas.microsoft.com/office/word/2010/wordml" xmlns:w="http://schemas.openxmlformats.org/wordprocessingml/2006/main" xmlns:wne="http://schemas.microsoft.com/office/word/2006/wordml" xmlns:wp14="http://schemas.microsoft.com/office/word/2010/wordprocessingDrawing" xmlns:wp="http://schemas.openxmlformats.org/drawingml/2006/wordprocessingDrawing" xmlns:wpc="http://schemas.microsoft.com/office/word/2010/wordprocessingCanvas" xmlns:wpg="http://schemas.microsoft.com/office/word/2010/wordprocessingGroup" xmlns:wpi="http://schemas.microsoft.com/office/word/2010/wordprocessingInk" xmlns:wps="http://schemas.microsoft.com/office/word/2010/wordprocessingShape" mc:Ignorable="w14 wp14">
+  <w:p>
+    <w:pPr>
+      <w:pStyle w:val="Header"/>
+      <w:jc w:val="center"/>
+    </w:pPr>
+    <w:r>
+      <w:rPr>
+        <w:rFonts w:ascii="Aptos" w:hAnsi="Aptos"/>
+        <w:b/>
+        <w:color w:val="164334"/>
+        <w:sz w:val="16"/>
+      </w:rPr>
+      <w:t>ONEROOT ESSENTIALS | RENTALS &amp; APARTMENTS</w:t>
+    </w:r>
+  </w:p>
+</w:hdr>
 </file>
 
 <file path=word/numbering.xml><?xml version="1.0" encoding="utf-8"?>
@@ -2858,12 +2413,11 @@
     <w:qFormat/>
     <w:rsid w:val="00FC693F"/>
     <w:pPr>
-      <w:spacing w:before="0" w:after="120" w:lineRule="auto" w:line="264"/>
+      <w:spacing w:after="60"/>
     </w:pPr>
     <w:rPr>
-      <w:rFonts w:ascii="Calibri" w:hAnsi="Calibri"/>
-      <w:color w:val="000000"/>
-      <w:sz w:val="22"/>
+      <w:rFonts w:ascii="Aptos" w:hAnsi="Aptos"/>
+      <w:sz w:val="17"/>
     </w:rPr>
   </w:style>
   <w:style w:type="paragraph" w:styleId="Header">
@@ -2921,15 +2475,15 @@
     <w:pPr>
       <w:keepNext/>
       <w:keepLines/>
-      <w:spacing w:before="320" w:after="160" w:lineRule="auto" w:line="264"/>
+      <w:spacing w:before="480" w:after="0"/>
       <w:outlineLvl w:val="0"/>
     </w:pPr>
     <w:rPr>
-      <w:rFonts w:asciiTheme="majorHAnsi" w:eastAsiaTheme="majorEastAsia" w:hAnsiTheme="majorHAnsi" w:cstheme="majorBidi" w:ascii="Calibri" w:hAnsi="Calibri"/>
+      <w:rFonts w:asciiTheme="majorHAnsi" w:eastAsiaTheme="majorEastAsia" w:hAnsiTheme="majorHAnsi" w:cstheme="majorBidi"/>
       <w:b/>
       <w:bCs/>
-      <w:color w:val="2E74B5"/>
-      <w:sz w:val="32"/>
+      <w:color w:val="365F91" w:themeColor="accent1" w:themeShade="BF"/>
+      <w:sz w:val="28"/>
       <w:szCs w:val="28"/>
     </w:rPr>
   </w:style>
@@ -2945,14 +2499,14 @@
     <w:pPr>
       <w:keepNext/>
       <w:keepLines/>
-      <w:spacing w:before="240" w:after="120" w:lineRule="auto" w:line="264"/>
+      <w:spacing w:before="200" w:after="0"/>
       <w:outlineLvl w:val="1"/>
     </w:pPr>
     <w:rPr>
-      <w:rFonts w:asciiTheme="majorHAnsi" w:eastAsiaTheme="majorEastAsia" w:hAnsiTheme="majorHAnsi" w:cstheme="majorBidi" w:ascii="Calibri" w:hAnsi="Calibri"/>
+      <w:rFonts w:asciiTheme="majorHAnsi" w:eastAsiaTheme="majorEastAsia" w:hAnsiTheme="majorHAnsi" w:cstheme="majorBidi"/>
       <w:b/>
       <w:bCs/>
-      <w:color w:val="2E74B5"/>
+      <w:color w:val="4F81BD" w:themeColor="accent1"/>
       <w:sz w:val="26"/>
       <w:szCs w:val="26"/>
     </w:rPr>
@@ -2969,15 +2523,14 @@
     <w:pPr>
       <w:keepNext/>
       <w:keepLines/>
-      <w:spacing w:before="160" w:after="80" w:lineRule="auto" w:line="264"/>
+      <w:spacing w:before="200" w:after="0"/>
       <w:outlineLvl w:val="2"/>
     </w:pPr>
     <w:rPr>
-      <w:rFonts w:asciiTheme="majorHAnsi" w:eastAsiaTheme="majorEastAsia" w:hAnsiTheme="majorHAnsi" w:cstheme="majorBidi" w:ascii="Calibri" w:hAnsi="Calibri"/>
+      <w:rFonts w:asciiTheme="majorHAnsi" w:eastAsiaTheme="majorEastAsia" w:hAnsiTheme="majorHAnsi" w:cstheme="majorBidi"/>
       <w:b/>
       <w:bCs/>
-      <w:color w:val="1F4D78"/>
-      <w:sz w:val="24"/>
+      <w:color w:val="4F81BD" w:themeColor="accent1"/>
     </w:rPr>
   </w:style>
   <w:style w:type="paragraph" w:styleId="Heading4">

</xml_diff>

<commit_message>
Remove tenancy agreement drafting disclaimer
</commit_message>
<xml_diff>
--- a/Tenancy_Agreement_Template.docx
+++ b/Tenancy_Agreement_Template.docx
@@ -4,103 +4,171 @@
   <w:body>
     <w:p>
       <w:pPr>
-        <w:spacing w:after="0"/>
+        <w:spacing w:before="0" w:after="40" w:lineRule="auto" w:line="264"/>
         <w:jc w:val="center"/>
       </w:pPr>
       <w:r>
         <w:rPr>
-          <w:rFonts w:ascii="Aptos Display" w:hAnsi="Aptos Display"/>
+          <w:rFonts w:ascii="Calibri" w:hAnsi="Calibri"/>
           <w:b/>
-          <w:color w:val="164334"/>
-          <w:sz w:val="40"/>
+          <w:i w:val="0"/>
+          <w:color w:val="52606D"/>
+          <w:sz w:val="22"/>
+        </w:rPr>
+        <w:t>OneRoot Rentals &amp; Apartments</w:t>
+      </w:r>
+    </w:p>
+    <w:p>
+      <w:pPr>
+        <w:spacing w:before="0" w:after="80" w:lineRule="auto" w:line="264"/>
+        <w:jc w:val="center"/>
+      </w:pPr>
+      <w:r>
+        <w:rPr>
+          <w:rFonts w:ascii="Calibri" w:hAnsi="Calibri"/>
+          <w:b/>
+          <w:i w:val="0"/>
+          <w:color w:val="000000"/>
+          <w:sz w:val="44"/>
         </w:rPr>
         <w:t>TENANCY AGREEMENT</w:t>
       </w:r>
     </w:p>
     <w:p>
       <w:pPr>
-        <w:spacing w:after="140"/>
+        <w:spacing w:before="0" w:after="160" w:lineRule="auto" w:line="264"/>
         <w:jc w:val="center"/>
       </w:pPr>
       <w:r>
         <w:rPr>
-          <w:rFonts w:ascii="Aptos" w:hAnsi="Aptos"/>
-          <w:i/>
-          <w:color w:val="1F5D8C"/>
-          <w:sz w:val="19"/>
+          <w:rFonts w:ascii="Calibri" w:hAnsi="Calibri"/>
+          <w:b/>
+          <w:i w:val="0"/>
+          <w:color w:val="1F4D78"/>
+          <w:sz w:val="24"/>
         </w:rPr>
-        <w:t>Residential tenancy for [[SUITE_NAME]]</w:t>
+        <w:t>[[SUITE_NAME]] | Effective Upon Payment Confirmation</w:t>
       </w:r>
     </w:p>
     <w:p>
       <w:pPr>
-        <w:spacing w:after="80"/>
-        <w:pBdr>
-          <w:bottom w:val="single" w:sz="8" w:space="1" w:color="1F5D8C"/>
-        </w:pBdr>
+        <w:spacing w:before="0" w:after="280" w:lineRule="auto" w:line="264"/>
+        <w:jc w:val="center"/>
       </w:pPr>
+      <w:r>
+        <w:rPr>
+          <w:rFonts w:ascii="Calibri" w:hAnsi="Calibri"/>
+          <w:b w:val="0"/>
+          <w:i/>
+          <w:color w:val="52606D"/>
+          <w:sz w:val="20"/>
+        </w:rPr>
+        <w:t>Prepared from the saved apartment record for issue after the agreed advance rent has been paid.</w:t>
+      </w:r>
+    </w:p>
+    <w:p>
+      <w:pPr>
+        <w:spacing w:before="0" w:after="200" w:lineRule="auto" w:line="264"/>
+        <w:jc w:val="left"/>
+      </w:pPr>
+      <w:r>
+        <w:rPr>
+          <w:rFonts w:ascii="Calibri" w:hAnsi="Calibri"/>
+          <w:b w:val="0"/>
+          <w:i w:val="0"/>
+          <w:color w:val="000000"/>
+          <w:sz w:val="22"/>
+        </w:rPr>
+        <w:t>This Tenancy Agreement is intended for execution once the Landlord has confirmed receipt of the agreed advance rent for [[SUITE_NAME]]. The agreement should be completed by confirming the Tenant details, the commencement date, and the payment confirmation details before signing.</w:t>
+      </w:r>
+    </w:p>
+    <w:p>
+      <w:pPr>
+        <w:pStyle w:val="Heading1"/>
+      </w:pPr>
+      <w:r>
+        <w:t>Agreement Snapshot</w:t>
+      </w:r>
     </w:p>
     <w:tbl>
       <w:tblPr>
-        <w:tblW w:type="auto" w:w="0"/>
-        <w:jc w:val="center"/>
+        <w:tblStyle w:val="TableGrid"/>
+        <w:tblW w:type="dxa" w:w="9360"/>
+        <w:jc w:val="left"/>
         <w:tblLayout w:type="fixed"/>
         <w:tblLook w:firstColumn="1" w:firstRow="1" w:lastColumn="0" w:lastRow="0" w:noHBand="0" w:noVBand="1" w:val="04A0"/>
+        <w:tblInd w:type="dxa" w:w="120"/>
       </w:tblPr>
       <w:tblGrid>
-        <w:gridCol w:w="5285"/>
-        <w:gridCol w:w="5285"/>
+        <w:gridCol w:w="2700"/>
+        <w:gridCol w:w="6660"/>
       </w:tblGrid>
       <w:tr>
+        <w:trPr/>
         <w:tc>
           <w:tcPr>
-            <w:tcW w:type="dxa" w:w="2880"/>
-            <w:shd w:fill="EEF3EF"/>
+            <w:tcW w:type="dxa" w:w="2700"/>
+            <w:tcMar>
+              <w:top w:w="80" w:type="dxa"/>
+              <w:bottom w:w="80" w:type="dxa"/>
+              <w:start w:w="120" w:type="dxa"/>
+              <w:end w:w="120" w:type="dxa"/>
+            </w:tcMar>
             <w:vAlign w:val="center"/>
+            <w:shd w:fill="F2F4F7" w:val="clear" w:color="auto"/>
             <w:tcBorders>
-              <w:top w:val="single" w:sz="4" w:color="C9D6CC"/>
-              <w:left w:val="single" w:sz="4" w:color="C9D6CC"/>
-              <w:bottom w:val="single" w:sz="4" w:color="C9D6CC"/>
-              <w:right w:val="single" w:sz="4" w:color="C9D6CC"/>
+              <w:top w:val="single" w:sz="6" w:space="0" w:color="D6DDD5"/>
+              <w:left w:val="single" w:sz="6" w:space="0" w:color="D6DDD5"/>
+              <w:bottom w:val="single" w:sz="6" w:space="0" w:color="D6DDD5"/>
+              <w:right w:val="single" w:sz="6" w:space="0" w:color="D6DDD5"/>
             </w:tcBorders>
           </w:tcPr>
           <w:p>
             <w:pPr>
-              <w:spacing w:after="0"/>
+              <w:spacing w:before="0" w:after="0" w:lineRule="auto" w:line="264"/>
+              <w:jc w:val="left"/>
             </w:pPr>
-            <w:r/>
             <w:r>
               <w:rPr>
-                <w:rFonts w:ascii="Aptos" w:hAnsi="Aptos"/>
+                <w:rFonts w:ascii="Calibri" w:hAnsi="Calibri"/>
                 <w:b/>
-                <w:color w:val="164334"/>
-                <w:sz w:val="17"/>
+                <w:i w:val="0"/>
+                <w:color w:val="000000"/>
+                <w:sz w:val="22"/>
               </w:rPr>
-              <w:t>Property / Suite</w:t>
+              <w:t>Property</w:t>
             </w:r>
           </w:p>
         </w:tc>
         <w:tc>
           <w:tcPr>
-            <w:tcW w:type="dxa" w:w="7056"/>
+            <w:tcW w:type="dxa" w:w="6660"/>
+            <w:tcMar>
+              <w:top w:w="80" w:type="dxa"/>
+              <w:bottom w:w="80" w:type="dxa"/>
+              <w:start w:w="120" w:type="dxa"/>
+              <w:end w:w="120" w:type="dxa"/>
+            </w:tcMar>
             <w:vAlign w:val="center"/>
             <w:tcBorders>
-              <w:top w:val="single" w:sz="4" w:color="C9D6CC"/>
-              <w:left w:val="single" w:sz="4" w:color="C9D6CC"/>
-              <w:bottom w:val="single" w:sz="4" w:color="C9D6CC"/>
-              <w:right w:val="single" w:sz="4" w:color="C9D6CC"/>
+              <w:top w:val="single" w:sz="6" w:space="0" w:color="D6DDD5"/>
+              <w:left w:val="single" w:sz="6" w:space="0" w:color="D6DDD5"/>
+              <w:bottom w:val="single" w:sz="6" w:space="0" w:color="D6DDD5"/>
+              <w:right w:val="single" w:sz="6" w:space="0" w:color="D6DDD5"/>
             </w:tcBorders>
           </w:tcPr>
           <w:p>
             <w:pPr>
-              <w:spacing w:after="0"/>
+              <w:spacing w:before="0" w:after="0" w:lineRule="auto" w:line="264"/>
+              <w:jc w:val="left"/>
             </w:pPr>
-            <w:r/>
             <w:r>
               <w:rPr>
-                <w:rFonts w:ascii="Aptos" w:hAnsi="Aptos"/>
+                <w:rFonts w:ascii="Calibri" w:hAnsi="Calibri"/>
                 <w:b w:val="0"/>
-                <w:sz w:val="17"/>
+                <w:i w:val="0"/>
+                <w:color w:val="000000"/>
+                <w:sz w:val="22"/>
               </w:rPr>
               <w:t>[[SUITE_NAME]]</w:t>
             </w:r>
@@ -108,29 +176,37 @@
         </w:tc>
       </w:tr>
       <w:tr>
+        <w:trPr/>
         <w:tc>
           <w:tcPr>
-            <w:tcW w:type="dxa" w:w="2880"/>
-            <w:shd w:fill="EEF3EF"/>
+            <w:tcW w:type="dxa" w:w="2700"/>
+            <w:tcMar>
+              <w:top w:w="80" w:type="dxa"/>
+              <w:bottom w:w="80" w:type="dxa"/>
+              <w:start w:w="120" w:type="dxa"/>
+              <w:end w:w="120" w:type="dxa"/>
+            </w:tcMar>
             <w:vAlign w:val="center"/>
+            <w:shd w:fill="F2F4F7" w:val="clear" w:color="auto"/>
             <w:tcBorders>
-              <w:top w:val="single" w:sz="4" w:color="C9D6CC"/>
-              <w:left w:val="single" w:sz="4" w:color="C9D6CC"/>
-              <w:bottom w:val="single" w:sz="4" w:color="C9D6CC"/>
-              <w:right w:val="single" w:sz="4" w:color="C9D6CC"/>
+              <w:top w:val="single" w:sz="6" w:space="0" w:color="D6DDD5"/>
+              <w:left w:val="single" w:sz="6" w:space="0" w:color="D6DDD5"/>
+              <w:bottom w:val="single" w:sz="6" w:space="0" w:color="D6DDD5"/>
+              <w:right w:val="single" w:sz="6" w:space="0" w:color="D6DDD5"/>
             </w:tcBorders>
           </w:tcPr>
           <w:p>
             <w:pPr>
-              <w:spacing w:after="0"/>
+              <w:spacing w:before="0" w:after="0" w:lineRule="auto" w:line="264"/>
+              <w:jc w:val="left"/>
             </w:pPr>
-            <w:r/>
             <w:r>
               <w:rPr>
-                <w:rFonts w:ascii="Aptos" w:hAnsi="Aptos"/>
+                <w:rFonts w:ascii="Calibri" w:hAnsi="Calibri"/>
                 <w:b/>
-                <w:color w:val="164334"/>
-                <w:sz w:val="17"/>
+                <w:i w:val="0"/>
+                <w:color w:val="000000"/>
+                <w:sz w:val="22"/>
               </w:rPr>
               <w:t>Location</w:t>
             </w:r>
@@ -138,25 +214,33 @@
         </w:tc>
         <w:tc>
           <w:tcPr>
-            <w:tcW w:type="dxa" w:w="7056"/>
+            <w:tcW w:type="dxa" w:w="6660"/>
+            <w:tcMar>
+              <w:top w:w="80" w:type="dxa"/>
+              <w:bottom w:w="80" w:type="dxa"/>
+              <w:start w:w="120" w:type="dxa"/>
+              <w:end w:w="120" w:type="dxa"/>
+            </w:tcMar>
             <w:vAlign w:val="center"/>
             <w:tcBorders>
-              <w:top w:val="single" w:sz="4" w:color="C9D6CC"/>
-              <w:left w:val="single" w:sz="4" w:color="C9D6CC"/>
-              <w:bottom w:val="single" w:sz="4" w:color="C9D6CC"/>
-              <w:right w:val="single" w:sz="4" w:color="C9D6CC"/>
+              <w:top w:val="single" w:sz="6" w:space="0" w:color="D6DDD5"/>
+              <w:left w:val="single" w:sz="6" w:space="0" w:color="D6DDD5"/>
+              <w:bottom w:val="single" w:sz="6" w:space="0" w:color="D6DDD5"/>
+              <w:right w:val="single" w:sz="6" w:space="0" w:color="D6DDD5"/>
             </w:tcBorders>
           </w:tcPr>
           <w:p>
             <w:pPr>
-              <w:spacing w:after="0"/>
+              <w:spacing w:before="0" w:after="0" w:lineRule="auto" w:line="264"/>
+              <w:jc w:val="left"/>
             </w:pPr>
-            <w:r/>
             <w:r>
               <w:rPr>
-                <w:rFonts w:ascii="Aptos" w:hAnsi="Aptos"/>
+                <w:rFonts w:ascii="Calibri" w:hAnsi="Calibri"/>
                 <w:b w:val="0"/>
-                <w:sz w:val="17"/>
+                <w:i w:val="0"/>
+                <w:color w:val="000000"/>
+                <w:sz w:val="22"/>
               </w:rPr>
               <w:t>[[PROPERTY_LOCATION]]</w:t>
             </w:r>
@@ -164,55 +248,71 @@
         </w:tc>
       </w:tr>
       <w:tr>
+        <w:trPr/>
         <w:tc>
           <w:tcPr>
-            <w:tcW w:type="dxa" w:w="2880"/>
-            <w:shd w:fill="EEF3EF"/>
+            <w:tcW w:type="dxa" w:w="2700"/>
+            <w:tcMar>
+              <w:top w:w="80" w:type="dxa"/>
+              <w:bottom w:w="80" w:type="dxa"/>
+              <w:start w:w="120" w:type="dxa"/>
+              <w:end w:w="120" w:type="dxa"/>
+            </w:tcMar>
             <w:vAlign w:val="center"/>
+            <w:shd w:fill="F2F4F7" w:val="clear" w:color="auto"/>
             <w:tcBorders>
-              <w:top w:val="single" w:sz="4" w:color="C9D6CC"/>
-              <w:left w:val="single" w:sz="4" w:color="C9D6CC"/>
-              <w:bottom w:val="single" w:sz="4" w:color="C9D6CC"/>
-              <w:right w:val="single" w:sz="4" w:color="C9D6CC"/>
+              <w:top w:val="single" w:sz="6" w:space="0" w:color="D6DDD5"/>
+              <w:left w:val="single" w:sz="6" w:space="0" w:color="D6DDD5"/>
+              <w:bottom w:val="single" w:sz="6" w:space="0" w:color="D6DDD5"/>
+              <w:right w:val="single" w:sz="6" w:space="0" w:color="D6DDD5"/>
             </w:tcBorders>
           </w:tcPr>
           <w:p>
             <w:pPr>
-              <w:spacing w:after="0"/>
+              <w:spacing w:before="0" w:after="0" w:lineRule="auto" w:line="264"/>
+              <w:jc w:val="left"/>
             </w:pPr>
-            <w:r/>
             <w:r>
               <w:rPr>
-                <w:rFonts w:ascii="Aptos" w:hAnsi="Aptos"/>
+                <w:rFonts w:ascii="Calibri" w:hAnsi="Calibri"/>
                 <w:b/>
-                <w:color w:val="164334"/>
-                <w:sz w:val="17"/>
+                <w:i w:val="0"/>
+                <w:color w:val="000000"/>
+                <w:sz w:val="22"/>
               </w:rPr>
-              <w:t>Lease term</w:t>
+              <w:t>Lease Term</w:t>
             </w:r>
           </w:p>
         </w:tc>
         <w:tc>
           <w:tcPr>
-            <w:tcW w:type="dxa" w:w="7056"/>
+            <w:tcW w:type="dxa" w:w="6660"/>
+            <w:tcMar>
+              <w:top w:w="80" w:type="dxa"/>
+              <w:bottom w:w="80" w:type="dxa"/>
+              <w:start w:w="120" w:type="dxa"/>
+              <w:end w:w="120" w:type="dxa"/>
+            </w:tcMar>
             <w:vAlign w:val="center"/>
             <w:tcBorders>
-              <w:top w:val="single" w:sz="4" w:color="C9D6CC"/>
-              <w:left w:val="single" w:sz="4" w:color="C9D6CC"/>
-              <w:bottom w:val="single" w:sz="4" w:color="C9D6CC"/>
-              <w:right w:val="single" w:sz="4" w:color="C9D6CC"/>
+              <w:top w:val="single" w:sz="6" w:space="0" w:color="D6DDD5"/>
+              <w:left w:val="single" w:sz="6" w:space="0" w:color="D6DDD5"/>
+              <w:bottom w:val="single" w:sz="6" w:space="0" w:color="D6DDD5"/>
+              <w:right w:val="single" w:sz="6" w:space="0" w:color="D6DDD5"/>
             </w:tcBorders>
           </w:tcPr>
           <w:p>
             <w:pPr>
-              <w:spacing w:after="0"/>
+              <w:spacing w:before="0" w:after="0" w:lineRule="auto" w:line="264"/>
+              <w:jc w:val="left"/>
             </w:pPr>
-            <w:r/>
             <w:r>
               <w:rPr>
-                <w:rFonts w:ascii="Aptos" w:hAnsi="Aptos"/>
+                <w:rFonts w:ascii="Calibri" w:hAnsi="Calibri"/>
                 <w:b w:val="0"/>
-                <w:sz w:val="17"/>
+                <w:i w:val="0"/>
+                <w:color w:val="000000"/>
+                <w:sz w:val="22"/>
               </w:rPr>
               <w:t>[[LEASE_TERM_LABEL]]</w:t>
             </w:r>
@@ -220,55 +320,359 @@
         </w:tc>
       </w:tr>
       <w:tr>
+        <w:trPr/>
         <w:tc>
           <w:tcPr>
-            <w:tcW w:type="dxa" w:w="2880"/>
-            <w:shd w:fill="EEF3EF"/>
+            <w:tcW w:type="dxa" w:w="2700"/>
+            <w:tcMar>
+              <w:top w:w="80" w:type="dxa"/>
+              <w:bottom w:w="80" w:type="dxa"/>
+              <w:start w:w="120" w:type="dxa"/>
+              <w:end w:w="120" w:type="dxa"/>
+            </w:tcMar>
             <w:vAlign w:val="center"/>
+            <w:shd w:fill="F2F4F7" w:val="clear" w:color="auto"/>
             <w:tcBorders>
-              <w:top w:val="single" w:sz="4" w:color="C9D6CC"/>
-              <w:left w:val="single" w:sz="4" w:color="C9D6CC"/>
-              <w:bottom w:val="single" w:sz="4" w:color="C9D6CC"/>
-              <w:right w:val="single" w:sz="4" w:color="C9D6CC"/>
+              <w:top w:val="single" w:sz="6" w:space="0" w:color="D6DDD5"/>
+              <w:left w:val="single" w:sz="6" w:space="0" w:color="D6DDD5"/>
+              <w:bottom w:val="single" w:sz="6" w:space="0" w:color="D6DDD5"/>
+              <w:right w:val="single" w:sz="6" w:space="0" w:color="D6DDD5"/>
             </w:tcBorders>
           </w:tcPr>
           <w:p>
             <w:pPr>
-              <w:spacing w:after="0"/>
+              <w:spacing w:before="0" w:after="0" w:lineRule="auto" w:line="264"/>
+              <w:jc w:val="left"/>
             </w:pPr>
-            <w:r/>
             <w:r>
               <w:rPr>
-                <w:rFonts w:ascii="Aptos" w:hAnsi="Aptos"/>
+                <w:rFonts w:ascii="Calibri" w:hAnsi="Calibri"/>
                 <w:b/>
-                <w:color w:val="164334"/>
-                <w:sz w:val="17"/>
+                <w:i w:val="0"/>
+                <w:color w:val="000000"/>
+                <w:sz w:val="22"/>
               </w:rPr>
-              <w:t>Agreement status</w:t>
+              <w:t>Rent</w:t>
             </w:r>
           </w:p>
         </w:tc>
         <w:tc>
           <w:tcPr>
-            <w:tcW w:type="dxa" w:w="7056"/>
+            <w:tcW w:type="dxa" w:w="6660"/>
+            <w:tcMar>
+              <w:top w:w="80" w:type="dxa"/>
+              <w:bottom w:w="80" w:type="dxa"/>
+              <w:start w:w="120" w:type="dxa"/>
+              <w:end w:w="120" w:type="dxa"/>
+            </w:tcMar>
             <w:vAlign w:val="center"/>
             <w:tcBorders>
-              <w:top w:val="single" w:sz="4" w:color="C9D6CC"/>
-              <w:left w:val="single" w:sz="4" w:color="C9D6CC"/>
-              <w:bottom w:val="single" w:sz="4" w:color="C9D6CC"/>
-              <w:right w:val="single" w:sz="4" w:color="C9D6CC"/>
+              <w:top w:val="single" w:sz="6" w:space="0" w:color="D6DDD5"/>
+              <w:left w:val="single" w:sz="6" w:space="0" w:color="D6DDD5"/>
+              <w:bottom w:val="single" w:sz="6" w:space="0" w:color="D6DDD5"/>
+              <w:right w:val="single" w:sz="6" w:space="0" w:color="D6DDD5"/>
             </w:tcBorders>
           </w:tcPr>
           <w:p>
             <w:pPr>
-              <w:spacing w:after="0"/>
+              <w:spacing w:before="0" w:after="0" w:lineRule="auto" w:line="264"/>
+              <w:jc w:val="left"/>
             </w:pPr>
-            <w:r/>
             <w:r>
               <w:rPr>
-                <w:rFonts w:ascii="Aptos" w:hAnsi="Aptos"/>
+                <w:rFonts w:ascii="Calibri" w:hAnsi="Calibri"/>
                 <w:b w:val="0"/>
-                <w:sz w:val="17"/>
+                <w:i w:val="0"/>
+                <w:color w:val="000000"/>
+                <w:sz w:val="22"/>
+              </w:rPr>
+              <w:t>[[RENT_PLAN_SUMMARY]]</w:t>
+            </w:r>
+          </w:p>
+        </w:tc>
+      </w:tr>
+      <w:tr>
+        <w:trPr/>
+        <w:tc>
+          <w:tcPr>
+            <w:tcW w:type="dxa" w:w="2700"/>
+            <w:tcMar>
+              <w:top w:w="80" w:type="dxa"/>
+              <w:bottom w:w="80" w:type="dxa"/>
+              <w:start w:w="120" w:type="dxa"/>
+              <w:end w:w="120" w:type="dxa"/>
+            </w:tcMar>
+            <w:vAlign w:val="center"/>
+            <w:shd w:fill="F2F4F7" w:val="clear" w:color="auto"/>
+            <w:tcBorders>
+              <w:top w:val="single" w:sz="6" w:space="0" w:color="D6DDD5"/>
+              <w:left w:val="single" w:sz="6" w:space="0" w:color="D6DDD5"/>
+              <w:bottom w:val="single" w:sz="6" w:space="0" w:color="D6DDD5"/>
+              <w:right w:val="single" w:sz="6" w:space="0" w:color="D6DDD5"/>
+            </w:tcBorders>
+          </w:tcPr>
+          <w:p>
+            <w:pPr>
+              <w:spacing w:before="0" w:after="0" w:lineRule="auto" w:line="264"/>
+              <w:jc w:val="left"/>
+            </w:pPr>
+            <w:r>
+              <w:rPr>
+                <w:rFonts w:ascii="Calibri" w:hAnsi="Calibri"/>
+                <w:b/>
+                <w:i w:val="0"/>
+                <w:color w:val="000000"/>
+                <w:sz w:val="22"/>
+              </w:rPr>
+              <w:t>Advance Rent Due Before Activation</w:t>
+            </w:r>
+          </w:p>
+        </w:tc>
+        <w:tc>
+          <w:tcPr>
+            <w:tcW w:type="dxa" w:w="6660"/>
+            <w:tcMar>
+              <w:top w:w="80" w:type="dxa"/>
+              <w:bottom w:w="80" w:type="dxa"/>
+              <w:start w:w="120" w:type="dxa"/>
+              <w:end w:w="120" w:type="dxa"/>
+            </w:tcMar>
+            <w:vAlign w:val="center"/>
+            <w:tcBorders>
+              <w:top w:val="single" w:sz="6" w:space="0" w:color="D6DDD5"/>
+              <w:left w:val="single" w:sz="6" w:space="0" w:color="D6DDD5"/>
+              <w:bottom w:val="single" w:sz="6" w:space="0" w:color="D6DDD5"/>
+              <w:right w:val="single" w:sz="6" w:space="0" w:color="D6DDD5"/>
+            </w:tcBorders>
+          </w:tcPr>
+          <w:p>
+            <w:pPr>
+              <w:spacing w:before="0" w:after="0" w:lineRule="auto" w:line="264"/>
+              <w:jc w:val="left"/>
+            </w:pPr>
+            <w:r>
+              <w:rPr>
+                <w:rFonts w:ascii="Calibri" w:hAnsi="Calibri"/>
+                <w:b w:val="0"/>
+                <w:i w:val="0"/>
+                <w:color w:val="000000"/>
+                <w:sz w:val="22"/>
+              </w:rPr>
+              <w:t>[[ADVANCE_RENT_DUE]]</w:t>
+            </w:r>
+          </w:p>
+        </w:tc>
+      </w:tr>
+      <w:tr>
+        <w:trPr/>
+        <w:tc>
+          <w:tcPr>
+            <w:tcW w:type="dxa" w:w="2700"/>
+            <w:tcMar>
+              <w:top w:w="80" w:type="dxa"/>
+              <w:bottom w:w="80" w:type="dxa"/>
+              <w:start w:w="120" w:type="dxa"/>
+              <w:end w:w="120" w:type="dxa"/>
+            </w:tcMar>
+            <w:vAlign w:val="center"/>
+            <w:shd w:fill="F2F4F7" w:val="clear" w:color="auto"/>
+            <w:tcBorders>
+              <w:top w:val="single" w:sz="6" w:space="0" w:color="D6DDD5"/>
+              <w:left w:val="single" w:sz="6" w:space="0" w:color="D6DDD5"/>
+              <w:bottom w:val="single" w:sz="6" w:space="0" w:color="D6DDD5"/>
+              <w:right w:val="single" w:sz="6" w:space="0" w:color="D6DDD5"/>
+            </w:tcBorders>
+          </w:tcPr>
+          <w:p>
+            <w:pPr>
+              <w:spacing w:before="0" w:after="0" w:lineRule="auto" w:line="264"/>
+              <w:jc w:val="left"/>
+            </w:pPr>
+            <w:r>
+              <w:rPr>
+                <w:rFonts w:ascii="Calibri" w:hAnsi="Calibri"/>
+                <w:b/>
+                <w:i w:val="0"/>
+                <w:color w:val="000000"/>
+                <w:sz w:val="22"/>
+              </w:rPr>
+              <w:t>Monthly Service Charges</w:t>
+            </w:r>
+          </w:p>
+        </w:tc>
+        <w:tc>
+          <w:tcPr>
+            <w:tcW w:type="dxa" w:w="6660"/>
+            <w:tcMar>
+              <w:top w:w="80" w:type="dxa"/>
+              <w:bottom w:w="80" w:type="dxa"/>
+              <w:start w:w="120" w:type="dxa"/>
+              <w:end w:w="120" w:type="dxa"/>
+            </w:tcMar>
+            <w:vAlign w:val="center"/>
+            <w:tcBorders>
+              <w:top w:val="single" w:sz="6" w:space="0" w:color="D6DDD5"/>
+              <w:left w:val="single" w:sz="6" w:space="0" w:color="D6DDD5"/>
+              <w:bottom w:val="single" w:sz="6" w:space="0" w:color="D6DDD5"/>
+              <w:right w:val="single" w:sz="6" w:space="0" w:color="D6DDD5"/>
+            </w:tcBorders>
+          </w:tcPr>
+          <w:p>
+            <w:pPr>
+              <w:spacing w:before="0" w:after="0" w:lineRule="auto" w:line="264"/>
+              <w:jc w:val="left"/>
+            </w:pPr>
+            <w:r>
+              <w:rPr>
+                <w:rFonts w:ascii="Calibri" w:hAnsi="Calibri"/>
+                <w:b w:val="0"/>
+                <w:i w:val="0"/>
+                <w:color w:val="000000"/>
+                <w:sz w:val="22"/>
+              </w:rPr>
+              <w:t>[[MONTHLY_SERVICE_TOTAL]]</w:t>
+            </w:r>
+          </w:p>
+        </w:tc>
+      </w:tr>
+      <w:tr>
+        <w:trPr/>
+        <w:tc>
+          <w:tcPr>
+            <w:tcW w:type="dxa" w:w="2700"/>
+            <w:tcMar>
+              <w:top w:w="80" w:type="dxa"/>
+              <w:bottom w:w="80" w:type="dxa"/>
+              <w:start w:w="120" w:type="dxa"/>
+              <w:end w:w="120" w:type="dxa"/>
+            </w:tcMar>
+            <w:vAlign w:val="center"/>
+            <w:shd w:fill="F2F4F7" w:val="clear" w:color="auto"/>
+            <w:tcBorders>
+              <w:top w:val="single" w:sz="6" w:space="0" w:color="D6DDD5"/>
+              <w:left w:val="single" w:sz="6" w:space="0" w:color="D6DDD5"/>
+              <w:bottom w:val="single" w:sz="6" w:space="0" w:color="D6DDD5"/>
+              <w:right w:val="single" w:sz="6" w:space="0" w:color="D6DDD5"/>
+            </w:tcBorders>
+          </w:tcPr>
+          <w:p>
+            <w:pPr>
+              <w:spacing w:before="0" w:after="0" w:lineRule="auto" w:line="264"/>
+              <w:jc w:val="left"/>
+            </w:pPr>
+            <w:r>
+              <w:rPr>
+                <w:rFonts w:ascii="Calibri" w:hAnsi="Calibri"/>
+                <w:b/>
+                <w:i w:val="0"/>
+                <w:color w:val="000000"/>
+                <w:sz w:val="22"/>
+              </w:rPr>
+              <w:t>Monthly Charges Payment Channel</w:t>
+            </w:r>
+          </w:p>
+        </w:tc>
+        <w:tc>
+          <w:tcPr>
+            <w:tcW w:type="dxa" w:w="6660"/>
+            <w:tcMar>
+              <w:top w:w="80" w:type="dxa"/>
+              <w:bottom w:w="80" w:type="dxa"/>
+              <w:start w:w="120" w:type="dxa"/>
+              <w:end w:w="120" w:type="dxa"/>
+            </w:tcMar>
+            <w:vAlign w:val="center"/>
+            <w:tcBorders>
+              <w:top w:val="single" w:sz="6" w:space="0" w:color="D6DDD5"/>
+              <w:left w:val="single" w:sz="6" w:space="0" w:color="D6DDD5"/>
+              <w:bottom w:val="single" w:sz="6" w:space="0" w:color="D6DDD5"/>
+              <w:right w:val="single" w:sz="6" w:space="0" w:color="D6DDD5"/>
+            </w:tcBorders>
+          </w:tcPr>
+          <w:p>
+            <w:pPr>
+              <w:spacing w:before="0" w:after="0" w:lineRule="auto" w:line="264"/>
+              <w:jc w:val="left"/>
+            </w:pPr>
+            <w:r>
+              <w:rPr>
+                <w:rFonts w:ascii="Calibri" w:hAnsi="Calibri"/>
+                <w:b w:val="0"/>
+                <w:i w:val="0"/>
+                <w:color w:val="000000"/>
+                <w:sz w:val="22"/>
+              </w:rPr>
+              <w:t>[[PAYMENT_CHANNEL]]</w:t>
+            </w:r>
+          </w:p>
+        </w:tc>
+      </w:tr>
+      <w:tr>
+        <w:trPr/>
+        <w:tc>
+          <w:tcPr>
+            <w:tcW w:type="dxa" w:w="2700"/>
+            <w:tcMar>
+              <w:top w:w="80" w:type="dxa"/>
+              <w:bottom w:w="80" w:type="dxa"/>
+              <w:start w:w="120" w:type="dxa"/>
+              <w:end w:w="120" w:type="dxa"/>
+            </w:tcMar>
+            <w:vAlign w:val="center"/>
+            <w:shd w:fill="F2F4F7" w:val="clear" w:color="auto"/>
+            <w:tcBorders>
+              <w:top w:val="single" w:sz="6" w:space="0" w:color="D6DDD5"/>
+              <w:left w:val="single" w:sz="6" w:space="0" w:color="D6DDD5"/>
+              <w:bottom w:val="single" w:sz="6" w:space="0" w:color="D6DDD5"/>
+              <w:right w:val="single" w:sz="6" w:space="0" w:color="D6DDD5"/>
+            </w:tcBorders>
+          </w:tcPr>
+          <w:p>
+            <w:pPr>
+              <w:spacing w:before="0" w:after="0" w:lineRule="auto" w:line="264"/>
+              <w:jc w:val="left"/>
+            </w:pPr>
+            <w:r>
+              <w:rPr>
+                <w:rFonts w:ascii="Calibri" w:hAnsi="Calibri"/>
+                <w:b/>
+                <w:i w:val="0"/>
+                <w:color w:val="000000"/>
+                <w:sz w:val="22"/>
+              </w:rPr>
+              <w:t>Agreement Status</w:t>
+            </w:r>
+          </w:p>
+        </w:tc>
+        <w:tc>
+          <w:tcPr>
+            <w:tcW w:type="dxa" w:w="6660"/>
+            <w:tcMar>
+              <w:top w:w="80" w:type="dxa"/>
+              <w:bottom w:w="80" w:type="dxa"/>
+              <w:start w:w="120" w:type="dxa"/>
+              <w:end w:w="120" w:type="dxa"/>
+            </w:tcMar>
+            <w:vAlign w:val="center"/>
+            <w:tcBorders>
+              <w:top w:val="single" w:sz="6" w:space="0" w:color="D6DDD5"/>
+              <w:left w:val="single" w:sz="6" w:space="0" w:color="D6DDD5"/>
+              <w:bottom w:val="single" w:sz="6" w:space="0" w:color="D6DDD5"/>
+              <w:right w:val="single" w:sz="6" w:space="0" w:color="D6DDD5"/>
+            </w:tcBorders>
+          </w:tcPr>
+          <w:p>
+            <w:pPr>
+              <w:spacing w:before="0" w:after="0" w:lineRule="auto" w:line="264"/>
+              <w:jc w:val="left"/>
+            </w:pPr>
+            <w:r>
+              <w:rPr>
+                <w:rFonts w:ascii="Calibri" w:hAnsi="Calibri"/>
+                <w:b w:val="0"/>
+                <w:i w:val="0"/>
+                <w:color w:val="000000"/>
+                <w:sz w:val="22"/>
               </w:rPr>
               <w:t>[[AGREEMENT_STATUS]]</w:t>
             </w:r>
@@ -278,402 +682,459 @@
     </w:tbl>
     <w:p>
       <w:pPr>
-        <w:keepNext/>
-        <w:keepLines/>
-        <w:spacing w:before="160" w:after="60"/>
+        <w:pStyle w:val="Heading1"/>
       </w:pPr>
       <w:r>
-        <w:rPr>
-          <w:rFonts w:ascii="Aptos Display" w:hAnsi="Aptos Display"/>
-          <w:b/>
-          <w:color w:val="164334"/>
-          <w:sz w:val="22"/>
-        </w:rPr>
         <w:t>1. Parties</w:t>
       </w:r>
     </w:p>
     <w:p>
       <w:pPr>
-        <w:spacing w:after="80" w:line="254" w:lineRule="auto"/>
+        <w:spacing w:before="0" w:after="80" w:lineRule="auto" w:line="264"/>
+        <w:jc w:val="left"/>
       </w:pPr>
       <w:r>
         <w:rPr>
-          <w:rFonts w:ascii="Aptos" w:hAnsi="Aptos"/>
-          <w:color w:val="1C2722"/>
-          <w:sz w:val="17"/>
+          <w:rFonts w:ascii="Calibri" w:hAnsi="Calibri"/>
+          <w:b/>
+          <w:i w:val="0"/>
+          <w:color w:val="000000"/>
+          <w:sz w:val="22"/>
         </w:rPr>
-        <w:t>This Tenancy Agreement is made between Philip Boakye of P.O. Box CT 10792, Cantonments, Accra, Digital Address GW-0332-7210, Mobile 0244620860, operating under OneRoot Essentials (the “Landlord / Manager”), and the person identified below (the “Tenant”).</w:t>
+        <w:t xml:space="preserve">Landlord: </w:t>
+      </w:r>
+      <w:r>
+        <w:rPr>
+          <w:rFonts w:ascii="Calibri" w:hAnsi="Calibri"/>
+          <w:b w:val="0"/>
+          <w:i w:val="0"/>
+          <w:color w:val="000000"/>
+          <w:sz w:val="22"/>
+        </w:rPr>
+        <w:t>Philip Boakye</w:t>
+      </w:r>
+    </w:p>
+    <w:p>
+      <w:pPr>
+        <w:spacing w:before="0" w:after="60" w:lineRule="auto" w:line="264"/>
+        <w:jc w:val="left"/>
+      </w:pPr>
+      <w:r>
+        <w:rPr>
+          <w:rFonts w:ascii="Calibri" w:hAnsi="Calibri"/>
+          <w:b w:val="0"/>
+          <w:i w:val="0"/>
+          <w:color w:val="000000"/>
+          <w:sz w:val="22"/>
+        </w:rPr>
+        <w:t>P.O. Box CT 10792, Cantonments, Accra</w:t>
+      </w:r>
+    </w:p>
+    <w:p>
+      <w:pPr>
+        <w:spacing w:before="0" w:after="60" w:lineRule="auto" w:line="264"/>
+        <w:jc w:val="left"/>
+      </w:pPr>
+      <w:r>
+        <w:rPr>
+          <w:rFonts w:ascii="Calibri" w:hAnsi="Calibri"/>
+          <w:b w:val="0"/>
+          <w:i w:val="0"/>
+          <w:color w:val="000000"/>
+          <w:sz w:val="22"/>
+        </w:rPr>
+        <w:t>Medie New City</w:t>
+      </w:r>
+    </w:p>
+    <w:p>
+      <w:pPr>
+        <w:spacing w:before="0" w:after="60" w:lineRule="auto" w:line="264"/>
+        <w:jc w:val="left"/>
+      </w:pPr>
+      <w:r>
+        <w:rPr>
+          <w:rFonts w:ascii="Calibri" w:hAnsi="Calibri"/>
+          <w:b w:val="0"/>
+          <w:i w:val="0"/>
+          <w:color w:val="000000"/>
+          <w:sz w:val="22"/>
+        </w:rPr>
+        <w:t>Digital Address: GW-0332-7210</w:t>
+      </w:r>
+    </w:p>
+    <w:p>
+      <w:pPr>
+        <w:spacing w:before="0" w:after="60" w:lineRule="auto" w:line="264"/>
+        <w:jc w:val="left"/>
+      </w:pPr>
+      <w:r>
+        <w:rPr>
+          <w:rFonts w:ascii="Calibri" w:hAnsi="Calibri"/>
+          <w:b w:val="0"/>
+          <w:i w:val="0"/>
+          <w:color w:val="000000"/>
+          <w:sz w:val="22"/>
+        </w:rPr>
+        <w:t>Mobile: 0244620860</w:t>
+      </w:r>
+    </w:p>
+    <w:p>
+      <w:pPr>
+        <w:spacing w:before="0" w:after="160" w:lineRule="auto" w:line="264"/>
+        <w:jc w:val="left"/>
+      </w:pPr>
+      <w:r>
+        <w:rPr>
+          <w:rFonts w:ascii="Calibri" w:hAnsi="Calibri"/>
+          <w:b w:val="0"/>
+          <w:i/>
+          <w:color w:val="000000"/>
+          <w:sz w:val="22"/>
+        </w:rPr>
+        <w:t>(Hereinafter referred to as "the Landlord")</w:t>
+      </w:r>
+    </w:p>
+    <w:p>
+      <w:pPr>
+        <w:spacing w:before="0" w:after="80" w:lineRule="auto" w:line="264"/>
+        <w:jc w:val="left"/>
+      </w:pPr>
+      <w:r>
+        <w:rPr>
+          <w:rFonts w:ascii="Calibri" w:hAnsi="Calibri"/>
+          <w:b/>
+          <w:i w:val="0"/>
+          <w:color w:val="000000"/>
+          <w:sz w:val="22"/>
+        </w:rPr>
+        <w:t xml:space="preserve">Tenant Full Legal Name: </w:t>
+      </w:r>
+      <w:r>
+        <w:rPr>
+          <w:rFonts w:ascii="Calibri" w:hAnsi="Calibri"/>
+          <w:b w:val="0"/>
+          <w:i w:val="0"/>
+          <w:color w:val="000000"/>
+          <w:sz w:val="22"/>
+        </w:rPr>
+        <w:t>[[TENANT_NAME]]</w:t>
+      </w:r>
+    </w:p>
+    <w:p>
+      <w:pPr>
+        <w:spacing w:before="0" w:after="80" w:lineRule="auto" w:line="264"/>
+        <w:jc w:val="left"/>
+      </w:pPr>
+      <w:r>
+        <w:rPr>
+          <w:rFonts w:ascii="Calibri" w:hAnsi="Calibri"/>
+          <w:b/>
+          <w:i w:val="0"/>
+          <w:color w:val="000000"/>
+          <w:sz w:val="22"/>
+        </w:rPr>
+        <w:t xml:space="preserve">Tenant Address: </w:t>
+      </w:r>
+      <w:r>
+        <w:rPr>
+          <w:rFonts w:ascii="Calibri" w:hAnsi="Calibri"/>
+          <w:b w:val="0"/>
+          <w:i w:val="0"/>
+          <w:color w:val="000000"/>
+          <w:sz w:val="22"/>
+        </w:rPr>
+        <w:t>[[TENANT_ADDRESS]]</w:t>
+      </w:r>
+    </w:p>
+    <w:p>
+      <w:pPr>
+        <w:spacing w:before="0" w:after="80" w:lineRule="auto" w:line="264"/>
+        <w:jc w:val="left"/>
+      </w:pPr>
+      <w:r>
+        <w:rPr>
+          <w:rFonts w:ascii="Calibri" w:hAnsi="Calibri"/>
+          <w:b/>
+          <w:i w:val="0"/>
+          <w:color w:val="000000"/>
+          <w:sz w:val="22"/>
+        </w:rPr>
+        <w:t xml:space="preserve">Tenant Mobile: </w:t>
+      </w:r>
+      <w:r>
+        <w:rPr>
+          <w:rFonts w:ascii="Calibri" w:hAnsi="Calibri"/>
+          <w:b w:val="0"/>
+          <w:i w:val="0"/>
+          <w:color w:val="000000"/>
+          <w:sz w:val="22"/>
+        </w:rPr>
+        <w:t>[[TENANT_PHONE]]</w:t>
+      </w:r>
+    </w:p>
+    <w:p>
+      <w:pPr>
+        <w:spacing w:before="0" w:after="80" w:lineRule="auto" w:line="264"/>
+        <w:jc w:val="left"/>
+      </w:pPr>
+      <w:r>
+        <w:rPr>
+          <w:rFonts w:ascii="Calibri" w:hAnsi="Calibri"/>
+          <w:b/>
+          <w:i w:val="0"/>
+          <w:color w:val="000000"/>
+          <w:sz w:val="22"/>
+        </w:rPr>
+        <w:t xml:space="preserve">Tenant ID / Passport No.: </w:t>
+      </w:r>
+      <w:r>
+        <w:rPr>
+          <w:rFonts w:ascii="Calibri" w:hAnsi="Calibri"/>
+          <w:b w:val="0"/>
+          <w:i w:val="0"/>
+          <w:color w:val="000000"/>
+          <w:sz w:val="22"/>
+        </w:rPr>
+        <w:t>[[TENANT_ID_REF]]</w:t>
+      </w:r>
+    </w:p>
+    <w:p>
+      <w:pPr>
+        <w:spacing w:before="0" w:after="160" w:lineRule="auto" w:line="264"/>
+        <w:jc w:val="left"/>
+      </w:pPr>
+      <w:r>
+        <w:rPr>
+          <w:rFonts w:ascii="Calibri" w:hAnsi="Calibri"/>
+          <w:b w:val="0"/>
+          <w:i/>
+          <w:color w:val="000000"/>
+          <w:sz w:val="22"/>
+        </w:rPr>
+        <w:t>(Hereinafter referred to as "the Tenant")</w:t>
+      </w:r>
+    </w:p>
+    <w:p>
+      <w:pPr>
+        <w:pStyle w:val="Heading1"/>
+      </w:pPr>
+      <w:r>
+        <w:t>2. Property and Permitted Use</w:t>
+      </w:r>
+    </w:p>
+    <w:p>
+      <w:pPr>
+        <w:spacing w:before="0" w:after="120" w:lineRule="auto" w:line="264"/>
+        <w:jc w:val="left"/>
+      </w:pPr>
+      <w:r>
+        <w:rPr>
+          <w:rFonts w:ascii="Calibri" w:hAnsi="Calibri"/>
+          <w:b w:val="0"/>
+          <w:i w:val="0"/>
+          <w:color w:val="000000"/>
+          <w:sz w:val="22"/>
+        </w:rPr>
+        <w:t>The Landlord agrees to lease to the Tenant the residential apartment known as [[SUITE_NAME]], situated at [[PROPERTY_LOCATION]]. The premises shall be used strictly for residential purposes only, and no commercial activity shall be carried on from the apartment without the Landlord's prior written consent.</w:t>
+      </w:r>
+    </w:p>
+    <w:p>
+      <w:pPr>
+        <w:pStyle w:val="Heading1"/>
+      </w:pPr>
+      <w:r>
+        <w:t>3. Lease Term and Activation</w:t>
+      </w:r>
+    </w:p>
+    <w:p>
+      <w:pPr>
+        <w:spacing w:before="0" w:after="120" w:lineRule="auto" w:line="264"/>
+        <w:jc w:val="left"/>
+      </w:pPr>
+      <w:r>
+        <w:rPr>
+          <w:rFonts w:ascii="Calibri" w:hAnsi="Calibri"/>
+          <w:b w:val="0"/>
+          <w:i w:val="0"/>
+          <w:color w:val="000000"/>
+          <w:sz w:val="22"/>
+        </w:rPr>
+        <w:t>The tenancy shall commence on [[COMMENCEMENT_DATE]] and shall continue for [[LEASE_TERM_TEXT]], ending on [[EXPIRY_DATE]], unless terminated earlier in accordance with this Agreement.</w:t>
+      </w:r>
+    </w:p>
+    <w:p>
+      <w:pPr>
+        <w:spacing w:before="0" w:after="120" w:lineRule="auto" w:line="264"/>
+        <w:jc w:val="left"/>
+      </w:pPr>
+      <w:r>
+        <w:rPr>
+          <w:rFonts w:ascii="Calibri" w:hAnsi="Calibri"/>
+          <w:b w:val="0"/>
+          <w:i w:val="0"/>
+          <w:color w:val="000000"/>
+          <w:sz w:val="22"/>
+        </w:rPr>
+        <w:t>This Agreement shall become effective only after the Landlord confirms receipt of the agreed advance rent of [[ADVANCE_RENT_DUE]]. Until payment is confirmed and recorded in the Payment Confirmation section, this document remains a prepared draft for signature.</w:t>
+      </w:r>
+    </w:p>
+    <w:p>
+      <w:pPr>
+        <w:pStyle w:val="Heading1"/>
+      </w:pPr>
+      <w:r>
+        <w:t>4. Rent and Monthly Service Charges</w:t>
+      </w:r>
+    </w:p>
+    <w:p>
+      <w:pPr>
+        <w:spacing w:before="0" w:after="120" w:lineRule="auto" w:line="264"/>
+        <w:jc w:val="left"/>
+      </w:pPr>
+      <w:r>
+        <w:rPr>
+          <w:rFonts w:ascii="Calibri" w:hAnsi="Calibri"/>
+          <w:b w:val="0"/>
+          <w:i w:val="0"/>
+          <w:color w:val="000000"/>
+          <w:sz w:val="22"/>
+        </w:rPr>
+        <w:t>The agreed rent plan is [[RENT_PLAN_SUMMARY]] The total advance rent due before activation is [[ADVANCE_RENT_DUE]].</w:t>
+      </w:r>
+    </w:p>
+    <w:p>
+      <w:pPr>
+        <w:spacing w:before="0" w:after="160" w:lineRule="auto" w:line="264"/>
+        <w:jc w:val="left"/>
+      </w:pPr>
+      <w:r>
+        <w:rPr>
+          <w:rFonts w:ascii="Calibri" w:hAnsi="Calibri"/>
+          <w:b w:val="0"/>
+          <w:i w:val="0"/>
+          <w:color w:val="000000"/>
+          <w:sz w:val="22"/>
+        </w:rPr>
+        <w:t>Throughout the tenancy period, the Tenant shall also pay the following monthly utility and service charges through [[PAYMENT_CHANNEL]].[[CUSTOM_BILL_ITEMS_NOTE]]</w:t>
       </w:r>
     </w:p>
     <w:tbl>
       <w:tblPr>
-        <w:tblW w:type="auto" w:w="0"/>
-        <w:jc w:val="center"/>
+        <w:tblStyle w:val="TableGrid"/>
+        <w:tblW w:type="dxa" w:w="9360"/>
+        <w:jc w:val="left"/>
+        <w:tblLayout w:type="fixed"/>
         <w:tblLook w:firstColumn="1" w:firstRow="1" w:lastColumn="0" w:lastRow="0" w:noHBand="0" w:noVBand="1" w:val="04A0"/>
+        <w:tblInd w:type="dxa" w:w="120"/>
       </w:tblPr>
       <w:tblGrid>
-        <w:gridCol w:w="5285"/>
-        <w:gridCol w:w="5285"/>
+        <w:gridCol w:w="6660"/>
+        <w:gridCol w:w="2700"/>
       </w:tblGrid>
       <w:tr>
+        <w:trPr/>
         <w:tc>
           <w:tcPr>
-            <w:tcW w:type="dxa" w:w="5285"/>
-            <w:shd w:fill="EEF3EF"/>
+            <w:tcW w:type="dxa" w:w="6660"/>
+            <w:tcMar>
+              <w:top w:w="80" w:type="dxa"/>
+              <w:bottom w:w="80" w:type="dxa"/>
+              <w:start w:w="120" w:type="dxa"/>
+              <w:end w:w="120" w:type="dxa"/>
+            </w:tcMar>
+            <w:shd w:fill="F2F4F7" w:val="clear" w:color="auto"/>
+            <w:tcBorders>
+              <w:top w:val="single" w:sz="6" w:space="0" w:color="D6DDD5"/>
+              <w:left w:val="single" w:sz="6" w:space="0" w:color="D6DDD5"/>
+              <w:bottom w:val="single" w:sz="6" w:space="0" w:color="D6DDD5"/>
+              <w:right w:val="single" w:sz="6" w:space="0" w:color="D6DDD5"/>
+            </w:tcBorders>
             <w:vAlign w:val="center"/>
-            <w:tcBorders>
-              <w:top w:val="single" w:sz="4" w:color="C9D6CC"/>
-              <w:left w:val="single" w:sz="4" w:color="C9D6CC"/>
-              <w:bottom w:val="single" w:sz="4" w:color="C9D6CC"/>
-              <w:right w:val="single" w:sz="4" w:color="C9D6CC"/>
-            </w:tcBorders>
           </w:tcPr>
           <w:p>
             <w:pPr>
-              <w:spacing w:after="0"/>
+              <w:spacing w:before="0" w:after="0" w:lineRule="auto" w:line="264"/>
+              <w:jc w:val="left"/>
             </w:pPr>
-            <w:r/>
             <w:r>
               <w:rPr>
-                <w:rFonts w:ascii="Aptos" w:hAnsi="Aptos"/>
+                <w:rFonts w:ascii="Calibri" w:hAnsi="Calibri"/>
                 <w:b/>
-                <w:color w:val="164334"/>
-                <w:sz w:val="17"/>
+                <w:i w:val="0"/>
+                <w:color w:val="000000"/>
+                <w:sz w:val="22"/>
               </w:rPr>
-              <w:t>Tenant full legal name</w:t>
+              <w:t>Charge</w:t>
             </w:r>
           </w:p>
         </w:tc>
         <w:tc>
           <w:tcPr>
-            <w:tcW w:type="dxa" w:w="5285"/>
+            <w:tcW w:type="dxa" w:w="2700"/>
+            <w:tcMar>
+              <w:top w:w="80" w:type="dxa"/>
+              <w:bottom w:w="80" w:type="dxa"/>
+              <w:start w:w="120" w:type="dxa"/>
+              <w:end w:w="120" w:type="dxa"/>
+            </w:tcMar>
+            <w:shd w:fill="F2F4F7" w:val="clear" w:color="auto"/>
+            <w:tcBorders>
+              <w:top w:val="single" w:sz="6" w:space="0" w:color="D6DDD5"/>
+              <w:left w:val="single" w:sz="6" w:space="0" w:color="D6DDD5"/>
+              <w:bottom w:val="single" w:sz="6" w:space="0" w:color="D6DDD5"/>
+              <w:right w:val="single" w:sz="6" w:space="0" w:color="D6DDD5"/>
+            </w:tcBorders>
             <w:vAlign w:val="center"/>
-            <w:tcBorders>
-              <w:top w:val="single" w:sz="4" w:color="C9D6CC"/>
-              <w:left w:val="single" w:sz="4" w:color="C9D6CC"/>
-              <w:bottom w:val="single" w:sz="4" w:color="C9D6CC"/>
-              <w:right w:val="single" w:sz="4" w:color="C9D6CC"/>
-            </w:tcBorders>
           </w:tcPr>
           <w:p>
             <w:pPr>
-              <w:spacing w:after="0"/>
+              <w:spacing w:before="0" w:after="0" w:lineRule="auto" w:line="264"/>
+              <w:jc w:val="left"/>
             </w:pPr>
-            <w:r/>
             <w:r>
               <w:rPr>
-                <w:rFonts w:ascii="Aptos" w:hAnsi="Aptos"/>
-                <w:b w:val="0"/>
-                <w:sz w:val="17"/>
+                <w:rFonts w:ascii="Calibri" w:hAnsi="Calibri"/>
+                <w:b/>
+                <w:i w:val="0"/>
+                <w:color w:val="000000"/>
+                <w:sz w:val="22"/>
               </w:rPr>
-              <w:t>[[TENANT_NAME]]</w:t>
+              <w:t>Amount</w:t>
             </w:r>
           </w:p>
         </w:tc>
       </w:tr>
       <w:tr>
+        <w:trPr/>
         <w:tc>
           <w:tcPr>
-            <w:tcW w:type="dxa" w:w="5285"/>
-            <w:shd w:fill="EEF3EF"/>
+            <w:tcW w:type="dxa" w:w="6660"/>
+            <w:tcMar>
+              <w:top w:w="80" w:type="dxa"/>
+              <w:bottom w:w="80" w:type="dxa"/>
+              <w:start w:w="120" w:type="dxa"/>
+              <w:end w:w="120" w:type="dxa"/>
+            </w:tcMar>
+            <w:tcBorders>
+              <w:top w:val="single" w:sz="6" w:space="0" w:color="D6DDD5"/>
+              <w:left w:val="single" w:sz="6" w:space="0" w:color="D6DDD5"/>
+              <w:bottom w:val="single" w:sz="6" w:space="0" w:color="D6DDD5"/>
+              <w:right w:val="single" w:sz="6" w:space="0" w:color="D6DDD5"/>
+            </w:tcBorders>
             <w:vAlign w:val="center"/>
-            <w:tcBorders>
-              <w:top w:val="single" w:sz="4" w:color="C9D6CC"/>
-              <w:left w:val="single" w:sz="4" w:color="C9D6CC"/>
-              <w:bottom w:val="single" w:sz="4" w:color="C9D6CC"/>
-              <w:right w:val="single" w:sz="4" w:color="C9D6CC"/>
-            </w:tcBorders>
           </w:tcPr>
           <w:p>
             <w:pPr>
-              <w:spacing w:after="0"/>
+              <w:spacing w:before="0" w:after="0" w:lineRule="auto" w:line="264"/>
+              <w:jc w:val="left"/>
             </w:pPr>
-            <w:r/>
             <w:r>
               <w:rPr>
-                <w:rFonts w:ascii="Aptos" w:hAnsi="Aptos"/>
-                <w:b/>
-                <w:color w:val="164334"/>
-                <w:sz w:val="17"/>
-              </w:rPr>
-              <w:t>Tenant address</w:t>
-            </w:r>
-          </w:p>
-        </w:tc>
-        <w:tc>
-          <w:tcPr>
-            <w:tcW w:type="dxa" w:w="5285"/>
-            <w:vAlign w:val="center"/>
-            <w:tcBorders>
-              <w:top w:val="single" w:sz="4" w:color="C9D6CC"/>
-              <w:left w:val="single" w:sz="4" w:color="C9D6CC"/>
-              <w:bottom w:val="single" w:sz="4" w:color="C9D6CC"/>
-              <w:right w:val="single" w:sz="4" w:color="C9D6CC"/>
-            </w:tcBorders>
-          </w:tcPr>
-          <w:p>
-            <w:pPr>
-              <w:spacing w:after="0"/>
-            </w:pPr>
-            <w:r/>
-            <w:r>
-              <w:rPr>
-                <w:rFonts w:ascii="Aptos" w:hAnsi="Aptos"/>
+                <w:rFonts w:ascii="Calibri" w:hAnsi="Calibri"/>
                 <w:b w:val="0"/>
-                <w:sz w:val="17"/>
-              </w:rPr>
-              <w:t>[[TENANT_ADDRESS]]</w:t>
-            </w:r>
-          </w:p>
-        </w:tc>
-      </w:tr>
-      <w:tr>
-        <w:tc>
-          <w:tcPr>
-            <w:tcW w:type="dxa" w:w="5285"/>
-            <w:shd w:fill="EEF3EF"/>
-            <w:vAlign w:val="center"/>
-            <w:tcBorders>
-              <w:top w:val="single" w:sz="4" w:color="C9D6CC"/>
-              <w:left w:val="single" w:sz="4" w:color="C9D6CC"/>
-              <w:bottom w:val="single" w:sz="4" w:color="C9D6CC"/>
-              <w:right w:val="single" w:sz="4" w:color="C9D6CC"/>
-            </w:tcBorders>
-          </w:tcPr>
-          <w:p>
-            <w:pPr>
-              <w:spacing w:after="0"/>
-            </w:pPr>
-            <w:r/>
-            <w:r>
-              <w:rPr>
-                <w:rFonts w:ascii="Aptos" w:hAnsi="Aptos"/>
-                <w:b/>
-                <w:color w:val="164334"/>
-                <w:sz w:val="17"/>
-              </w:rPr>
-              <w:t>Tenant mobile</w:t>
-            </w:r>
-          </w:p>
-        </w:tc>
-        <w:tc>
-          <w:tcPr>
-            <w:tcW w:type="dxa" w:w="5285"/>
-            <w:vAlign w:val="center"/>
-            <w:tcBorders>
-              <w:top w:val="single" w:sz="4" w:color="C9D6CC"/>
-              <w:left w:val="single" w:sz="4" w:color="C9D6CC"/>
-              <w:bottom w:val="single" w:sz="4" w:color="C9D6CC"/>
-              <w:right w:val="single" w:sz="4" w:color="C9D6CC"/>
-            </w:tcBorders>
-          </w:tcPr>
-          <w:p>
-            <w:pPr>
-              <w:spacing w:after="0"/>
-            </w:pPr>
-            <w:r/>
-            <w:r>
-              <w:rPr>
-                <w:rFonts w:ascii="Aptos" w:hAnsi="Aptos"/>
-                <w:b w:val="0"/>
-                <w:sz w:val="17"/>
-              </w:rPr>
-              <w:t>[[TENANT_PHONE]]</w:t>
-            </w:r>
-          </w:p>
-        </w:tc>
-      </w:tr>
-      <w:tr>
-        <w:tc>
-          <w:tcPr>
-            <w:tcW w:type="dxa" w:w="5285"/>
-            <w:shd w:fill="EEF3EF"/>
-            <w:vAlign w:val="center"/>
-            <w:tcBorders>
-              <w:top w:val="single" w:sz="4" w:color="C9D6CC"/>
-              <w:left w:val="single" w:sz="4" w:color="C9D6CC"/>
-              <w:bottom w:val="single" w:sz="4" w:color="C9D6CC"/>
-              <w:right w:val="single" w:sz="4" w:color="C9D6CC"/>
-            </w:tcBorders>
-          </w:tcPr>
-          <w:p>
-            <w:pPr>
-              <w:spacing w:after="0"/>
-            </w:pPr>
-            <w:r/>
-            <w:r>
-              <w:rPr>
-                <w:rFonts w:ascii="Aptos" w:hAnsi="Aptos"/>
-                <w:b/>
-                <w:color w:val="164334"/>
-                <w:sz w:val="17"/>
-              </w:rPr>
-              <w:t>Ghana Card / ID / Passport</w:t>
-            </w:r>
-          </w:p>
-        </w:tc>
-        <w:tc>
-          <w:tcPr>
-            <w:tcW w:type="dxa" w:w="5285"/>
-            <w:vAlign w:val="center"/>
-            <w:tcBorders>
-              <w:top w:val="single" w:sz="4" w:color="C9D6CC"/>
-              <w:left w:val="single" w:sz="4" w:color="C9D6CC"/>
-              <w:bottom w:val="single" w:sz="4" w:color="C9D6CC"/>
-              <w:right w:val="single" w:sz="4" w:color="C9D6CC"/>
-            </w:tcBorders>
-          </w:tcPr>
-          <w:p>
-            <w:pPr>
-              <w:spacing w:after="0"/>
-            </w:pPr>
-            <w:r/>
-            <w:r>
-              <w:rPr>
-                <w:rFonts w:ascii="Aptos" w:hAnsi="Aptos"/>
-                <w:b w:val="0"/>
-                <w:sz w:val="17"/>
-              </w:rPr>
-              <w:t>[[TENANT_ID_REF]]</w:t>
-            </w:r>
-          </w:p>
-        </w:tc>
-      </w:tr>
-    </w:tbl>
-    <w:p>
-      <w:pPr>
-        <w:keepNext/>
-        <w:keepLines/>
-        <w:spacing w:before="160" w:after="60"/>
-      </w:pPr>
-      <w:r>
-        <w:rPr>
-          <w:rFonts w:ascii="Aptos Display" w:hAnsi="Aptos Display"/>
-          <w:b/>
-          <w:color w:val="164334"/>
-          <w:sz w:val="22"/>
-        </w:rPr>
-        <w:t>2. Premises, Term, And Permitted Use</w:t>
-      </w:r>
-    </w:p>
-    <w:p>
-      <w:pPr>
-        <w:spacing w:after="80" w:line="254" w:lineRule="auto"/>
-      </w:pPr>
-      <w:r>
-        <w:rPr>
-          <w:rFonts w:ascii="Aptos" w:hAnsi="Aptos"/>
-          <w:color w:val="1C2722"/>
-          <w:sz w:val="17"/>
-        </w:rPr>
-        <w:t>The Landlord lets to the Tenant the residential apartment known as [[SUITE_NAME]] at [[PROPERTY_LOCATION]] (the “Premises”). The tenancy starts on [[COMMENCEMENT_DATE]] and ends on [[EXPIRY_DATE]], being [[LEASE_TERM_TEXT]], unless lawfully ended earlier. The Premises may be used only as a private residence. The Tenant may not sublet, assign, operate a business from, or materially alter the Premises without prior written consent.</w:t>
-      </w:r>
-    </w:p>
-    <w:p>
-      <w:pPr>
-        <w:keepNext/>
-        <w:keepLines/>
-        <w:spacing w:before="160" w:after="60"/>
-      </w:pPr>
-      <w:r>
-        <w:rPr>
-          <w:rFonts w:ascii="Aptos Display" w:hAnsi="Aptos Display"/>
-          <w:b/>
-          <w:color w:val="164334"/>
-          <w:sz w:val="22"/>
-        </w:rPr>
-        <w:t>3. Rent, Lawful Advance, And Receipts</w:t>
-      </w:r>
-    </w:p>
-    <w:p>
-      <w:pPr>
-        <w:spacing w:after="80" w:line="254" w:lineRule="auto"/>
-      </w:pPr>
-      <w:r>
-        <w:rPr>
-          <w:rFonts w:ascii="Aptos" w:hAnsi="Aptos"/>
-          <w:color w:val="1C2722"/>
-          <w:sz w:val="17"/>
-        </w:rPr>
-        <w:t>The recorded rent plan is [[RENT_PLAN_SUMMARY]] The full saved cycle amount is [[CYCLE_RENT_TOTAL]]. The amount due as lawful advance before activation is [[ADVANCE_RENT_DUE]], subject always to the Rent Act, 1963 (Act 220), as amended. For a tenancy exceeding six months, the Landlord will not demand or collect more than six months’ rent in advance. Any excess paid must be applied to later rent periods or handled as required by law.</w:t>
-      </w:r>
-    </w:p>
-    <w:p>
-      <w:pPr>
-        <w:spacing w:after="80" w:line="254" w:lineRule="auto"/>
-      </w:pPr>
-      <w:r>
-        <w:rPr>
-          <w:rFonts w:ascii="Aptos" w:hAnsi="Aptos"/>
-          <w:color w:val="1C2722"/>
-          <w:sz w:val="17"/>
-        </w:rPr>
-        <w:t>The Landlord / Manager must provide a written receipt for each rent payment showing the Premises, amount paid, payment period, and Tenant’s name. Payment details confirmed for this agreement are recorded in section 12 below.</w:t>
-      </w:r>
-    </w:p>
-    <w:p>
-      <w:pPr>
-        <w:keepNext/>
-        <w:keepLines/>
-        <w:spacing w:before="160" w:after="60"/>
-      </w:pPr>
-      <w:r>
-        <w:rPr>
-          <w:rFonts w:ascii="Aptos Display" w:hAnsi="Aptos Display"/>
-          <w:b/>
-          <w:color w:val="164334"/>
-          <w:sz w:val="22"/>
-        </w:rPr>
-        <w:t>4. Monthly Bills And Service Charges</w:t>
-      </w:r>
-    </w:p>
-    <w:p>
-      <w:pPr>
-        <w:spacing w:after="80" w:line="254" w:lineRule="auto"/>
-      </w:pPr>
-      <w:r>
-        <w:rPr>
-          <w:rFonts w:ascii="Aptos" w:hAnsi="Aptos"/>
-          <w:color w:val="1C2722"/>
-          <w:sz w:val="17"/>
-        </w:rPr>
-        <w:t>Monthly utilities and services are separate from rent and are payable only when issued as an itemised bill or charge notice. The current monthly amount is [[MONTHLY_SERVICE_TOTAL]], payable through [[PAYMENT_CHANNEL]]. Charges presently recorded are:</w:t>
-      </w:r>
-    </w:p>
-    <w:tbl>
-      <w:tblPr>
-        <w:tblStyle w:val="TableGrid"/>
-        <w:tblW w:type="auto" w:w="0"/>
-        <w:tblLook w:firstColumn="1" w:firstRow="1" w:lastColumn="0" w:lastRow="0" w:noHBand="0" w:noVBand="1" w:val="04A0"/>
-      </w:tblPr>
-      <w:tblGrid>
-        <w:gridCol w:w="5285"/>
-        <w:gridCol w:w="5285"/>
-      </w:tblGrid>
-      <w:tr>
-        <w:tc>
-          <w:tcPr>
-            <w:tcW w:type="dxa" w:w="5285"/>
-            <w:shd w:fill="EEF3EF"/>
-            <w:vAlign w:val="center"/>
-            <w:tcBorders>
-              <w:top w:val="single" w:sz="4" w:color="C9D6CC"/>
-              <w:left w:val="single" w:sz="4" w:color="C9D6CC"/>
-              <w:bottom w:val="single" w:sz="4" w:color="C9D6CC"/>
-              <w:right w:val="single" w:sz="4" w:color="C9D6CC"/>
-            </w:tcBorders>
-          </w:tcPr>
-          <w:p>
-            <w:pPr>
-              <w:spacing w:after="0"/>
-            </w:pPr>
-            <w:r/>
-            <w:r>
-              <w:rPr>
-                <w:rFonts w:ascii="Aptos" w:hAnsi="Aptos"/>
-                <w:b w:val="0"/>
-                <w:color w:val="164334"/>
-                <w:sz w:val="17"/>
+                <w:i w:val="0"/>
+                <w:color w:val="000000"/>
+                <w:sz w:val="22"/>
               </w:rPr>
               <w:t>Water and toilet fees</w:t>
             </w:r>
@@ -681,25 +1142,33 @@
         </w:tc>
         <w:tc>
           <w:tcPr>
-            <w:tcW w:type="dxa" w:w="5285"/>
+            <w:tcW w:type="dxa" w:w="2700"/>
+            <w:tcMar>
+              <w:top w:w="80" w:type="dxa"/>
+              <w:bottom w:w="80" w:type="dxa"/>
+              <w:start w:w="120" w:type="dxa"/>
+              <w:end w:w="120" w:type="dxa"/>
+            </w:tcMar>
+            <w:tcBorders>
+              <w:top w:val="single" w:sz="6" w:space="0" w:color="D6DDD5"/>
+              <w:left w:val="single" w:sz="6" w:space="0" w:color="D6DDD5"/>
+              <w:bottom w:val="single" w:sz="6" w:space="0" w:color="D6DDD5"/>
+              <w:right w:val="single" w:sz="6" w:space="0" w:color="D6DDD5"/>
+            </w:tcBorders>
             <w:vAlign w:val="center"/>
-            <w:tcBorders>
-              <w:top w:val="single" w:sz="4" w:color="C9D6CC"/>
-              <w:left w:val="single" w:sz="4" w:color="C9D6CC"/>
-              <w:bottom w:val="single" w:sz="4" w:color="C9D6CC"/>
-              <w:right w:val="single" w:sz="4" w:color="C9D6CC"/>
-            </w:tcBorders>
           </w:tcPr>
           <w:p>
             <w:pPr>
-              <w:spacing w:after="0"/>
+              <w:spacing w:before="0" w:after="0" w:lineRule="auto" w:line="264"/>
+              <w:jc w:val="left"/>
             </w:pPr>
-            <w:r/>
             <w:r>
               <w:rPr>
-                <w:rFonts w:ascii="Aptos" w:hAnsi="Aptos"/>
+                <w:rFonts w:ascii="Calibri" w:hAnsi="Calibri"/>
                 <w:b w:val="0"/>
-                <w:sz w:val="17"/>
+                <w:i w:val="0"/>
+                <w:color w:val="000000"/>
+                <w:sz w:val="22"/>
               </w:rPr>
               <w:t>[[WATER_TOILET_BILL]]</w:t>
             </w:r>
@@ -707,55 +1176,70 @@
         </w:tc>
       </w:tr>
       <w:tr>
+        <w:trPr/>
         <w:tc>
           <w:tcPr>
-            <w:tcW w:type="dxa" w:w="5285"/>
-            <w:shd w:fill="EEF3EF"/>
+            <w:tcW w:type="dxa" w:w="6660"/>
+            <w:tcMar>
+              <w:top w:w="80" w:type="dxa"/>
+              <w:bottom w:w="80" w:type="dxa"/>
+              <w:start w:w="120" w:type="dxa"/>
+              <w:end w:w="120" w:type="dxa"/>
+            </w:tcMar>
+            <w:tcBorders>
+              <w:top w:val="single" w:sz="6" w:space="0" w:color="D6DDD5"/>
+              <w:left w:val="single" w:sz="6" w:space="0" w:color="D6DDD5"/>
+              <w:bottom w:val="single" w:sz="6" w:space="0" w:color="D6DDD5"/>
+              <w:right w:val="single" w:sz="6" w:space="0" w:color="D6DDD5"/>
+            </w:tcBorders>
             <w:vAlign w:val="center"/>
-            <w:tcBorders>
-              <w:top w:val="single" w:sz="4" w:color="C9D6CC"/>
-              <w:left w:val="single" w:sz="4" w:color="C9D6CC"/>
-              <w:bottom w:val="single" w:sz="4" w:color="C9D6CC"/>
-              <w:right w:val="single" w:sz="4" w:color="C9D6CC"/>
-            </w:tcBorders>
           </w:tcPr>
           <w:p>
             <w:pPr>
-              <w:spacing w:after="0"/>
+              <w:spacing w:before="0" w:after="0" w:lineRule="auto" w:line="264"/>
+              <w:jc w:val="left"/>
             </w:pPr>
-            <w:r/>
             <w:r>
               <w:rPr>
-                <w:rFonts w:ascii="Aptos" w:hAnsi="Aptos"/>
+                <w:rFonts w:ascii="Calibri" w:hAnsi="Calibri"/>
                 <w:b w:val="0"/>
-                <w:color w:val="164334"/>
-                <w:sz w:val="17"/>
+                <w:i w:val="0"/>
+                <w:color w:val="000000"/>
+                <w:sz w:val="22"/>
               </w:rPr>
-              <w:t>Sweeping and gutter cleaning</w:t>
+              <w:t>Sweeping of compound and gutter cleaning</w:t>
             </w:r>
           </w:p>
         </w:tc>
         <w:tc>
           <w:tcPr>
-            <w:tcW w:type="dxa" w:w="5285"/>
+            <w:tcW w:type="dxa" w:w="2700"/>
+            <w:tcMar>
+              <w:top w:w="80" w:type="dxa"/>
+              <w:bottom w:w="80" w:type="dxa"/>
+              <w:start w:w="120" w:type="dxa"/>
+              <w:end w:w="120" w:type="dxa"/>
+            </w:tcMar>
+            <w:tcBorders>
+              <w:top w:val="single" w:sz="6" w:space="0" w:color="D6DDD5"/>
+              <w:left w:val="single" w:sz="6" w:space="0" w:color="D6DDD5"/>
+              <w:bottom w:val="single" w:sz="6" w:space="0" w:color="D6DDD5"/>
+              <w:right w:val="single" w:sz="6" w:space="0" w:color="D6DDD5"/>
+            </w:tcBorders>
             <w:vAlign w:val="center"/>
-            <w:tcBorders>
-              <w:top w:val="single" w:sz="4" w:color="C9D6CC"/>
-              <w:left w:val="single" w:sz="4" w:color="C9D6CC"/>
-              <w:bottom w:val="single" w:sz="4" w:color="C9D6CC"/>
-              <w:right w:val="single" w:sz="4" w:color="C9D6CC"/>
-            </w:tcBorders>
           </w:tcPr>
           <w:p>
             <w:pPr>
-              <w:spacing w:after="0"/>
+              <w:spacing w:before="0" w:after="0" w:lineRule="auto" w:line="264"/>
+              <w:jc w:val="left"/>
             </w:pPr>
-            <w:r/>
             <w:r>
               <w:rPr>
-                <w:rFonts w:ascii="Aptos" w:hAnsi="Aptos"/>
+                <w:rFonts w:ascii="Calibri" w:hAnsi="Calibri"/>
                 <w:b w:val="0"/>
-                <w:sz w:val="17"/>
+                <w:i w:val="0"/>
+                <w:color w:val="000000"/>
+                <w:sz w:val="22"/>
               </w:rPr>
               <w:t>[[SWEEPING_BILL]]</w:t>
             </w:r>
@@ -763,55 +1247,70 @@
         </w:tc>
       </w:tr>
       <w:tr>
+        <w:trPr/>
         <w:tc>
           <w:tcPr>
-            <w:tcW w:type="dxa" w:w="5285"/>
-            <w:shd w:fill="EEF3EF"/>
+            <w:tcW w:type="dxa" w:w="6660"/>
+            <w:tcMar>
+              <w:top w:w="80" w:type="dxa"/>
+              <w:bottom w:w="80" w:type="dxa"/>
+              <w:start w:w="120" w:type="dxa"/>
+              <w:end w:w="120" w:type="dxa"/>
+            </w:tcMar>
+            <w:tcBorders>
+              <w:top w:val="single" w:sz="6" w:space="0" w:color="D6DDD5"/>
+              <w:left w:val="single" w:sz="6" w:space="0" w:color="D6DDD5"/>
+              <w:bottom w:val="single" w:sz="6" w:space="0" w:color="D6DDD5"/>
+              <w:right w:val="single" w:sz="6" w:space="0" w:color="D6DDD5"/>
+            </w:tcBorders>
             <w:vAlign w:val="center"/>
-            <w:tcBorders>
-              <w:top w:val="single" w:sz="4" w:color="C9D6CC"/>
-              <w:left w:val="single" w:sz="4" w:color="C9D6CC"/>
-              <w:bottom w:val="single" w:sz="4" w:color="C9D6CC"/>
-              <w:right w:val="single" w:sz="4" w:color="C9D6CC"/>
-            </w:tcBorders>
           </w:tcPr>
           <w:p>
             <w:pPr>
-              <w:spacing w:after="0"/>
+              <w:spacing w:before="0" w:after="0" w:lineRule="auto" w:line="264"/>
+              <w:jc w:val="left"/>
             </w:pPr>
-            <w:r/>
             <w:r>
               <w:rPr>
-                <w:rFonts w:ascii="Aptos" w:hAnsi="Aptos"/>
+                <w:rFonts w:ascii="Calibri" w:hAnsi="Calibri"/>
                 <w:b w:val="0"/>
-                <w:color w:val="164334"/>
-                <w:sz w:val="17"/>
+                <w:i w:val="0"/>
+                <w:color w:val="000000"/>
+                <w:sz w:val="22"/>
               </w:rPr>
-              <w:t>Waste management</w:t>
+              <w:t>Waste disposal</w:t>
             </w:r>
           </w:p>
         </w:tc>
         <w:tc>
           <w:tcPr>
-            <w:tcW w:type="dxa" w:w="5285"/>
+            <w:tcW w:type="dxa" w:w="2700"/>
+            <w:tcMar>
+              <w:top w:w="80" w:type="dxa"/>
+              <w:bottom w:w="80" w:type="dxa"/>
+              <w:start w:w="120" w:type="dxa"/>
+              <w:end w:w="120" w:type="dxa"/>
+            </w:tcMar>
+            <w:tcBorders>
+              <w:top w:val="single" w:sz="6" w:space="0" w:color="D6DDD5"/>
+              <w:left w:val="single" w:sz="6" w:space="0" w:color="D6DDD5"/>
+              <w:bottom w:val="single" w:sz="6" w:space="0" w:color="D6DDD5"/>
+              <w:right w:val="single" w:sz="6" w:space="0" w:color="D6DDD5"/>
+            </w:tcBorders>
             <w:vAlign w:val="center"/>
-            <w:tcBorders>
-              <w:top w:val="single" w:sz="4" w:color="C9D6CC"/>
-              <w:left w:val="single" w:sz="4" w:color="C9D6CC"/>
-              <w:bottom w:val="single" w:sz="4" w:color="C9D6CC"/>
-              <w:right w:val="single" w:sz="4" w:color="C9D6CC"/>
-            </w:tcBorders>
           </w:tcPr>
           <w:p>
             <w:pPr>
-              <w:spacing w:after="0"/>
+              <w:spacing w:before="0" w:after="0" w:lineRule="auto" w:line="264"/>
+              <w:jc w:val="left"/>
             </w:pPr>
-            <w:r/>
             <w:r>
               <w:rPr>
-                <w:rFonts w:ascii="Aptos" w:hAnsi="Aptos"/>
+                <w:rFonts w:ascii="Calibri" w:hAnsi="Calibri"/>
                 <w:b w:val="0"/>
-                <w:sz w:val="17"/>
+                <w:i w:val="0"/>
+                <w:color w:val="000000"/>
+                <w:sz w:val="22"/>
               </w:rPr>
               <w:t>[[WASTE_BILL]]</w:t>
             </w:r>
@@ -819,85 +1318,36 @@
         </w:tc>
       </w:tr>
       <w:tr>
+        <w:trPr/>
         <w:tc>
           <w:tcPr>
-            <w:tcW w:type="dxa" w:w="5285"/>
-            <w:shd w:fill="EEF3EF"/>
+            <w:tcW w:type="dxa" w:w="6660"/>
+            <w:tcMar>
+              <w:top w:w="80" w:type="dxa"/>
+              <w:bottom w:w="80" w:type="dxa"/>
+              <w:start w:w="120" w:type="dxa"/>
+              <w:end w:w="120" w:type="dxa"/>
+            </w:tcMar>
+            <w:tcBorders>
+              <w:top w:val="single" w:sz="6" w:space="0" w:color="D6DDD5"/>
+              <w:left w:val="single" w:sz="6" w:space="0" w:color="D6DDD5"/>
+              <w:bottom w:val="single" w:sz="6" w:space="0" w:color="D6DDD5"/>
+              <w:right w:val="single" w:sz="6" w:space="0" w:color="D6DDD5"/>
+            </w:tcBorders>
             <w:vAlign w:val="center"/>
-            <w:tcBorders>
-              <w:top w:val="single" w:sz="4" w:color="C9D6CC"/>
-              <w:left w:val="single" w:sz="4" w:color="C9D6CC"/>
-              <w:bottom w:val="single" w:sz="4" w:color="C9D6CC"/>
-              <w:right w:val="single" w:sz="4" w:color="C9D6CC"/>
-            </w:tcBorders>
           </w:tcPr>
           <w:p>
             <w:pPr>
-              <w:spacing w:after="0"/>
+              <w:spacing w:before="0" w:after="0" w:lineRule="auto" w:line="264"/>
+              <w:jc w:val="left"/>
             </w:pPr>
-            <w:r/>
             <w:r>
               <w:rPr>
-                <w:rFonts w:ascii="Aptos" w:hAnsi="Aptos"/>
-                <w:b w:val="0"/>
-                <w:color w:val="164334"/>
-                <w:sz w:val="17"/>
-              </w:rPr>
-              <w:t>Other saved charges</w:t>
-            </w:r>
-          </w:p>
-        </w:tc>
-        <w:tc>
-          <w:tcPr>
-            <w:tcW w:type="dxa" w:w="5285"/>
-            <w:vAlign w:val="center"/>
-            <w:tcBorders>
-              <w:top w:val="single" w:sz="4" w:color="C9D6CC"/>
-              <w:left w:val="single" w:sz="4" w:color="C9D6CC"/>
-              <w:bottom w:val="single" w:sz="4" w:color="C9D6CC"/>
-              <w:right w:val="single" w:sz="4" w:color="C9D6CC"/>
-            </w:tcBorders>
-          </w:tcPr>
-          <w:p>
-            <w:pPr>
-              <w:spacing w:after="0"/>
-            </w:pPr>
-            <w:r/>
-            <w:r>
-              <w:rPr>
-                <w:rFonts w:ascii="Aptos" w:hAnsi="Aptos"/>
-                <w:b w:val="0"/>
-                <w:sz w:val="17"/>
-              </w:rPr>
-              <w:t>[[CUSTOM_BILL_ITEMS_NOTE]]</w:t>
-            </w:r>
-          </w:p>
-        </w:tc>
-      </w:tr>
-      <w:tr>
-        <w:tc>
-          <w:tcPr>
-            <w:tcW w:type="dxa" w:w="5285"/>
-            <w:shd w:fill="DDEBE0"/>
-            <w:vAlign w:val="center"/>
-            <w:tcBorders>
-              <w:top w:val="single" w:sz="4" w:color="C9D6CC"/>
-              <w:left w:val="single" w:sz="4" w:color="C9D6CC"/>
-              <w:bottom w:val="single" w:sz="4" w:color="C9D6CC"/>
-              <w:right w:val="single" w:sz="4" w:color="C9D6CC"/>
-            </w:tcBorders>
-          </w:tcPr>
-          <w:p>
-            <w:pPr>
-              <w:spacing w:after="0"/>
-            </w:pPr>
-            <w:r/>
-            <w:r>
-              <w:rPr>
-                <w:rFonts w:ascii="Aptos" w:hAnsi="Aptos"/>
+                <w:rFonts w:ascii="Calibri" w:hAnsi="Calibri"/>
                 <w:b/>
-                <w:color w:val="164334"/>
-                <w:sz w:val="17"/>
+                <w:i w:val="0"/>
+                <w:color w:val="000000"/>
+                <w:sz w:val="22"/>
               </w:rPr>
               <w:t>Total monthly service charges</w:t>
             </w:r>
@@ -905,25 +1355,33 @@
         </w:tc>
         <w:tc>
           <w:tcPr>
-            <w:tcW w:type="dxa" w:w="5285"/>
+            <w:tcW w:type="dxa" w:w="2700"/>
+            <w:tcMar>
+              <w:top w:w="80" w:type="dxa"/>
+              <w:bottom w:w="80" w:type="dxa"/>
+              <w:start w:w="120" w:type="dxa"/>
+              <w:end w:w="120" w:type="dxa"/>
+            </w:tcMar>
+            <w:tcBorders>
+              <w:top w:val="single" w:sz="6" w:space="0" w:color="D6DDD5"/>
+              <w:left w:val="single" w:sz="6" w:space="0" w:color="D6DDD5"/>
+              <w:bottom w:val="single" w:sz="6" w:space="0" w:color="D6DDD5"/>
+              <w:right w:val="single" w:sz="6" w:space="0" w:color="D6DDD5"/>
+            </w:tcBorders>
             <w:vAlign w:val="center"/>
-            <w:tcBorders>
-              <w:top w:val="single" w:sz="4" w:color="C9D6CC"/>
-              <w:left w:val="single" w:sz="4" w:color="C9D6CC"/>
-              <w:bottom w:val="single" w:sz="4" w:color="C9D6CC"/>
-              <w:right w:val="single" w:sz="4" w:color="C9D6CC"/>
-            </w:tcBorders>
           </w:tcPr>
           <w:p>
             <w:pPr>
-              <w:spacing w:after="0"/>
+              <w:spacing w:before="0" w:after="0" w:lineRule="auto" w:line="264"/>
+              <w:jc w:val="left"/>
             </w:pPr>
-            <w:r/>
             <w:r>
               <w:rPr>
-                <w:rFonts w:ascii="Aptos" w:hAnsi="Aptos"/>
+                <w:rFonts w:ascii="Calibri" w:hAnsi="Calibri"/>
                 <w:b/>
-                <w:sz w:val="17"/>
+                <w:i w:val="0"/>
+                <w:color w:val="000000"/>
+                <w:sz w:val="22"/>
               </w:rPr>
               <w:t>[[MONTHLY_SERVICE_TOTAL]]</w:t>
             </w:r>
@@ -933,339 +1391,361 @@
     </w:tbl>
     <w:p>
       <w:pPr>
-        <w:spacing w:after="80" w:line="254" w:lineRule="auto"/>
+        <w:spacing w:before="160" w:after="120" w:lineRule="auto" w:line="264"/>
+        <w:jc w:val="left"/>
       </w:pPr>
       <w:r>
         <w:rPr>
-          <w:rFonts w:ascii="Aptos" w:hAnsi="Aptos"/>
-          <w:color w:val="1C2722"/>
-          <w:sz w:val="17"/>
+          <w:rFonts w:ascii="Calibri" w:hAnsi="Calibri"/>
+          <w:b w:val="0"/>
+          <w:i w:val="0"/>
+          <w:color w:val="000000"/>
+          <w:sz w:val="22"/>
         </w:rPr>
-        <w:t>Any change to a recurring bill or service charge must be notified in writing with a clear basis and effective date. The Tenant should retain the payment receipt or transfer reference for each payment.</w:t>
+        <w:t>The Tenant shall send proof of each monthly service-charge payment to the Landlord immediately after payment is made.</w:t>
       </w:r>
     </w:p>
     <w:p>
       <w:pPr>
-        <w:keepNext/>
-        <w:keepLines/>
-        <w:spacing w:before="160" w:after="60"/>
+        <w:pStyle w:val="Heading1"/>
       </w:pPr>
       <w:r>
-        <w:rPr>
-          <w:rFonts w:ascii="Aptos Display" w:hAnsi="Aptos Display"/>
-          <w:b/>
-          <w:color w:val="164334"/>
-          <w:sz w:val="22"/>
-        </w:rPr>
-        <w:t>5. Deposit, Condition, And Inventory</w:t>
+        <w:t>5. Safety, Alterations, and Property Care</w:t>
       </w:r>
     </w:p>
     <w:p>
       <w:pPr>
-        <w:spacing w:after="80" w:line="254" w:lineRule="auto"/>
+        <w:spacing w:before="0" w:after="120" w:lineRule="auto" w:line="264"/>
+        <w:jc w:val="left"/>
       </w:pPr>
       <w:r>
         <w:rPr>
-          <w:rFonts w:ascii="Aptos" w:hAnsi="Aptos"/>
-          <w:color w:val="1C2722"/>
-          <w:sz w:val="17"/>
+          <w:rFonts w:ascii="Calibri" w:hAnsi="Calibri"/>
+          <w:b w:val="0"/>
+          <w:i w:val="0"/>
+          <w:color w:val="000000"/>
+          <w:sz w:val="22"/>
         </w:rPr>
-        <w:t>Any security deposit is held separately from rent and may be applied only to documented unpaid lawful charges, missing inventory items, or damage beyond fair wear and tear. At move-in, the parties should sign the condition and inventory schedule, including keys, meter readings, fixtures, and any bed or mattress supplied. At move-out, deductions must be itemised and explained to the Tenant.</w:t>
+        <w:t>Gas cylinders shall not be stored in the bedroom or kitchen. All gas cylinders must be kept in the designated external compartment and connected to the stove from that location only.</w:t>
       </w:r>
     </w:p>
     <w:p>
       <w:pPr>
-        <w:keepNext/>
-        <w:keepLines/>
-        <w:spacing w:before="160" w:after="60"/>
+        <w:spacing w:before="0" w:after="120" w:lineRule="auto" w:line="264"/>
+        <w:jc w:val="left"/>
       </w:pPr>
       <w:r>
         <w:rPr>
-          <w:rFonts w:ascii="Aptos Display" w:hAnsi="Aptos Display"/>
-          <w:b/>
-          <w:color w:val="164334"/>
+          <w:rFonts w:ascii="Calibri" w:hAnsi="Calibri"/>
+          <w:b w:val="0"/>
+          <w:i w:val="0"/>
+          <w:color w:val="000000"/>
           <w:sz w:val="22"/>
         </w:rPr>
-        <w:t>6. Care, Conduct, And Safety</w:t>
+        <w:t>The apartment includes the basic fittings presently installed, including the bath, toilet, and kitchen fixtures. The Tenant shall be responsible for any damage occurring during the tenancy beyond fair wear and tear.</w:t>
       </w:r>
     </w:p>
     <w:p>
       <w:pPr>
-        <w:pStyle w:val="ListBullet"/>
-        <w:spacing w:after="20"/>
-        <w:ind w:left="317"/>
+        <w:spacing w:before="0" w:after="120" w:lineRule="auto" w:line="264"/>
+        <w:jc w:val="left"/>
       </w:pPr>
       <w:r>
         <w:rPr>
-          <w:rFonts w:ascii="Aptos" w:hAnsi="Aptos"/>
-          <w:sz w:val="17"/>
+          <w:rFonts w:ascii="Calibri" w:hAnsi="Calibri"/>
+          <w:b w:val="0"/>
+          <w:i w:val="0"/>
+          <w:color w:val="000000"/>
+          <w:sz w:val="22"/>
         </w:rPr>
-        <w:t>The Tenant must keep the Premises and immediate surroundings reasonably clean and cooperate with property sanitation and waste-management arrangements.</w:t>
+        <w:t>Before moving out, the Tenant shall permit an inspection by designated service providers, including a plumber, electrician, and painter, to confirm that no outstanding repairs remain.</w:t>
       </w:r>
     </w:p>
     <w:p>
       <w:pPr>
-        <w:pStyle w:val="ListBullet"/>
-        <w:spacing w:after="20"/>
-        <w:ind w:left="317"/>
+        <w:spacing w:before="0" w:after="120" w:lineRule="auto" w:line="264"/>
+        <w:jc w:val="left"/>
       </w:pPr>
       <w:r>
         <w:rPr>
-          <w:rFonts w:ascii="Aptos" w:hAnsi="Aptos"/>
-          <w:sz w:val="17"/>
+          <w:rFonts w:ascii="Calibri" w:hAnsi="Calibri"/>
+          <w:b w:val="0"/>
+          <w:i w:val="0"/>
+          <w:color w:val="000000"/>
+          <w:sz w:val="22"/>
         </w:rPr>
-        <w:t>Gas cylinders must remain in the designated external compartment and must not be stored in the bedroom or kitchen.</w:t>
+        <w:t>The Tenant shall not drill, paint, or make structural or cosmetic alterations to the premises without the Landlord's prior permission.</w:t>
       </w:r>
     </w:p>
     <w:p>
       <w:pPr>
-        <w:pStyle w:val="ListBullet"/>
-        <w:spacing w:after="20"/>
-        <w:ind w:left="317"/>
+        <w:pStyle w:val="Heading1"/>
       </w:pPr>
       <w:r>
-        <w:rPr>
-          <w:rFonts w:ascii="Aptos" w:hAnsi="Aptos"/>
-          <w:sz w:val="17"/>
-        </w:rPr>
-        <w:t>No pets, indoor smoking, excessive noise, nuisance, dangerous or disorderly conduct, or activity that disturbs neighbours is allowed.</w:t>
+        <w:t>6. Conduct, Guests, and House Rules</w:t>
       </w:r>
     </w:p>
     <w:p>
       <w:pPr>
-        <w:pStyle w:val="ListBullet"/>
-        <w:spacing w:after="20"/>
-        <w:ind w:left="317"/>
+        <w:spacing w:before="0" w:after="120" w:lineRule="auto" w:line="264"/>
+        <w:jc w:val="left"/>
       </w:pPr>
       <w:r>
         <w:rPr>
-          <w:rFonts w:ascii="Aptos" w:hAnsi="Aptos"/>
-          <w:sz w:val="17"/>
+          <w:rFonts w:ascii="Calibri" w:hAnsi="Calibri"/>
+          <w:b w:val="0"/>
+          <w:i w:val="0"/>
+          <w:color w:val="000000"/>
+          <w:sz w:val="22"/>
         </w:rPr>
-        <w:t>The Tenant must keep the main gate locked and notify the Landlord / Manager of any extended occupancy, lost keys, or security concern.</w:t>
+        <w:t>No pets are allowed on the premises. The Tenant shall maintain reasonable noise levels and shall not play loud music in a manner that disturbs neighbours or other occupants.</w:t>
       </w:r>
     </w:p>
     <w:p>
       <w:pPr>
-        <w:pStyle w:val="ListBullet"/>
-        <w:spacing w:after="20"/>
-        <w:ind w:left="317"/>
+        <w:spacing w:before="0" w:after="120" w:lineRule="auto" w:line="264"/>
+        <w:jc w:val="left"/>
       </w:pPr>
       <w:r>
         <w:rPr>
-          <w:rFonts w:ascii="Aptos" w:hAnsi="Aptos"/>
-          <w:sz w:val="17"/>
+          <w:rFonts w:ascii="Calibri" w:hAnsi="Calibri"/>
+          <w:b w:val="0"/>
+          <w:i w:val="0"/>
+          <w:color w:val="000000"/>
+          <w:sz w:val="22"/>
         </w:rPr>
-        <w:t>The Tenant must not drill, paint, alter fixtures, or make structural or cosmetic changes without prior written consent.</w:t>
+        <w:t>Overnight guests may stay only for a limited number of days and only with the Landlord's prior approval. Smoking is not permitted inside the apartment.</w:t>
       </w:r>
     </w:p>
     <w:p>
       <w:pPr>
-        <w:keepNext/>
-        <w:keepLines/>
-        <w:spacing w:before="160" w:after="60"/>
+        <w:spacing w:before="0" w:after="120" w:lineRule="auto" w:line="264"/>
+        <w:jc w:val="left"/>
       </w:pPr>
       <w:r>
         <w:rPr>
-          <w:rFonts w:ascii="Aptos Display" w:hAnsi="Aptos Display"/>
-          <w:b/>
-          <w:color w:val="164334"/>
+          <w:rFonts w:ascii="Calibri" w:hAnsi="Calibri"/>
+          <w:b w:val="0"/>
+          <w:i w:val="0"/>
+          <w:color w:val="000000"/>
           <w:sz w:val="22"/>
         </w:rPr>
-        <w:t>7. Repairs, Maintenance, And Access</w:t>
+        <w:t>Excessive alcohol use or any disorderly behaviour that causes nuisance, danger, or disturbance is strictly prohibited.</w:t>
       </w:r>
     </w:p>
     <w:p>
       <w:pPr>
-        <w:spacing w:after="80" w:line="254" w:lineRule="auto"/>
+        <w:spacing w:before="0" w:after="120" w:lineRule="auto" w:line="264"/>
+        <w:jc w:val="left"/>
       </w:pPr>
       <w:r>
         <w:rPr>
-          <w:rFonts w:ascii="Aptos" w:hAnsi="Aptos"/>
-          <w:color w:val="1C2722"/>
-          <w:sz w:val="17"/>
+          <w:rFonts w:ascii="Calibri" w:hAnsi="Calibri"/>
+          <w:b w:val="0"/>
+          <w:i w:val="0"/>
+          <w:color w:val="000000"/>
+          <w:sz w:val="22"/>
         </w:rPr>
-        <w:t>The Landlord is responsible for structural safety and maintenance not caused by the Tenant’s misuse or neglect. The Tenant is responsible for promptly reporting defects and for damage caused by the Tenant, occupants, or guests beyond fair wear and tear. Non-urgent matters may be reported by WhatsApp or text. Urgent water leaks, electrical faults, fire, or safety risks must be reported immediately.</w:t>
+        <w:t>The main gate must remain locked at all times to support the security of all residents and to prevent the dogs on the premises from leaving the compound.</w:t>
       </w:r>
     </w:p>
     <w:p>
       <w:pPr>
-        <w:spacing w:after="80" w:line="254" w:lineRule="auto"/>
+        <w:pStyle w:val="Heading1"/>
       </w:pPr>
       <w:r>
-        <w:rPr>
-          <w:rFonts w:ascii="Aptos" w:hAnsi="Aptos"/>
-          <w:color w:val="1C2722"/>
-          <w:sz w:val="17"/>
-        </w:rPr>
-        <w:t>Except in an emergency, for agreed repairs, or where entry is authorised by law, the Landlord will give reasonable advance notice before entering the Premises. The Tenant will allow access at a reasonable time for inspection and necessary repair. Approved providers may be used for electrical, plumbing, or other specialist work; no unauthorised work is to be commissioned where it could affect the property.</w:t>
+        <w:t>7. Maintenance, Access, and Issue Resolution</w:t>
       </w:r>
     </w:p>
     <w:p>
       <w:pPr>
-        <w:keepNext/>
-        <w:keepLines/>
-        <w:spacing w:before="160" w:after="60"/>
+        <w:spacing w:before="0" w:after="120" w:lineRule="auto" w:line="264"/>
+        <w:jc w:val="left"/>
       </w:pPr>
       <w:r>
         <w:rPr>
-          <w:rFonts w:ascii="Aptos Display" w:hAnsi="Aptos Display"/>
-          <w:b/>
-          <w:color w:val="164334"/>
+          <w:rFonts w:ascii="Calibri" w:hAnsi="Calibri"/>
+          <w:b w:val="0"/>
+          <w:i w:val="0"/>
+          <w:color w:val="000000"/>
           <w:sz w:val="22"/>
         </w:rPr>
-        <w:t>8. Rent Review, Renewal, And Notices</w:t>
+        <w:t>Non-urgent maintenance issues shall be reported to the Landlord via WhatsApp or text message. Urgent issues, including water leaks or electrical faults, must be reported immediately.</w:t>
       </w:r>
     </w:p>
     <w:p>
       <w:pPr>
-        <w:spacing w:after="80" w:line="254" w:lineRule="auto"/>
+        <w:spacing w:before="0" w:after="120" w:lineRule="auto" w:line="264"/>
+        <w:jc w:val="left"/>
       </w:pPr>
       <w:r>
         <w:rPr>
-          <w:rFonts w:ascii="Aptos" w:hAnsi="Aptos"/>
-          <w:color w:val="1C2722"/>
-          <w:sz w:val="17"/>
+          <w:rFonts w:ascii="Calibri" w:hAnsi="Calibri"/>
+          <w:b w:val="0"/>
+          <w:i w:val="0"/>
+          <w:color w:val="000000"/>
+          <w:sz w:val="22"/>
         </w:rPr>
-        <w:t>A rent review or increase must be communicated in writing and must follow applicable Ghanaian law and any Rent Control process. This fixed term ends on the stated expiry date unless renewed in writing or otherwise continued under Ghanaian law. Either party may give written notice of proposed non-renewal or early termination, but no notice under this agreement shortens a longer notice period required by law.</w:t>
+        <w:t>Approved service providers are as follows: Electrician - Emmanuel (contact available on the tenants' WhatsApp platform), and Plumber - Sammy (contact available on the platform). No substitute electrician shall be engaged without the Landlord's approval.</w:t>
       </w:r>
     </w:p>
     <w:p>
       <w:pPr>
-        <w:keepNext/>
-        <w:keepLines/>
-        <w:spacing w:before="160" w:after="60"/>
+        <w:spacing w:before="0" w:after="120" w:lineRule="auto" w:line="264"/>
+        <w:jc w:val="left"/>
       </w:pPr>
       <w:r>
         <w:rPr>
-          <w:rFonts w:ascii="Aptos Display" w:hAnsi="Aptos Display"/>
-          <w:b/>
-          <w:color w:val="164334"/>
+          <w:rFonts w:ascii="Calibri" w:hAnsi="Calibri"/>
+          <w:b w:val="0"/>
+          <w:i w:val="0"/>
+          <w:color w:val="000000"/>
           <w:sz w:val="22"/>
         </w:rPr>
-        <w:t>9. Possession And Disputes</w:t>
+        <w:t>The Landlord may enter the premises only in an emergency, to carry out necessary or agreed repairs, inspections, or improvements, pursuant to a lawful court order, or where the Tenant is reasonably believed to have abandoned the premises.</w:t>
       </w:r>
     </w:p>
     <w:p>
       <w:pPr>
-        <w:spacing w:after="80" w:line="254" w:lineRule="auto"/>
+        <w:spacing w:before="0" w:after="120" w:lineRule="auto" w:line="264"/>
+        <w:jc w:val="left"/>
       </w:pPr>
       <w:r>
         <w:rPr>
-          <w:rFonts w:ascii="Aptos" w:hAnsi="Aptos"/>
-          <w:color w:val="1C2722"/>
-          <w:sz w:val="17"/>
+          <w:rFonts w:ascii="Calibri" w:hAnsi="Calibri"/>
+          <w:b w:val="0"/>
+          <w:i w:val="0"/>
+          <w:color w:val="000000"/>
+          <w:sz w:val="22"/>
         </w:rPr>
-        <w:t>The Landlord may not lock out the Tenant, remove the Tenant’s belongings, disconnect essential services, or recover possession except through the lawful process. The parties will first attempt to resolve concerns respectfully in writing. If unresolved, either party may refer the matter to the Rent Control Department, use a lawful alternative dispute-resolution process, or seek the appropriate court remedy. This agreement is governed by the laws of the Republic of Ghana. A term inconsistent with mandatory law is adjusted only to the extent necessary and does not affect the rest of the agreement.</w:t>
+        <w:t>The parties shall communicate respectfully and attempt to resolve issues amicably. Where a dispute remains unresolved, the parties may seek an appropriate lawful remedy, but pending resolution the Landlord's house rules shall continue to apply.</w:t>
       </w:r>
     </w:p>
     <w:p>
       <w:pPr>
-        <w:keepNext/>
-        <w:keepLines/>
-        <w:spacing w:before="160" w:after="60"/>
+        <w:pStyle w:val="Heading1"/>
       </w:pPr>
       <w:r>
-        <w:rPr>
-          <w:rFonts w:ascii="Aptos Display" w:hAnsi="Aptos Display"/>
-          <w:b/>
-          <w:color w:val="164334"/>
-          <w:sz w:val="22"/>
-        </w:rPr>
-        <w:t>10. Communication</w:t>
+        <w:t>8. Termination, Expiry, and Governing Law</w:t>
       </w:r>
     </w:p>
     <w:p>
       <w:pPr>
-        <w:spacing w:after="80" w:line="254" w:lineRule="auto"/>
+        <w:spacing w:before="0" w:after="120" w:lineRule="auto" w:line="264"/>
+        <w:jc w:val="left"/>
       </w:pPr>
       <w:r>
         <w:rPr>
-          <w:rFonts w:ascii="Aptos" w:hAnsi="Aptos"/>
-          <w:color w:val="1C2722"/>
-          <w:sz w:val="17"/>
+          <w:rFonts w:ascii="Calibri" w:hAnsi="Calibri"/>
+          <w:b w:val="0"/>
+          <w:i w:val="0"/>
+          <w:color w:val="000000"/>
+          <w:sz w:val="22"/>
         </w:rPr>
-        <w:t>Routine non-urgent communication may be sent by WhatsApp or text to the phone numbers supplied by the parties. The Tenant must provide prompt written notice of a changed mobile number or address. Formal statutory notices must be served in the manner required by Ghanaian law.</w:t>
+        <w:t>Either party may terminate this Agreement by giving not less than one (1) month's written notice, subject to any outstanding financial obligations already due under this Agreement.</w:t>
       </w:r>
     </w:p>
     <w:p>
       <w:pPr>
-        <w:keepNext/>
-        <w:keepLines/>
-        <w:spacing w:before="160" w:after="60"/>
+        <w:spacing w:before="0" w:after="120" w:lineRule="auto" w:line="264"/>
+        <w:jc w:val="left"/>
       </w:pPr>
       <w:r>
         <w:rPr>
-          <w:rFonts w:ascii="Aptos Display" w:hAnsi="Aptos Display"/>
-          <w:b/>
-          <w:color w:val="164334"/>
+          <w:rFonts w:ascii="Calibri" w:hAnsi="Calibri"/>
+          <w:b w:val="0"/>
+          <w:i w:val="0"/>
+          <w:color w:val="000000"/>
           <w:sz w:val="22"/>
         </w:rPr>
-        <w:t>11. Entire Agreement</w:t>
+        <w:t>The Tenant shall be notified when the tenancy period is approaching expiry. Any renewal or extension shall be by fresh agreement between the parties.</w:t>
       </w:r>
     </w:p>
     <w:p>
       <w:pPr>
-        <w:spacing w:after="80" w:line="254" w:lineRule="auto"/>
+        <w:spacing w:before="0" w:after="120" w:lineRule="auto" w:line="264"/>
+        <w:jc w:val="left"/>
       </w:pPr>
       <w:r>
         <w:rPr>
-          <w:rFonts w:ascii="Aptos" w:hAnsi="Aptos"/>
-          <w:color w:val="1C2722"/>
-          <w:sz w:val="17"/>
+          <w:rFonts w:ascii="Calibri" w:hAnsi="Calibri"/>
+          <w:b w:val="0"/>
+          <w:i w:val="0"/>
+          <w:color w:val="000000"/>
+          <w:sz w:val="22"/>
         </w:rPr>
-        <w:t>This agreement, the signed payment schedule, and the signed move-in condition / inventory schedule record the parties’ agreement about the tenancy. A change is valid only if recorded in writing and signed or otherwise legally accepted by both parties. Nothing in this agreement removes a right or protection that Ghanaian law gives either party.</w:t>
+        <w:t>This Agreement shall be governed by and construed in accordance with the laws of the Republic of Ghana.</w:t>
       </w:r>
     </w:p>
     <w:p>
       <w:pPr>
-        <w:keepNext/>
-        <w:keepLines/>
-        <w:spacing w:before="160" w:after="60"/>
+        <w:pStyle w:val="Heading1"/>
+      </w:pPr>
+      <w:r>
+        <w:t>9. Payment Confirmation</w:t>
+      </w:r>
+    </w:p>
+    <w:p>
+      <w:pPr>
+        <w:spacing w:before="0" w:after="160" w:lineRule="auto" w:line="264"/>
+        <w:jc w:val="left"/>
       </w:pPr>
       <w:r>
         <w:rPr>
-          <w:rFonts w:ascii="Aptos Display" w:hAnsi="Aptos Display"/>
-          <w:b/>
-          <w:color w:val="164334"/>
+          <w:rFonts w:ascii="Calibri" w:hAnsi="Calibri"/>
+          <w:b w:val="0"/>
+          <w:i w:val="0"/>
+          <w:color w:val="000000"/>
           <w:sz w:val="22"/>
         </w:rPr>
-        <w:t>12. Payment Confirmation</w:t>
+        <w:t>Complete this section once the recorded rent payment has been received. The agreement should be signed only after this information has been entered and confirmed by the Landlord.</w:t>
       </w:r>
     </w:p>
     <w:tbl>
       <w:tblPr>
-        <w:tblW w:type="auto" w:w="0"/>
+        <w:tblStyle w:val="TableGrid"/>
+        <w:tblW w:type="dxa" w:w="9360"/>
+        <w:jc w:val="left"/>
+        <w:tblLayout w:type="fixed"/>
         <w:tblLook w:firstColumn="1" w:firstRow="1" w:lastColumn="0" w:lastRow="0" w:noHBand="0" w:noVBand="1" w:val="04A0"/>
+        <w:tblInd w:type="dxa" w:w="120"/>
       </w:tblPr>
       <w:tblGrid>
-        <w:gridCol w:w="5285"/>
-        <w:gridCol w:w="5285"/>
+        <w:gridCol w:w="2700"/>
+        <w:gridCol w:w="6660"/>
       </w:tblGrid>
       <w:tr>
+        <w:trPr/>
         <w:tc>
           <w:tcPr>
-            <w:tcW w:type="dxa" w:w="5285"/>
-            <w:shd w:fill="EEF3EF"/>
+            <w:tcW w:type="dxa" w:w="2700"/>
+            <w:tcMar>
+              <w:top w:w="80" w:type="dxa"/>
+              <w:bottom w:w="80" w:type="dxa"/>
+              <w:start w:w="120" w:type="dxa"/>
+              <w:end w:w="120" w:type="dxa"/>
+            </w:tcMar>
+            <w:tcBorders>
+              <w:top w:val="single" w:sz="6" w:space="0" w:color="D6DDD5"/>
+              <w:left w:val="single" w:sz="6" w:space="0" w:color="D6DDD5"/>
+              <w:bottom w:val="single" w:sz="6" w:space="0" w:color="D6DDD5"/>
+              <w:right w:val="single" w:sz="6" w:space="0" w:color="D6DDD5"/>
+            </w:tcBorders>
             <w:vAlign w:val="center"/>
-            <w:tcBorders>
-              <w:top w:val="single" w:sz="4" w:color="C9D6CC"/>
-              <w:left w:val="single" w:sz="4" w:color="C9D6CC"/>
-              <w:bottom w:val="single" w:sz="4" w:color="C9D6CC"/>
-              <w:right w:val="single" w:sz="4" w:color="C9D6CC"/>
-            </w:tcBorders>
+            <w:shd w:fill="F2F4F7" w:val="clear" w:color="auto"/>
           </w:tcPr>
           <w:p>
             <w:pPr>
-              <w:spacing w:after="0"/>
+              <w:spacing w:before="0" w:after="0" w:lineRule="auto" w:line="264"/>
+              <w:jc w:val="left"/>
             </w:pPr>
-            <w:r/>
             <w:r>
               <w:rPr>
-                <w:rFonts w:ascii="Aptos" w:hAnsi="Aptos"/>
+                <w:rFonts w:ascii="Calibri" w:hAnsi="Calibri"/>
                 <w:b/>
-                <w:color w:val="164334"/>
-                <w:sz w:val="17"/>
+                <w:i w:val="0"/>
+                <w:color w:val="000000"/>
+                <w:sz w:val="22"/>
               </w:rPr>
               <w:t>Amount received</w:t>
             </w:r>
@@ -1273,25 +1753,33 @@
         </w:tc>
         <w:tc>
           <w:tcPr>
-            <w:tcW w:type="dxa" w:w="5285"/>
+            <w:tcW w:type="dxa" w:w="6660"/>
+            <w:tcMar>
+              <w:top w:w="80" w:type="dxa"/>
+              <w:bottom w:w="80" w:type="dxa"/>
+              <w:start w:w="120" w:type="dxa"/>
+              <w:end w:w="120" w:type="dxa"/>
+            </w:tcMar>
+            <w:tcBorders>
+              <w:top w:val="single" w:sz="6" w:space="0" w:color="D6DDD5"/>
+              <w:left w:val="single" w:sz="6" w:space="0" w:color="D6DDD5"/>
+              <w:bottom w:val="single" w:sz="6" w:space="0" w:color="D6DDD5"/>
+              <w:right w:val="single" w:sz="6" w:space="0" w:color="D6DDD5"/>
+            </w:tcBorders>
             <w:vAlign w:val="center"/>
-            <w:tcBorders>
-              <w:top w:val="single" w:sz="4" w:color="C9D6CC"/>
-              <w:left w:val="single" w:sz="4" w:color="C9D6CC"/>
-              <w:bottom w:val="single" w:sz="4" w:color="C9D6CC"/>
-              <w:right w:val="single" w:sz="4" w:color="C9D6CC"/>
-            </w:tcBorders>
           </w:tcPr>
           <w:p>
             <w:pPr>
-              <w:spacing w:after="0"/>
+              <w:spacing w:before="0" w:after="0" w:lineRule="auto" w:line="264"/>
+              <w:jc w:val="left"/>
             </w:pPr>
-            <w:r/>
             <w:r>
               <w:rPr>
-                <w:rFonts w:ascii="Aptos" w:hAnsi="Aptos"/>
+                <w:rFonts w:ascii="Calibri" w:hAnsi="Calibri"/>
                 <w:b w:val="0"/>
-                <w:sz w:val="17"/>
+                <w:i w:val="0"/>
+                <w:color w:val="000000"/>
+                <w:sz w:val="22"/>
               </w:rPr>
               <w:t>[[AMOUNT_RECEIVED]]</w:t>
             </w:r>
@@ -1299,29 +1787,37 @@
         </w:tc>
       </w:tr>
       <w:tr>
+        <w:trPr/>
         <w:tc>
           <w:tcPr>
-            <w:tcW w:type="dxa" w:w="5285"/>
-            <w:shd w:fill="EEF3EF"/>
+            <w:tcW w:type="dxa" w:w="2700"/>
+            <w:tcMar>
+              <w:top w:w="80" w:type="dxa"/>
+              <w:bottom w:w="80" w:type="dxa"/>
+              <w:start w:w="120" w:type="dxa"/>
+              <w:end w:w="120" w:type="dxa"/>
+            </w:tcMar>
+            <w:tcBorders>
+              <w:top w:val="single" w:sz="6" w:space="0" w:color="D6DDD5"/>
+              <w:left w:val="single" w:sz="6" w:space="0" w:color="D6DDD5"/>
+              <w:bottom w:val="single" w:sz="6" w:space="0" w:color="D6DDD5"/>
+              <w:right w:val="single" w:sz="6" w:space="0" w:color="D6DDD5"/>
+            </w:tcBorders>
             <w:vAlign w:val="center"/>
-            <w:tcBorders>
-              <w:top w:val="single" w:sz="4" w:color="C9D6CC"/>
-              <w:left w:val="single" w:sz="4" w:color="C9D6CC"/>
-              <w:bottom w:val="single" w:sz="4" w:color="C9D6CC"/>
-              <w:right w:val="single" w:sz="4" w:color="C9D6CC"/>
-            </w:tcBorders>
+            <w:shd w:fill="F2F4F7" w:val="clear" w:color="auto"/>
           </w:tcPr>
           <w:p>
             <w:pPr>
-              <w:spacing w:after="0"/>
+              <w:spacing w:before="0" w:after="0" w:lineRule="auto" w:line="264"/>
+              <w:jc w:val="left"/>
             </w:pPr>
-            <w:r/>
             <w:r>
               <w:rPr>
-                <w:rFonts w:ascii="Aptos" w:hAnsi="Aptos"/>
+                <w:rFonts w:ascii="Calibri" w:hAnsi="Calibri"/>
                 <w:b/>
-                <w:color w:val="164334"/>
-                <w:sz w:val="17"/>
+                <w:i w:val="0"/>
+                <w:color w:val="000000"/>
+                <w:sz w:val="22"/>
               </w:rPr>
               <w:t>Payment date</w:t>
             </w:r>
@@ -1329,25 +1825,33 @@
         </w:tc>
         <w:tc>
           <w:tcPr>
-            <w:tcW w:type="dxa" w:w="5285"/>
+            <w:tcW w:type="dxa" w:w="6660"/>
+            <w:tcMar>
+              <w:top w:w="80" w:type="dxa"/>
+              <w:bottom w:w="80" w:type="dxa"/>
+              <w:start w:w="120" w:type="dxa"/>
+              <w:end w:w="120" w:type="dxa"/>
+            </w:tcMar>
+            <w:tcBorders>
+              <w:top w:val="single" w:sz="6" w:space="0" w:color="D6DDD5"/>
+              <w:left w:val="single" w:sz="6" w:space="0" w:color="D6DDD5"/>
+              <w:bottom w:val="single" w:sz="6" w:space="0" w:color="D6DDD5"/>
+              <w:right w:val="single" w:sz="6" w:space="0" w:color="D6DDD5"/>
+            </w:tcBorders>
             <w:vAlign w:val="center"/>
-            <w:tcBorders>
-              <w:top w:val="single" w:sz="4" w:color="C9D6CC"/>
-              <w:left w:val="single" w:sz="4" w:color="C9D6CC"/>
-              <w:bottom w:val="single" w:sz="4" w:color="C9D6CC"/>
-              <w:right w:val="single" w:sz="4" w:color="C9D6CC"/>
-            </w:tcBorders>
           </w:tcPr>
           <w:p>
             <w:pPr>
-              <w:spacing w:after="0"/>
+              <w:spacing w:before="0" w:after="0" w:lineRule="auto" w:line="264"/>
+              <w:jc w:val="left"/>
             </w:pPr>
-            <w:r/>
             <w:r>
               <w:rPr>
-                <w:rFonts w:ascii="Aptos" w:hAnsi="Aptos"/>
+                <w:rFonts w:ascii="Calibri" w:hAnsi="Calibri"/>
                 <w:b w:val="0"/>
-                <w:sz w:val="17"/>
+                <w:i w:val="0"/>
+                <w:color w:val="000000"/>
+                <w:sz w:val="22"/>
               </w:rPr>
               <w:t>[[PAYMENT_DATE]]</w:t>
             </w:r>
@@ -1355,29 +1859,37 @@
         </w:tc>
       </w:tr>
       <w:tr>
+        <w:trPr/>
         <w:tc>
           <w:tcPr>
-            <w:tcW w:type="dxa" w:w="5285"/>
-            <w:shd w:fill="EEF3EF"/>
+            <w:tcW w:type="dxa" w:w="2700"/>
+            <w:tcMar>
+              <w:top w:w="80" w:type="dxa"/>
+              <w:bottom w:w="80" w:type="dxa"/>
+              <w:start w:w="120" w:type="dxa"/>
+              <w:end w:w="120" w:type="dxa"/>
+            </w:tcMar>
+            <w:tcBorders>
+              <w:top w:val="single" w:sz="6" w:space="0" w:color="D6DDD5"/>
+              <w:left w:val="single" w:sz="6" w:space="0" w:color="D6DDD5"/>
+              <w:bottom w:val="single" w:sz="6" w:space="0" w:color="D6DDD5"/>
+              <w:right w:val="single" w:sz="6" w:space="0" w:color="D6DDD5"/>
+            </w:tcBorders>
             <w:vAlign w:val="center"/>
-            <w:tcBorders>
-              <w:top w:val="single" w:sz="4" w:color="C9D6CC"/>
-              <w:left w:val="single" w:sz="4" w:color="C9D6CC"/>
-              <w:bottom w:val="single" w:sz="4" w:color="C9D6CC"/>
-              <w:right w:val="single" w:sz="4" w:color="C9D6CC"/>
-            </w:tcBorders>
+            <w:shd w:fill="F2F4F7" w:val="clear" w:color="auto"/>
           </w:tcPr>
           <w:p>
             <w:pPr>
-              <w:spacing w:after="0"/>
+              <w:spacing w:before="0" w:after="0" w:lineRule="auto" w:line="264"/>
+              <w:jc w:val="left"/>
             </w:pPr>
-            <w:r/>
             <w:r>
               <w:rPr>
-                <w:rFonts w:ascii="Aptos" w:hAnsi="Aptos"/>
+                <w:rFonts w:ascii="Calibri" w:hAnsi="Calibri"/>
                 <w:b/>
-                <w:color w:val="164334"/>
-                <w:sz w:val="17"/>
+                <w:i w:val="0"/>
+                <w:color w:val="000000"/>
+                <w:sz w:val="22"/>
               </w:rPr>
               <w:t>Payment method</w:t>
             </w:r>
@@ -1385,25 +1897,33 @@
         </w:tc>
         <w:tc>
           <w:tcPr>
-            <w:tcW w:type="dxa" w:w="5285"/>
+            <w:tcW w:type="dxa" w:w="6660"/>
+            <w:tcMar>
+              <w:top w:w="80" w:type="dxa"/>
+              <w:bottom w:w="80" w:type="dxa"/>
+              <w:start w:w="120" w:type="dxa"/>
+              <w:end w:w="120" w:type="dxa"/>
+            </w:tcMar>
+            <w:tcBorders>
+              <w:top w:val="single" w:sz="6" w:space="0" w:color="D6DDD5"/>
+              <w:left w:val="single" w:sz="6" w:space="0" w:color="D6DDD5"/>
+              <w:bottom w:val="single" w:sz="6" w:space="0" w:color="D6DDD5"/>
+              <w:right w:val="single" w:sz="6" w:space="0" w:color="D6DDD5"/>
+            </w:tcBorders>
             <w:vAlign w:val="center"/>
-            <w:tcBorders>
-              <w:top w:val="single" w:sz="4" w:color="C9D6CC"/>
-              <w:left w:val="single" w:sz="4" w:color="C9D6CC"/>
-              <w:bottom w:val="single" w:sz="4" w:color="C9D6CC"/>
-              <w:right w:val="single" w:sz="4" w:color="C9D6CC"/>
-            </w:tcBorders>
           </w:tcPr>
           <w:p>
             <w:pPr>
-              <w:spacing w:after="0"/>
+              <w:spacing w:before="0" w:after="0" w:lineRule="auto" w:line="264"/>
+              <w:jc w:val="left"/>
             </w:pPr>
-            <w:r/>
             <w:r>
               <w:rPr>
-                <w:rFonts w:ascii="Aptos" w:hAnsi="Aptos"/>
+                <w:rFonts w:ascii="Calibri" w:hAnsi="Calibri"/>
                 <w:b w:val="0"/>
-                <w:sz w:val="17"/>
+                <w:i w:val="0"/>
+                <w:color w:val="000000"/>
+                <w:sz w:val="22"/>
               </w:rPr>
               <w:t>[[PAYMENT_METHOD]]</w:t>
             </w:r>
@@ -1411,29 +1931,37 @@
         </w:tc>
       </w:tr>
       <w:tr>
+        <w:trPr/>
         <w:tc>
           <w:tcPr>
-            <w:tcW w:type="dxa" w:w="5285"/>
-            <w:shd w:fill="EEF3EF"/>
+            <w:tcW w:type="dxa" w:w="2700"/>
+            <w:tcMar>
+              <w:top w:w="80" w:type="dxa"/>
+              <w:bottom w:w="80" w:type="dxa"/>
+              <w:start w:w="120" w:type="dxa"/>
+              <w:end w:w="120" w:type="dxa"/>
+            </w:tcMar>
+            <w:tcBorders>
+              <w:top w:val="single" w:sz="6" w:space="0" w:color="D6DDD5"/>
+              <w:left w:val="single" w:sz="6" w:space="0" w:color="D6DDD5"/>
+              <w:bottom w:val="single" w:sz="6" w:space="0" w:color="D6DDD5"/>
+              <w:right w:val="single" w:sz="6" w:space="0" w:color="D6DDD5"/>
+            </w:tcBorders>
             <w:vAlign w:val="center"/>
-            <w:tcBorders>
-              <w:top w:val="single" w:sz="4" w:color="C9D6CC"/>
-              <w:left w:val="single" w:sz="4" w:color="C9D6CC"/>
-              <w:bottom w:val="single" w:sz="4" w:color="C9D6CC"/>
-              <w:right w:val="single" w:sz="4" w:color="C9D6CC"/>
-            </w:tcBorders>
+            <w:shd w:fill="F2F4F7" w:val="clear" w:color="auto"/>
           </w:tcPr>
           <w:p>
             <w:pPr>
-              <w:spacing w:after="0"/>
+              <w:spacing w:before="0" w:after="0" w:lineRule="auto" w:line="264"/>
+              <w:jc w:val="left"/>
             </w:pPr>
-            <w:r/>
             <w:r>
               <w:rPr>
-                <w:rFonts w:ascii="Aptos" w:hAnsi="Aptos"/>
+                <w:rFonts w:ascii="Calibri" w:hAnsi="Calibri"/>
                 <w:b/>
-                <w:color w:val="164334"/>
-                <w:sz w:val="17"/>
+                <w:i w:val="0"/>
+                <w:color w:val="000000"/>
+                <w:sz w:val="22"/>
               </w:rPr>
               <w:t>Reference / transaction ID</w:t>
             </w:r>
@@ -1441,25 +1969,33 @@
         </w:tc>
         <w:tc>
           <w:tcPr>
-            <w:tcW w:type="dxa" w:w="5285"/>
+            <w:tcW w:type="dxa" w:w="6660"/>
+            <w:tcMar>
+              <w:top w:w="80" w:type="dxa"/>
+              <w:bottom w:w="80" w:type="dxa"/>
+              <w:start w:w="120" w:type="dxa"/>
+              <w:end w:w="120" w:type="dxa"/>
+            </w:tcMar>
+            <w:tcBorders>
+              <w:top w:val="single" w:sz="6" w:space="0" w:color="D6DDD5"/>
+              <w:left w:val="single" w:sz="6" w:space="0" w:color="D6DDD5"/>
+              <w:bottom w:val="single" w:sz="6" w:space="0" w:color="D6DDD5"/>
+              <w:right w:val="single" w:sz="6" w:space="0" w:color="D6DDD5"/>
+            </w:tcBorders>
             <w:vAlign w:val="center"/>
-            <w:tcBorders>
-              <w:top w:val="single" w:sz="4" w:color="C9D6CC"/>
-              <w:left w:val="single" w:sz="4" w:color="C9D6CC"/>
-              <w:bottom w:val="single" w:sz="4" w:color="C9D6CC"/>
-              <w:right w:val="single" w:sz="4" w:color="C9D6CC"/>
-            </w:tcBorders>
           </w:tcPr>
           <w:p>
             <w:pPr>
-              <w:spacing w:after="0"/>
+              <w:spacing w:before="0" w:after="0" w:lineRule="auto" w:line="264"/>
+              <w:jc w:val="left"/>
             </w:pPr>
-            <w:r/>
             <w:r>
               <w:rPr>
-                <w:rFonts w:ascii="Aptos" w:hAnsi="Aptos"/>
+                <w:rFonts w:ascii="Calibri" w:hAnsi="Calibri"/>
                 <w:b w:val="0"/>
-                <w:sz w:val="17"/>
+                <w:i w:val="0"/>
+                <w:color w:val="000000"/>
+                <w:sz w:val="22"/>
               </w:rPr>
               <w:t>[[PAYMENT_REFERENCE]]</w:t>
             </w:r>
@@ -1467,29 +2003,37 @@
         </w:tc>
       </w:tr>
       <w:tr>
+        <w:trPr/>
         <w:tc>
           <w:tcPr>
-            <w:tcW w:type="dxa" w:w="5285"/>
-            <w:shd w:fill="EEF3EF"/>
+            <w:tcW w:type="dxa" w:w="2700"/>
+            <w:tcMar>
+              <w:top w:w="80" w:type="dxa"/>
+              <w:bottom w:w="80" w:type="dxa"/>
+              <w:start w:w="120" w:type="dxa"/>
+              <w:end w:w="120" w:type="dxa"/>
+            </w:tcMar>
+            <w:tcBorders>
+              <w:top w:val="single" w:sz="6" w:space="0" w:color="D6DDD5"/>
+              <w:left w:val="single" w:sz="6" w:space="0" w:color="D6DDD5"/>
+              <w:bottom w:val="single" w:sz="6" w:space="0" w:color="D6DDD5"/>
+              <w:right w:val="single" w:sz="6" w:space="0" w:color="D6DDD5"/>
+            </w:tcBorders>
             <w:vAlign w:val="center"/>
-            <w:tcBorders>
-              <w:top w:val="single" w:sz="4" w:color="C9D6CC"/>
-              <w:left w:val="single" w:sz="4" w:color="C9D6CC"/>
-              <w:bottom w:val="single" w:sz="4" w:color="C9D6CC"/>
-              <w:right w:val="single" w:sz="4" w:color="C9D6CC"/>
-            </w:tcBorders>
+            <w:shd w:fill="F2F4F7" w:val="clear" w:color="auto"/>
           </w:tcPr>
           <w:p>
             <w:pPr>
-              <w:spacing w:after="0"/>
+              <w:spacing w:before="0" w:after="0" w:lineRule="auto" w:line="264"/>
+              <w:jc w:val="left"/>
             </w:pPr>
-            <w:r/>
             <w:r>
               <w:rPr>
-                <w:rFonts w:ascii="Aptos" w:hAnsi="Aptos"/>
+                <w:rFonts w:ascii="Calibri" w:hAnsi="Calibri"/>
                 <w:b/>
-                <w:color w:val="164334"/>
-                <w:sz w:val="17"/>
+                <w:i w:val="0"/>
+                <w:color w:val="000000"/>
+                <w:sz w:val="22"/>
               </w:rPr>
               <w:t>Received by</w:t>
             </w:r>
@@ -1497,25 +2041,33 @@
         </w:tc>
         <w:tc>
           <w:tcPr>
-            <w:tcW w:type="dxa" w:w="5285"/>
+            <w:tcW w:type="dxa" w:w="6660"/>
+            <w:tcMar>
+              <w:top w:w="80" w:type="dxa"/>
+              <w:bottom w:w="80" w:type="dxa"/>
+              <w:start w:w="120" w:type="dxa"/>
+              <w:end w:w="120" w:type="dxa"/>
+            </w:tcMar>
+            <w:tcBorders>
+              <w:top w:val="single" w:sz="6" w:space="0" w:color="D6DDD5"/>
+              <w:left w:val="single" w:sz="6" w:space="0" w:color="D6DDD5"/>
+              <w:bottom w:val="single" w:sz="6" w:space="0" w:color="D6DDD5"/>
+              <w:right w:val="single" w:sz="6" w:space="0" w:color="D6DDD5"/>
+            </w:tcBorders>
             <w:vAlign w:val="center"/>
-            <w:tcBorders>
-              <w:top w:val="single" w:sz="4" w:color="C9D6CC"/>
-              <w:left w:val="single" w:sz="4" w:color="C9D6CC"/>
-              <w:bottom w:val="single" w:sz="4" w:color="C9D6CC"/>
-              <w:right w:val="single" w:sz="4" w:color="C9D6CC"/>
-            </w:tcBorders>
           </w:tcPr>
           <w:p>
             <w:pPr>
-              <w:spacing w:after="0"/>
+              <w:spacing w:before="0" w:after="0" w:lineRule="auto" w:line="264"/>
+              <w:jc w:val="left"/>
             </w:pPr>
-            <w:r/>
             <w:r>
               <w:rPr>
-                <w:rFonts w:ascii="Aptos" w:hAnsi="Aptos"/>
+                <w:rFonts w:ascii="Calibri" w:hAnsi="Calibri"/>
                 <w:b w:val="0"/>
-                <w:sz w:val="17"/>
+                <w:i w:val="0"/>
+                <w:color w:val="000000"/>
+                <w:sz w:val="22"/>
               </w:rPr>
               <w:t>[[RECEIVED_BY]]</w:t>
             </w:r>
@@ -1523,29 +2075,37 @@
         </w:tc>
       </w:tr>
       <w:tr>
+        <w:trPr/>
         <w:tc>
           <w:tcPr>
-            <w:tcW w:type="dxa" w:w="5285"/>
-            <w:shd w:fill="EEF3EF"/>
+            <w:tcW w:type="dxa" w:w="2700"/>
+            <w:tcMar>
+              <w:top w:w="80" w:type="dxa"/>
+              <w:bottom w:w="80" w:type="dxa"/>
+              <w:start w:w="120" w:type="dxa"/>
+              <w:end w:w="120" w:type="dxa"/>
+            </w:tcMar>
+            <w:tcBorders>
+              <w:top w:val="single" w:sz="6" w:space="0" w:color="D6DDD5"/>
+              <w:left w:val="single" w:sz="6" w:space="0" w:color="D6DDD5"/>
+              <w:bottom w:val="single" w:sz="6" w:space="0" w:color="D6DDD5"/>
+              <w:right w:val="single" w:sz="6" w:space="0" w:color="D6DDD5"/>
+            </w:tcBorders>
             <w:vAlign w:val="center"/>
-            <w:tcBorders>
-              <w:top w:val="single" w:sz="4" w:color="C9D6CC"/>
-              <w:left w:val="single" w:sz="4" w:color="C9D6CC"/>
-              <w:bottom w:val="single" w:sz="4" w:color="C9D6CC"/>
-              <w:right w:val="single" w:sz="4" w:color="C9D6CC"/>
-            </w:tcBorders>
+            <w:shd w:fill="F2F4F7" w:val="clear" w:color="auto"/>
           </w:tcPr>
           <w:p>
             <w:pPr>
-              <w:spacing w:after="0"/>
+              <w:spacing w:before="0" w:after="0" w:lineRule="auto" w:line="264"/>
+              <w:jc w:val="left"/>
             </w:pPr>
-            <w:r/>
             <w:r>
               <w:rPr>
-                <w:rFonts w:ascii="Aptos" w:hAnsi="Aptos"/>
+                <w:rFonts w:ascii="Calibri" w:hAnsi="Calibri"/>
                 <w:b/>
-                <w:color w:val="164334"/>
-                <w:sz w:val="17"/>
+                <w:i w:val="0"/>
+                <w:color w:val="000000"/>
+                <w:sz w:val="22"/>
               </w:rPr>
               <w:t>Agreement effective from</w:t>
             </w:r>
@@ -1553,25 +2113,33 @@
         </w:tc>
         <w:tc>
           <w:tcPr>
-            <w:tcW w:type="dxa" w:w="5285"/>
+            <w:tcW w:type="dxa" w:w="6660"/>
+            <w:tcMar>
+              <w:top w:w="80" w:type="dxa"/>
+              <w:bottom w:w="80" w:type="dxa"/>
+              <w:start w:w="120" w:type="dxa"/>
+              <w:end w:w="120" w:type="dxa"/>
+            </w:tcMar>
+            <w:tcBorders>
+              <w:top w:val="single" w:sz="6" w:space="0" w:color="D6DDD5"/>
+              <w:left w:val="single" w:sz="6" w:space="0" w:color="D6DDD5"/>
+              <w:bottom w:val="single" w:sz="6" w:space="0" w:color="D6DDD5"/>
+              <w:right w:val="single" w:sz="6" w:space="0" w:color="D6DDD5"/>
+            </w:tcBorders>
             <w:vAlign w:val="center"/>
-            <w:tcBorders>
-              <w:top w:val="single" w:sz="4" w:color="C9D6CC"/>
-              <w:left w:val="single" w:sz="4" w:color="C9D6CC"/>
-              <w:bottom w:val="single" w:sz="4" w:color="C9D6CC"/>
-              <w:right w:val="single" w:sz="4" w:color="C9D6CC"/>
-            </w:tcBorders>
           </w:tcPr>
           <w:p>
             <w:pPr>
-              <w:spacing w:after="0"/>
+              <w:spacing w:before="0" w:after="0" w:lineRule="auto" w:line="264"/>
+              <w:jc w:val="left"/>
             </w:pPr>
-            <w:r/>
             <w:r>
               <w:rPr>
-                <w:rFonts w:ascii="Aptos" w:hAnsi="Aptos"/>
+                <w:rFonts w:ascii="Calibri" w:hAnsi="Calibri"/>
                 <w:b w:val="0"/>
-                <w:sz w:val="17"/>
+                <w:i w:val="0"/>
+                <w:color w:val="000000"/>
+                <w:sz w:val="22"/>
               </w:rPr>
               <w:t>[[AGREEMENT_EFFECTIVE_FROM]]</w:t>
             </w:r>
@@ -1581,472 +2149,333 @@
     </w:tbl>
     <w:p>
       <w:pPr>
-        <w:keepNext/>
-        <w:keepLines/>
-        <w:spacing w:before="160" w:after="60"/>
+        <w:pStyle w:val="Heading1"/>
       </w:pPr>
       <w:r>
-        <w:rPr>
-          <w:rFonts w:ascii="Aptos Display" w:hAnsi="Aptos Display"/>
-          <w:b/>
-          <w:color w:val="164334"/>
-          <w:sz w:val="22"/>
-        </w:rPr>
-        <w:t>13. Signatures</w:t>
+        <w:t>10. Signatures</w:t>
       </w:r>
     </w:p>
     <w:p>
       <w:pPr>
-        <w:spacing w:after="80" w:line="254" w:lineRule="auto"/>
+        <w:spacing w:before="0" w:after="160" w:lineRule="auto" w:line="264"/>
+        <w:jc w:val="left"/>
       </w:pPr>
       <w:r>
         <w:rPr>
-          <w:rFonts w:ascii="Aptos" w:hAnsi="Aptos"/>
-          <w:color w:val="1C2722"/>
-          <w:sz w:val="17"/>
+          <w:rFonts w:ascii="Calibri" w:hAnsi="Calibri"/>
+          <w:b w:val="0"/>
+          <w:i w:val="0"/>
+          <w:color w:val="000000"/>
+          <w:sz w:val="22"/>
         </w:rPr>
-        <w:t>Signed by the parties on the dates below. Each party should retain a complete signed copy of this agreement and its schedules.</w:t>
+        <w:t>IN WITNESS WHEREOF, the parties hereto have executed this Tenancy Agreement on the date written against their signatures below.</w:t>
       </w:r>
     </w:p>
     <w:tbl>
       <w:tblPr>
-        <w:tblW w:type="auto" w:w="0"/>
+        <w:tblW w:type="dxa" w:w="9360"/>
+        <w:jc w:val="left"/>
+        <w:tblLayout w:type="fixed"/>
         <w:tblLook w:firstColumn="1" w:firstRow="1" w:lastColumn="0" w:lastRow="0" w:noHBand="0" w:noVBand="1" w:val="04A0"/>
+        <w:tblInd w:type="dxa" w:w="120"/>
       </w:tblPr>
       <w:tblGrid>
-        <w:gridCol w:w="5285"/>
-        <w:gridCol w:w="5285"/>
+        <w:gridCol w:w="4680"/>
+        <w:gridCol w:w="4680"/>
       </w:tblGrid>
       <w:tr>
+        <w:trPr/>
         <w:tc>
           <w:tcPr>
-            <w:tcW w:type="dxa" w:w="5285"/>
+            <w:tcW w:type="dxa" w:w="4680"/>
+            <w:tcMar>
+              <w:top w:w="80" w:type="dxa"/>
+              <w:bottom w:w="80" w:type="dxa"/>
+              <w:start w:w="120" w:type="dxa"/>
+              <w:end w:w="120" w:type="dxa"/>
+            </w:tcMar>
             <w:vAlign w:val="center"/>
             <w:tcBorders>
-              <w:top w:val="single" w:sz="4" w:color="C9D6CC"/>
-              <w:left w:val="single" w:sz="4" w:color="C9D6CC"/>
-              <w:bottom w:val="single" w:sz="4" w:color="C9D6CC"/>
-              <w:right w:val="single" w:sz="4" w:color="C9D6CC"/>
+              <w:top w:val="nil"/>
+              <w:left w:val="nil"/>
+              <w:bottom w:val="nil"/>
+              <w:right w:val="nil"/>
             </w:tcBorders>
           </w:tcPr>
           <w:p>
             <w:pPr>
-              <w:spacing w:after="0"/>
+              <w:spacing w:before="0" w:after="0" w:lineRule="auto" w:line="264"/>
+              <w:jc w:val="left"/>
             </w:pPr>
-            <w:r/>
             <w:r>
               <w:rPr>
-                <w:rFonts w:ascii="Aptos" w:hAnsi="Aptos"/>
-                <w:b/>
-                <w:color w:val="164334"/>
-                <w:sz w:val="17"/>
+                <w:rFonts w:ascii="Calibri" w:hAnsi="Calibri"/>
+                <w:b w:val="0"/>
+                <w:i w:val="0"/>
+                <w:color w:val="000000"/>
+                <w:sz w:val="22"/>
               </w:rPr>
-              <w:t>Landlord / Manager</w:t>
+              <w:t>Landlord Signature</w:t>
             </w:r>
           </w:p>
         </w:tc>
         <w:tc>
           <w:tcPr>
-            <w:tcW w:type="dxa" w:w="5285"/>
+            <w:tcW w:type="dxa" w:w="4680"/>
+            <w:tcMar>
+              <w:top w:w="80" w:type="dxa"/>
+              <w:bottom w:w="80" w:type="dxa"/>
+              <w:start w:w="120" w:type="dxa"/>
+              <w:end w:w="120" w:type="dxa"/>
+            </w:tcMar>
             <w:vAlign w:val="center"/>
             <w:tcBorders>
-              <w:top w:val="single" w:sz="4" w:color="C9D6CC"/>
-              <w:left w:val="single" w:sz="4" w:color="C9D6CC"/>
-              <w:bottom w:val="single" w:sz="4" w:color="C9D6CC"/>
-              <w:right w:val="single" w:sz="4" w:color="C9D6CC"/>
+              <w:top w:val="nil"/>
+              <w:left w:val="nil"/>
+              <w:bottom w:val="nil"/>
+              <w:right w:val="nil"/>
             </w:tcBorders>
           </w:tcPr>
           <w:p>
             <w:pPr>
-              <w:spacing w:after="0"/>
+              <w:spacing w:before="0" w:after="0" w:lineRule="auto" w:line="264"/>
+              <w:jc w:val="left"/>
             </w:pPr>
-            <w:r/>
             <w:r>
               <w:rPr>
-                <w:rFonts w:ascii="Aptos" w:hAnsi="Aptos"/>
-                <w:b/>
-                <w:color w:val="164334"/>
-                <w:sz w:val="17"/>
+                <w:rFonts w:ascii="Calibri" w:hAnsi="Calibri"/>
+                <w:b w:val="0"/>
+                <w:i w:val="0"/>
+                <w:color w:val="000000"/>
+                <w:sz w:val="22"/>
               </w:rPr>
-              <w:t>Tenant</w:t>
+              <w:t>Tenant Signature</w:t>
             </w:r>
           </w:p>
         </w:tc>
       </w:tr>
       <w:tr>
+        <w:trPr/>
         <w:tc>
           <w:tcPr>
-            <w:tcW w:type="dxa" w:w="5285"/>
+            <w:tcW w:type="dxa" w:w="4680"/>
+            <w:tcMar>
+              <w:top w:w="80" w:type="dxa"/>
+              <w:bottom w:w="80" w:type="dxa"/>
+              <w:start w:w="120" w:type="dxa"/>
+              <w:end w:w="120" w:type="dxa"/>
+            </w:tcMar>
             <w:vAlign w:val="center"/>
             <w:tcBorders>
-              <w:top w:val="single" w:sz="4" w:color="C9D6CC"/>
-              <w:left w:val="single" w:sz="4" w:color="C9D6CC"/>
-              <w:bottom w:val="single" w:sz="4" w:color="C9D6CC"/>
-              <w:right w:val="single" w:sz="4" w:color="C9D6CC"/>
+              <w:top w:val="nil"/>
+              <w:left w:val="nil"/>
+              <w:bottom w:val="nil"/>
+              <w:right w:val="nil"/>
             </w:tcBorders>
           </w:tcPr>
           <w:p>
             <w:pPr>
-              <w:spacing w:after="0"/>
+              <w:spacing w:before="0" w:after="0" w:lineRule="auto" w:line="264"/>
+              <w:jc w:val="left"/>
             </w:pPr>
-            <w:r/>
             <w:r>
               <w:rPr>
-                <w:rFonts w:ascii="Aptos" w:hAnsi="Aptos"/>
+                <w:rFonts w:ascii="Calibri" w:hAnsi="Calibri"/>
                 <w:b w:val="0"/>
-                <w:sz w:val="17"/>
+                <w:i w:val="0"/>
+                <w:color w:val="000000"/>
+                <w:sz w:val="22"/>
               </w:rPr>
-              <w:t>Signature: ____________________________________</w:t>
+              <w:t>_______________________________</w:t>
             </w:r>
           </w:p>
         </w:tc>
         <w:tc>
           <w:tcPr>
-            <w:tcW w:type="dxa" w:w="5285"/>
+            <w:tcW w:type="dxa" w:w="4680"/>
+            <w:tcMar>
+              <w:top w:w="80" w:type="dxa"/>
+              <w:bottom w:w="80" w:type="dxa"/>
+              <w:start w:w="120" w:type="dxa"/>
+              <w:end w:w="120" w:type="dxa"/>
+            </w:tcMar>
             <w:vAlign w:val="center"/>
             <w:tcBorders>
-              <w:top w:val="single" w:sz="4" w:color="C9D6CC"/>
-              <w:left w:val="single" w:sz="4" w:color="C9D6CC"/>
-              <w:bottom w:val="single" w:sz="4" w:color="C9D6CC"/>
-              <w:right w:val="single" w:sz="4" w:color="C9D6CC"/>
+              <w:top w:val="nil"/>
+              <w:left w:val="nil"/>
+              <w:bottom w:val="nil"/>
+              <w:right w:val="nil"/>
             </w:tcBorders>
           </w:tcPr>
           <w:p>
             <w:pPr>
-              <w:spacing w:after="0"/>
+              <w:spacing w:before="0" w:after="0" w:lineRule="auto" w:line="264"/>
+              <w:jc w:val="left"/>
             </w:pPr>
-            <w:r/>
             <w:r>
               <w:rPr>
-                <w:rFonts w:ascii="Aptos" w:hAnsi="Aptos"/>
+                <w:rFonts w:ascii="Calibri" w:hAnsi="Calibri"/>
                 <w:b w:val="0"/>
-                <w:sz w:val="17"/>
+                <w:i w:val="0"/>
+                <w:color w:val="000000"/>
+                <w:sz w:val="22"/>
               </w:rPr>
-              <w:t>Signature: ____________________________________</w:t>
+              <w:t>_______________________________</w:t>
             </w:r>
           </w:p>
         </w:tc>
       </w:tr>
       <w:tr>
+        <w:trPr/>
         <w:tc>
           <w:tcPr>
-            <w:tcW w:type="dxa" w:w="5285"/>
+            <w:tcW w:type="dxa" w:w="4680"/>
+            <w:tcMar>
+              <w:top w:w="80" w:type="dxa"/>
+              <w:bottom w:w="80" w:type="dxa"/>
+              <w:start w:w="120" w:type="dxa"/>
+              <w:end w:w="120" w:type="dxa"/>
+            </w:tcMar>
             <w:vAlign w:val="center"/>
             <w:tcBorders>
-              <w:top w:val="single" w:sz="4" w:color="C9D6CC"/>
-              <w:left w:val="single" w:sz="4" w:color="C9D6CC"/>
-              <w:bottom w:val="single" w:sz="4" w:color="C9D6CC"/>
-              <w:right w:val="single" w:sz="4" w:color="C9D6CC"/>
+              <w:top w:val="nil"/>
+              <w:left w:val="nil"/>
+              <w:bottom w:val="nil"/>
+              <w:right w:val="nil"/>
             </w:tcBorders>
           </w:tcPr>
           <w:p>
             <w:pPr>
-              <w:spacing w:after="0"/>
+              <w:spacing w:before="0" w:after="0" w:lineRule="auto" w:line="264"/>
+              <w:jc w:val="left"/>
             </w:pPr>
-            <w:r/>
             <w:r>
               <w:rPr>
-                <w:rFonts w:ascii="Aptos" w:hAnsi="Aptos"/>
+                <w:rFonts w:ascii="Calibri" w:hAnsi="Calibri"/>
                 <w:b w:val="0"/>
-                <w:sz w:val="17"/>
+                <w:i w:val="0"/>
+                <w:color w:val="000000"/>
+                <w:sz w:val="22"/>
               </w:rPr>
-              <w:t>Name: Philip Boakye</w:t>
-              <w:br/>
-              <w:t>Date: ________________________________________</w:t>
+              <w:t>Philip Boakye</w:t>
             </w:r>
           </w:p>
         </w:tc>
         <w:tc>
           <w:tcPr>
-            <w:tcW w:type="dxa" w:w="5285"/>
+            <w:tcW w:type="dxa" w:w="4680"/>
+            <w:tcMar>
+              <w:top w:w="80" w:type="dxa"/>
+              <w:bottom w:w="80" w:type="dxa"/>
+              <w:start w:w="120" w:type="dxa"/>
+              <w:end w:w="120" w:type="dxa"/>
+            </w:tcMar>
             <w:vAlign w:val="center"/>
             <w:tcBorders>
-              <w:top w:val="single" w:sz="4" w:color="C9D6CC"/>
-              <w:left w:val="single" w:sz="4" w:color="C9D6CC"/>
-              <w:bottom w:val="single" w:sz="4" w:color="C9D6CC"/>
-              <w:right w:val="single" w:sz="4" w:color="C9D6CC"/>
+              <w:top w:val="nil"/>
+              <w:left w:val="nil"/>
+              <w:bottom w:val="nil"/>
+              <w:right w:val="nil"/>
             </w:tcBorders>
           </w:tcPr>
           <w:p>
             <w:pPr>
-              <w:spacing w:after="0"/>
+              <w:spacing w:before="0" w:after="0" w:lineRule="auto" w:line="264"/>
+              <w:jc w:val="left"/>
             </w:pPr>
-            <w:r/>
             <w:r>
               <w:rPr>
-                <w:rFonts w:ascii="Aptos" w:hAnsi="Aptos"/>
+                <w:rFonts w:ascii="Calibri" w:hAnsi="Calibri"/>
                 <w:b w:val="0"/>
-                <w:sz w:val="17"/>
+                <w:i w:val="0"/>
+                <w:color w:val="000000"/>
+                <w:sz w:val="22"/>
               </w:rPr>
-              <w:t>Name: [[TENANT_NAME]]</w:t>
-              <w:br/>
-              <w:t>Date: ________________________________________</w:t>
+              <w:t>[[TENANT_NAME]]</w:t>
+            </w:r>
+          </w:p>
+        </w:tc>
+      </w:tr>
+      <w:tr>
+        <w:trPr/>
+        <w:tc>
+          <w:tcPr>
+            <w:tcW w:type="dxa" w:w="4680"/>
+            <w:tcMar>
+              <w:top w:w="80" w:type="dxa"/>
+              <w:bottom w:w="80" w:type="dxa"/>
+              <w:start w:w="120" w:type="dxa"/>
+              <w:end w:w="120" w:type="dxa"/>
+            </w:tcMar>
+            <w:vAlign w:val="center"/>
+            <w:tcBorders>
+              <w:top w:val="nil"/>
+              <w:left w:val="nil"/>
+              <w:bottom w:val="nil"/>
+              <w:right w:val="nil"/>
+            </w:tcBorders>
+          </w:tcPr>
+          <w:p>
+            <w:pPr>
+              <w:spacing w:before="0" w:after="0" w:lineRule="auto" w:line="264"/>
+              <w:jc w:val="left"/>
+            </w:pPr>
+            <w:r>
+              <w:rPr>
+                <w:rFonts w:ascii="Calibri" w:hAnsi="Calibri"/>
+                <w:b w:val="0"/>
+                <w:i w:val="0"/>
+                <w:color w:val="000000"/>
+                <w:sz w:val="22"/>
+              </w:rPr>
+              <w:t>Date: _________________________</w:t>
+            </w:r>
+          </w:p>
+        </w:tc>
+        <w:tc>
+          <w:tcPr>
+            <w:tcW w:type="dxa" w:w="4680"/>
+            <w:tcMar>
+              <w:top w:w="80" w:type="dxa"/>
+              <w:bottom w:w="80" w:type="dxa"/>
+              <w:start w:w="120" w:type="dxa"/>
+              <w:end w:w="120" w:type="dxa"/>
+            </w:tcMar>
+            <w:vAlign w:val="center"/>
+            <w:tcBorders>
+              <w:top w:val="nil"/>
+              <w:left w:val="nil"/>
+              <w:bottom w:val="nil"/>
+              <w:right w:val="nil"/>
+            </w:tcBorders>
+          </w:tcPr>
+          <w:p>
+            <w:pPr>
+              <w:spacing w:before="0" w:after="0" w:lineRule="auto" w:line="264"/>
+              <w:jc w:val="left"/>
+            </w:pPr>
+            <w:r>
+              <w:rPr>
+                <w:rFonts w:ascii="Calibri" w:hAnsi="Calibri"/>
+                <w:b w:val="0"/>
+                <w:i w:val="0"/>
+                <w:color w:val="000000"/>
+                <w:sz w:val="22"/>
+              </w:rPr>
+              <w:t>Date: _________________________</w:t>
             </w:r>
           </w:p>
         </w:tc>
       </w:tr>
     </w:tbl>
-    <w:p>
-      <w:pPr>
-        <w:keepNext/>
-        <w:keepLines/>
-        <w:spacing w:before="160" w:after="60"/>
-      </w:pPr>
-      <w:r>
-        <w:rPr>
-          <w:rFonts w:ascii="Aptos Display" w:hAnsi="Aptos Display"/>
-          <w:b/>
-          <w:color w:val="164334"/>
-          <w:sz w:val="22"/>
-        </w:rPr>
-        <w:t>14. Witnesses</w:t>
-      </w:r>
-    </w:p>
-    <w:tbl>
-      <w:tblPr>
-        <w:tblW w:type="auto" w:w="0"/>
-        <w:tblLook w:firstColumn="1" w:firstRow="1" w:lastColumn="0" w:lastRow="0" w:noHBand="0" w:noVBand="1" w:val="04A0"/>
-      </w:tblPr>
-      <w:tblGrid>
-        <w:gridCol w:w="5285"/>
-        <w:gridCol w:w="5285"/>
-      </w:tblGrid>
-      <w:tr>
-        <w:tc>
-          <w:tcPr>
-            <w:tcW w:type="dxa" w:w="5285"/>
-            <w:vAlign w:val="center"/>
-            <w:tcBorders>
-              <w:top w:val="single" w:sz="4" w:color="C9D6CC"/>
-              <w:left w:val="single" w:sz="4" w:color="C9D6CC"/>
-              <w:bottom w:val="single" w:sz="4" w:color="C9D6CC"/>
-              <w:right w:val="single" w:sz="4" w:color="C9D6CC"/>
-            </w:tcBorders>
-          </w:tcPr>
-          <w:p>
-            <w:pPr>
-              <w:spacing w:after="0"/>
-            </w:pPr>
-            <w:r/>
-            <w:r>
-              <w:rPr>
-                <w:rFonts w:ascii="Aptos" w:hAnsi="Aptos"/>
-                <w:b/>
-                <w:color w:val="164334"/>
-                <w:sz w:val="17"/>
-              </w:rPr>
-              <w:t>Witness for Landlord / Manager</w:t>
-            </w:r>
-          </w:p>
-        </w:tc>
-        <w:tc>
-          <w:tcPr>
-            <w:tcW w:type="dxa" w:w="5285"/>
-            <w:vAlign w:val="center"/>
-            <w:tcBorders>
-              <w:top w:val="single" w:sz="4" w:color="C9D6CC"/>
-              <w:left w:val="single" w:sz="4" w:color="C9D6CC"/>
-              <w:bottom w:val="single" w:sz="4" w:color="C9D6CC"/>
-              <w:right w:val="single" w:sz="4" w:color="C9D6CC"/>
-            </w:tcBorders>
-          </w:tcPr>
-          <w:p>
-            <w:pPr>
-              <w:spacing w:after="0"/>
-            </w:pPr>
-            <w:r/>
-            <w:r>
-              <w:rPr>
-                <w:rFonts w:ascii="Aptos" w:hAnsi="Aptos"/>
-                <w:b/>
-                <w:color w:val="164334"/>
-                <w:sz w:val="17"/>
-              </w:rPr>
-              <w:t>Witness for Tenant</w:t>
-            </w:r>
-          </w:p>
-        </w:tc>
-      </w:tr>
-      <w:tr>
-        <w:tc>
-          <w:tcPr>
-            <w:tcW w:type="dxa" w:w="5285"/>
-            <w:vAlign w:val="center"/>
-            <w:tcBorders>
-              <w:top w:val="single" w:sz="4" w:color="C9D6CC"/>
-              <w:left w:val="single" w:sz="4" w:color="C9D6CC"/>
-              <w:bottom w:val="single" w:sz="4" w:color="C9D6CC"/>
-              <w:right w:val="single" w:sz="4" w:color="C9D6CC"/>
-            </w:tcBorders>
-          </w:tcPr>
-          <w:p>
-            <w:pPr>
-              <w:spacing w:after="0"/>
-            </w:pPr>
-            <w:r/>
-            <w:r>
-              <w:rPr>
-                <w:rFonts w:ascii="Aptos" w:hAnsi="Aptos"/>
-                <w:b w:val="0"/>
-                <w:sz w:val="17"/>
-              </w:rPr>
-              <w:t>Name: ________________________________________</w:t>
-              <w:br/>
-              <w:t>Address / Phone: ______________________________</w:t>
-            </w:r>
-          </w:p>
-        </w:tc>
-        <w:tc>
-          <w:tcPr>
-            <w:tcW w:type="dxa" w:w="5285"/>
-            <w:vAlign w:val="center"/>
-            <w:tcBorders>
-              <w:top w:val="single" w:sz="4" w:color="C9D6CC"/>
-              <w:left w:val="single" w:sz="4" w:color="C9D6CC"/>
-              <w:bottom w:val="single" w:sz="4" w:color="C9D6CC"/>
-              <w:right w:val="single" w:sz="4" w:color="C9D6CC"/>
-            </w:tcBorders>
-          </w:tcPr>
-          <w:p>
-            <w:pPr>
-              <w:spacing w:after="0"/>
-            </w:pPr>
-            <w:r/>
-            <w:r>
-              <w:rPr>
-                <w:rFonts w:ascii="Aptos" w:hAnsi="Aptos"/>
-                <w:b w:val="0"/>
-                <w:sz w:val="17"/>
-              </w:rPr>
-              <w:t>Name: ________________________________________</w:t>
-              <w:br/>
-              <w:t>Address / Phone: ______________________________</w:t>
-            </w:r>
-          </w:p>
-        </w:tc>
-      </w:tr>
-      <w:tr>
-        <w:tc>
-          <w:tcPr>
-            <w:tcW w:type="dxa" w:w="5285"/>
-            <w:vAlign w:val="center"/>
-            <w:tcBorders>
-              <w:top w:val="single" w:sz="4" w:color="C9D6CC"/>
-              <w:left w:val="single" w:sz="4" w:color="C9D6CC"/>
-              <w:bottom w:val="single" w:sz="4" w:color="C9D6CC"/>
-              <w:right w:val="single" w:sz="4" w:color="C9D6CC"/>
-            </w:tcBorders>
-          </w:tcPr>
-          <w:p>
-            <w:pPr>
-              <w:spacing w:after="0"/>
-            </w:pPr>
-            <w:r/>
-            <w:r>
-              <w:rPr>
-                <w:rFonts w:ascii="Aptos" w:hAnsi="Aptos"/>
-                <w:b w:val="0"/>
-                <w:sz w:val="17"/>
-              </w:rPr>
-              <w:t>Signature: ____________________________________</w:t>
-              <w:br/>
-              <w:t>Date: _________________________________________</w:t>
-            </w:r>
-          </w:p>
-        </w:tc>
-        <w:tc>
-          <w:tcPr>
-            <w:tcW w:type="dxa" w:w="5285"/>
-            <w:vAlign w:val="center"/>
-            <w:tcBorders>
-              <w:top w:val="single" w:sz="4" w:color="C9D6CC"/>
-              <w:left w:val="single" w:sz="4" w:color="C9D6CC"/>
-              <w:bottom w:val="single" w:sz="4" w:color="C9D6CC"/>
-              <w:right w:val="single" w:sz="4" w:color="C9D6CC"/>
-            </w:tcBorders>
-          </w:tcPr>
-          <w:p>
-            <w:pPr>
-              <w:spacing w:after="0"/>
-            </w:pPr>
-            <w:r/>
-            <w:r>
-              <w:rPr>
-                <w:rFonts w:ascii="Aptos" w:hAnsi="Aptos"/>
-                <w:b w:val="0"/>
-                <w:sz w:val="17"/>
-              </w:rPr>
-              <w:t>Signature: ____________________________________</w:t>
-              <w:br/>
-              <w:t>Date: _________________________________________</w:t>
-            </w:r>
-          </w:p>
-        </w:tc>
-      </w:tr>
-    </w:tbl>
-    <w:p>
-      <w:pPr>
-        <w:spacing w:before="120" w:after="0"/>
-      </w:pPr>
-      <w:r>
-        <w:rPr>
-          <w:rFonts w:ascii="Aptos" w:hAnsi="Aptos"/>
-          <w:i/>
-          <w:color w:val="53605A"/>
-          <w:sz w:val="15"/>
-        </w:rPr>
-        <w:t>Practical legal review note: This OneRoot template is a starting point for a particular property and transaction. Obtain Rent Control Department or qualified Ghanaian legal review before signing.</w:t>
-      </w:r>
-    </w:p>
     <w:sectPr>
-      <w:headerReference w:type="default" r:id="rId9"/>
-      <w:footerReference w:type="default" r:id="rId10"/>
       <w:pgSz w:w="12240" w:h="15840"/>
-      <w:pgMar w:top="648" w:right="835" w:bottom="749" w:left="835" w:header="720" w:footer="720" w:gutter="0"/>
+      <w:pgMar w:top="1440" w:right="1440" w:bottom="1440" w:left="1440" w:header="708" w:footer="708" w:gutter="0"/>
       <w:cols w:space="720"/>
       <w:docGrid w:linePitch="360"/>
     </w:sectPr>
   </w:body>
 </w:document>
-</file>
-
-<file path=word/footer1.xml><?xml version="1.0" encoding="utf-8"?>
-<w:ftr xmlns:m="http://schemas.openxmlformats.org/officeDocument/2006/math" xmlns:mc="http://schemas.openxmlformats.org/markup-compatibility/2006" xmlns:mo="http://schemas.microsoft.com/office/mac/office/2008/main" xmlns:mv="urn:schemas-microsoft-com:mac:vml" xmlns:o="urn:schemas-microsoft-com:office:office" xmlns:r="http://schemas.openxmlformats.org/officeDocument/2006/relationships" xmlns:v="urn:schemas-microsoft-com:vml" xmlns:w10="urn:schemas-microsoft-com:office:word" xmlns:w14="http://schemas.microsoft.com/office/word/2010/wordml" xmlns:w="http://schemas.openxmlformats.org/wordprocessingml/2006/main" xmlns:wne="http://schemas.microsoft.com/office/word/2006/wordml" xmlns:wp14="http://schemas.microsoft.com/office/word/2010/wordprocessingDrawing" xmlns:wp="http://schemas.openxmlformats.org/drawingml/2006/wordprocessingDrawing" xmlns:wpc="http://schemas.microsoft.com/office/word/2010/wordprocessingCanvas" xmlns:wpg="http://schemas.microsoft.com/office/word/2010/wordprocessingGroup" xmlns:wpi="http://schemas.microsoft.com/office/word/2010/wordprocessingInk" xmlns:wps="http://schemas.microsoft.com/office/word/2010/wordprocessingShape" mc:Ignorable="w14 wp14">
-  <w:p>
-    <w:pPr>
-      <w:pStyle w:val="Footer"/>
-      <w:jc w:val="center"/>
-    </w:pPr>
-    <w:r>
-      <w:rPr>
-        <w:rFonts w:ascii="Aptos" w:hAnsi="Aptos"/>
-        <w:color w:val="53605A"/>
-        <w:sz w:val="15"/>
-      </w:rPr>
-      <w:t>OneRoot Tenancy Agreement | Keep a signed copy with the payment schedule and condition inventory.</w:t>
-    </w:r>
-  </w:p>
-</w:ftr>
-</file>
-
-<file path=word/header1.xml><?xml version="1.0" encoding="utf-8"?>
-<w:hdr xmlns:m="http://schemas.openxmlformats.org/officeDocument/2006/math" xmlns:mc="http://schemas.openxmlformats.org/markup-compatibility/2006" xmlns:mo="http://schemas.microsoft.com/office/mac/office/2008/main" xmlns:mv="urn:schemas-microsoft-com:mac:vml" xmlns:o="urn:schemas-microsoft-com:office:office" xmlns:r="http://schemas.openxmlformats.org/officeDocument/2006/relationships" xmlns:v="urn:schemas-microsoft-com:vml" xmlns:w10="urn:schemas-microsoft-com:office:word" xmlns:w14="http://schemas.microsoft.com/office/word/2010/wordml" xmlns:w="http://schemas.openxmlformats.org/wordprocessingml/2006/main" xmlns:wne="http://schemas.microsoft.com/office/word/2006/wordml" xmlns:wp14="http://schemas.microsoft.com/office/word/2010/wordprocessingDrawing" xmlns:wp="http://schemas.openxmlformats.org/drawingml/2006/wordprocessingDrawing" xmlns:wpc="http://schemas.microsoft.com/office/word/2010/wordprocessingCanvas" xmlns:wpg="http://schemas.microsoft.com/office/word/2010/wordprocessingGroup" xmlns:wpi="http://schemas.microsoft.com/office/word/2010/wordprocessingInk" xmlns:wps="http://schemas.microsoft.com/office/word/2010/wordprocessingShape" mc:Ignorable="w14 wp14">
-  <w:p>
-    <w:pPr>
-      <w:pStyle w:val="Header"/>
-      <w:jc w:val="center"/>
-    </w:pPr>
-    <w:r>
-      <w:rPr>
-        <w:rFonts w:ascii="Aptos" w:hAnsi="Aptos"/>
-        <w:b/>
-        <w:color w:val="164334"/>
-        <w:sz w:val="16"/>
-      </w:rPr>
-      <w:t>ONEROOT ESSENTIALS | RENTALS &amp; APARTMENTS</w:t>
-    </w:r>
-  </w:p>
-</w:hdr>
 </file>
 
 <file path=word/numbering.xml><?xml version="1.0" encoding="utf-8"?>
@@ -2413,11 +2842,12 @@
     <w:qFormat/>
     <w:rsid w:val="00FC693F"/>
     <w:pPr>
-      <w:spacing w:after="60"/>
+      <w:spacing w:before="0" w:after="120" w:lineRule="auto" w:line="264"/>
     </w:pPr>
     <w:rPr>
-      <w:rFonts w:ascii="Aptos" w:hAnsi="Aptos"/>
-      <w:sz w:val="17"/>
+      <w:rFonts w:ascii="Calibri" w:hAnsi="Calibri"/>
+      <w:color w:val="000000"/>
+      <w:sz w:val="22"/>
     </w:rPr>
   </w:style>
   <w:style w:type="paragraph" w:styleId="Header">
@@ -2475,15 +2905,15 @@
     <w:pPr>
       <w:keepNext/>
       <w:keepLines/>
-      <w:spacing w:before="480" w:after="0"/>
+      <w:spacing w:before="320" w:after="160" w:lineRule="auto" w:line="264"/>
       <w:outlineLvl w:val="0"/>
     </w:pPr>
     <w:rPr>
-      <w:rFonts w:asciiTheme="majorHAnsi" w:eastAsiaTheme="majorEastAsia" w:hAnsiTheme="majorHAnsi" w:cstheme="majorBidi"/>
+      <w:rFonts w:asciiTheme="majorHAnsi" w:eastAsiaTheme="majorEastAsia" w:hAnsiTheme="majorHAnsi" w:cstheme="majorBidi" w:ascii="Calibri" w:hAnsi="Calibri"/>
       <w:b/>
       <w:bCs/>
-      <w:color w:val="365F91" w:themeColor="accent1" w:themeShade="BF"/>
-      <w:sz w:val="28"/>
+      <w:color w:val="2E74B5"/>
+      <w:sz w:val="32"/>
       <w:szCs w:val="28"/>
     </w:rPr>
   </w:style>
@@ -2499,14 +2929,14 @@
     <w:pPr>
       <w:keepNext/>
       <w:keepLines/>
-      <w:spacing w:before="200" w:after="0"/>
+      <w:spacing w:before="240" w:after="120" w:lineRule="auto" w:line="264"/>
       <w:outlineLvl w:val="1"/>
     </w:pPr>
     <w:rPr>
-      <w:rFonts w:asciiTheme="majorHAnsi" w:eastAsiaTheme="majorEastAsia" w:hAnsiTheme="majorHAnsi" w:cstheme="majorBidi"/>
+      <w:rFonts w:asciiTheme="majorHAnsi" w:eastAsiaTheme="majorEastAsia" w:hAnsiTheme="majorHAnsi" w:cstheme="majorBidi" w:ascii="Calibri" w:hAnsi="Calibri"/>
       <w:b/>
       <w:bCs/>
-      <w:color w:val="4F81BD" w:themeColor="accent1"/>
+      <w:color w:val="2E74B5"/>
       <w:sz w:val="26"/>
       <w:szCs w:val="26"/>
     </w:rPr>
@@ -2523,14 +2953,15 @@
     <w:pPr>
       <w:keepNext/>
       <w:keepLines/>
-      <w:spacing w:before="200" w:after="0"/>
+      <w:spacing w:before="160" w:after="80" w:lineRule="auto" w:line="264"/>
       <w:outlineLvl w:val="2"/>
     </w:pPr>
     <w:rPr>
-      <w:rFonts w:asciiTheme="majorHAnsi" w:eastAsiaTheme="majorEastAsia" w:hAnsiTheme="majorHAnsi" w:cstheme="majorBidi"/>
+      <w:rFonts w:asciiTheme="majorHAnsi" w:eastAsiaTheme="majorEastAsia" w:hAnsiTheme="majorHAnsi" w:cstheme="majorBidi" w:ascii="Calibri" w:hAnsi="Calibri"/>
       <w:b/>
       <w:bCs/>
-      <w:color w:val="4F81BD" w:themeColor="accent1"/>
+      <w:color w:val="1F4D78"/>
+      <w:sz w:val="24"/>
     </w:rPr>
   </w:style>
   <w:style w:type="paragraph" w:styleId="Heading4">

</xml_diff>